<commit_message>
Add cover letter, regenerated DOCX files, and build script
- cover_letter.docx: ESR submission cover letter
- manuscript_en.docx: full revised English manuscript (regenerated from markdown)
- manuscript_ja.docx: full revised Japanese manuscript (regenerated from markdown)
- table1_model_metrics.docx, table2_correspondence.docx: regenerated table files
- figures_en.pptx: regenerated figure slides
- build_cover_letter.py: script to build cover letter and full DOCX from markdown

Co-authored-by: openhands <openhands@all-hands.dev>
</commit_message>
<xml_diff>
--- a/gdp_tempo_paper/manuscript/manuscript_en.docx
+++ b/gdp_tempo_paper/manuscript/manuscript_en.docx
@@ -4,22 +4,21 @@
   <w:body>
     <w:p>
       <w:pPr>
-        <w:spacing w:before="240" w:after="120"/>
+        <w:spacing w:before="360" w:after="120"/>
       </w:pPr>
       <w:r>
         <w:rPr>
           <w:rFonts w:ascii="Times New Roman" w:hAnsi="Times New Roman" w:eastAsia="MS Mincho"/>
           <w:b/>
           <w:i w:val="0"/>
-          <w:sz w:val="32"/>
+          <w:sz w:val="28"/>
         </w:rPr>
-        <w:t>The Forgotten Tempo Effect in Capital Accounting: Investment-to-Output Time-to-Build, Intangible Capital, and the Reconciliation of Flow- and Stock-Based National Wealth Measures</w:t>
+        <w:t>Time-Varying Time-to-Build in Capital Accounting: Reconciling Flow- and Stock-Based National Wealth Measures through a Time-Varying Perpetual Inventory Method with Intangible Capital</w:t>
       </w:r>
     </w:p>
     <w:p>
       <w:pPr>
-        <w:spacing w:after="120" w:line="360" w:lineRule="auto"/>
-        <w:ind w:firstLine="240"/>
+        <w:spacing w:after="120" w:before="0" w:line="360" w:lineRule="auto"/>
       </w:pPr>
       <w:r>
         <w:rPr>
@@ -33,8 +32,7 @@
     </w:p>
     <w:p>
       <w:pPr>
-        <w:spacing w:after="120" w:line="360" w:lineRule="auto"/>
-        <w:ind w:firstLine="240"/>
+        <w:spacing w:after="120" w:before="0" w:line="360" w:lineRule="auto"/>
       </w:pPr>
       <w:r>
         <w:rPr>
@@ -48,8 +46,7 @@
     </w:p>
     <w:p>
       <w:pPr>
-        <w:spacing w:after="120" w:line="360" w:lineRule="auto"/>
-        <w:ind w:firstLine="240"/>
+        <w:spacing w:after="120" w:before="0" w:line="360" w:lineRule="auto"/>
       </w:pPr>
       <w:r>
         <w:rPr>
@@ -63,8 +60,7 @@
     </w:p>
     <w:p>
       <w:pPr>
-        <w:spacing w:after="120" w:line="360" w:lineRule="auto"/>
-        <w:ind w:firstLine="240"/>
+        <w:spacing w:after="120" w:before="0" w:line="360" w:lineRule="auto"/>
       </w:pPr>
       <w:r>
         <w:rPr>
@@ -78,8 +74,7 @@
     </w:p>
     <w:p>
       <w:pPr>
-        <w:spacing w:after="120" w:line="360" w:lineRule="auto"/>
-        <w:ind w:firstLine="240"/>
+        <w:spacing w:after="120" w:before="0" w:line="360" w:lineRule="auto"/>
       </w:pPr>
       <w:r>
         <w:rPr>
@@ -88,13 +83,12 @@
           <w:i w:val="0"/>
           <w:sz w:val="22"/>
         </w:rPr>
-        <w:t>Keywords: tempo effect; intangible capital; perpetual inventory method; time-to-build; flow-stock consistency; Beyond-GDP.</w:t>
+        <w:t>Keywords: time-to-build; perpetual inventory method; intangible capital; national wealth accounting; flow-stock consistency; Beyond-GDP.</w:t>
       </w:r>
     </w:p>
     <w:p>
       <w:pPr>
-        <w:spacing w:after="120" w:line="360" w:lineRule="auto"/>
-        <w:ind w:firstLine="240"/>
+        <w:spacing w:after="120" w:before="0" w:line="360" w:lineRule="auto"/>
       </w:pPr>
       <w:r>
         <w:rPr>
@@ -108,8 +102,7 @@
     </w:p>
     <w:p>
       <w:pPr>
-        <w:spacing w:after="120" w:line="360" w:lineRule="auto"/>
-        <w:ind w:firstLine="240"/>
+        <w:spacing w:after="120" w:before="0" w:line="360" w:lineRule="auto"/>
       </w:pPr>
       <w:r>
         <w:rPr>
@@ -123,8 +116,7 @@
     </w:p>
     <w:p>
       <w:pPr>
-        <w:spacing w:after="120" w:line="360" w:lineRule="auto"/>
-        <w:ind w:firstLine="240"/>
+        <w:spacing w:after="120" w:before="0" w:line="360" w:lineRule="auto"/>
       </w:pPr>
       <w:r>
         <w:rPr>
@@ -138,8 +130,7 @@
     </w:p>
     <w:p>
       <w:pPr>
-        <w:spacing w:after="120" w:line="360" w:lineRule="auto"/>
-        <w:ind w:firstLine="240"/>
+        <w:spacing w:after="120" w:before="0" w:line="360" w:lineRule="auto"/>
       </w:pPr>
       <w:r>
         <w:rPr>
@@ -153,8 +144,7 @@
     </w:p>
     <w:p>
       <w:pPr>
-        <w:spacing w:after="120" w:line="360" w:lineRule="auto"/>
-        <w:ind w:firstLine="240"/>
+        <w:spacing w:after="120" w:before="0" w:line="360" w:lineRule="auto"/>
       </w:pPr>
       <w:r>
         <w:rPr>
@@ -168,8 +158,7 @@
     </w:p>
     <w:p>
       <w:pPr>
-        <w:spacing w:after="120" w:line="360" w:lineRule="auto"/>
-        <w:ind w:firstLine="240"/>
+        <w:spacing w:after="120" w:before="0" w:line="360" w:lineRule="auto"/>
       </w:pPr>
       <w:r>
         <w:rPr>
@@ -178,13 +167,12 @@
           <w:i w:val="0"/>
           <w:sz w:val="22"/>
         </w:rPr>
-        <w:t>Abstract (146 words). Since Goldstein, Lutz, and Scherbov (2003) showed that a single "forgotten" parity-specific variance parameter σ resolved a large share of the low-fertility puzzle once tempo effects on the mean age at childbearing were acknowledged, the dual of quantum and tempo has become a standard lens in formal demography. National income and wealth accounting has no equivalent diagnostic. We port the Bongaarts-Feeney quantum-tempo decomposition to capital accounting by letting the investment-to-output time-to-build μ(t) drift over time and by re-introducing intangible capital K_I, with share β, as the balance-sheet analogue of σ. Across 39 OECD and middle-income economies (Penn World Table 10.01, World Bank CWON), a time-varying μ(t) reduces the out-of-sample MAPE of GDP levels from 4.60% to 3.99% while a joint production-cum-wealth identification produces internally consistent flow and stock accounts. A sister medical-spending paper is in preparation.</w:t>
+        <w:t>Abstract (145 words). Standard perpetual-inventory capital stocks assume that investment contributes to productive capacity immediately (zero time-to-build) and that intangible capital is absent. We relax both assumptions simultaneously, allowing the mean investment-to-output lag μ(t) to drift linearly over time and augmenting the production function with an R&amp;D-based intangible stock weighted by share β. Across 39 OECD and middle-income economies (Penn World Table 10.01, World Bank CWON), allowing a positive time-to-build reduces the median out-of-sample MAPE of GDP level forecasts from 4.60% to 4.06%; allowing μ(t) to drift further reduces it to 3.99%. Adding intangible capital alone does not improve prediction (MAPE 4.72%), but jointly identifying (μ, β) against both production and wealth data reconciles the flow and stock accounts to within 1–2% for most advanced economies. The heuristic analogy to demographic tempo effects (Bongaarts-Feeney, Goldstein-Lutz-Scherbov) is outlined, with explicit discussion of where the analogy holds and where it breaks down.</w:t>
       </w:r>
     </w:p>
     <w:p>
       <w:pPr>
-        <w:spacing w:after="120" w:line="360" w:lineRule="auto"/>
-        <w:ind w:firstLine="240"/>
+        <w:spacing w:after="120" w:before="0" w:line="360" w:lineRule="auto"/>
       </w:pPr>
       <w:r>
         <w:rPr>
@@ -193,13 +181,12 @@
           <w:i w:val="0"/>
           <w:sz w:val="22"/>
         </w:rPr>
-        <w:t>Keywords: tempo effect; intangible capital; perpetual inventory method; wealth accounting; Beyond-GDP.</w:t>
+        <w:t>Keywords: time-to-build; perpetual inventory method; intangible capital; wealth accounting; Beyond-GDP.</w:t>
       </w:r>
     </w:p>
     <w:p>
       <w:pPr>
-        <w:spacing w:after="120" w:line="360" w:lineRule="auto"/>
-        <w:ind w:firstLine="240"/>
+        <w:spacing w:after="120" w:before="0" w:line="360" w:lineRule="auto"/>
       </w:pPr>
       <w:r>
         <w:rPr>
@@ -220,15 +207,14 @@
           <w:rFonts w:ascii="Times New Roman" w:hAnsi="Times New Roman" w:eastAsia="MS Mincho"/>
           <w:b/>
           <w:i w:val="0"/>
-          <w:sz w:val="26"/>
+          <w:sz w:val="24"/>
         </w:rPr>
         <w:t>1. Introduction</w:t>
       </w:r>
     </w:p>
     <w:p>
       <w:pPr>
-        <w:spacing w:after="120" w:line="360" w:lineRule="auto"/>
-        <w:ind w:firstLine="240"/>
+        <w:spacing w:after="120" w:before="0" w:line="360" w:lineRule="auto"/>
       </w:pPr>
       <w:r>
         <w:rPr>
@@ -237,13 +223,12 @@
           <w:i w:val="0"/>
           <w:sz w:val="22"/>
         </w:rPr>
-        <w:t>Every macroeconomist has encountered two separate but related complaints about the way we measure national prosperity. First, Gross Domestic Product (GDP) is a flow measure that ignores depletion, depreciation, and the growing stock of intangible assets that drives modern productivity growth (Stiglitz, Sen, and Fitoussi, 2009; Corrado, Hulten, and Sichel, 2009; Haskel and Westlake, 2017). Second, stock-based alternatives such as the Inclusive Wealth Index (Managi and Kumar, 2018), the United Nations SEEA (UNECE, 2014), and the World Bank Changing Wealth of Nations (Lange, Wodon, and Carey, 2018) are attractive in principle but rarely line up with independently reconstructed capital stocks and never with one another. Flow-based and stock-based national accounts have lived side by side in different rooms of the same house for twenty-five years without being asked to sit down at the same table.</w:t>
+        <w:t>Every macroeconomist has encountered two separate but related complaints about the way we measure national prosperity. First, Gross Domestic Product (GDP) is a flow measure that ignores depletion, depreciation, and the growing stock of intangible assets that drives modern productivity growth (Stiglitz, Sen, and Fitoussi, 2009; Corrado, Hulten, and Sichel, 2009; Haskel and Westlake, 2017). Second, stock-based alternatives such as the Inclusive Wealth Index (Managi and Kumar, 2018), the United Nations SEEA (UNECE, 2014), and the World Bank Changing Wealth of Nations (Lange, Wodon, and Carey, 2018) are attractive in principle but rarely line up with independently reconstructed capital stocks and never with one another. Flow-based and stock-based national accounts have lived side by side for twenty-five years without being reconciled.</w:t>
       </w:r>
     </w:p>
     <w:p>
       <w:pPr>
-        <w:spacing w:after="120" w:line="360" w:lineRule="auto"/>
-        <w:ind w:firstLine="240"/>
+        <w:spacing w:after="120" w:before="0" w:line="360" w:lineRule="auto"/>
       </w:pPr>
       <w:r>
         <w:rPr>
@@ -252,13 +237,12 @@
           <w:i w:val="0"/>
           <w:sz w:val="22"/>
         </w:rPr>
-        <w:t>Demography has spent the same period quietly solving the mirror problem. Bongaarts and Feeney (1998) showed that a rising mean age at childbearing mechanically depresses period fertility even when completed cohort fertility is constant, and proposed an adjustment that stripped out the "tempo distortion". Goldstein, Lutz, and Scherbov (2003) reopened the debate by showing that once a parity-specific variance σ was allowed (the "forgotten parameter"), the tempo-adjusted fertility rate matched the cohort data far more closely. A generation of work on postponement, ultra-low fertility, and lifetime child-bearing risk followed. The pattern is simple: the period statistic was biased; the bias was a timing phenomenon; once you wrote down a structural timing parameter and a single forgotten quantity parameter, the flow and stock accounts of the reproduction process were reconciled.</w:t>
+        <w:t>This paper argues that a substantial share of this discrepancy can be attributed to two specification choices in the standard perpetual inventory method (PIM): the assumption that investment contributes to productive capacity immediately (zero time-to-build), and the exclusion of intangible capital from the production function. We relax both assumptions simultaneously. We allow the mean investment-to-output lag μ(t) to drift linearly over time, and we augment the production function with an R&amp;D-based intangible capital stock weighted by a share parameter β. The key empirical finding is that recognising a positive time-to-build — with or without time variation — reduces the median out-of-sample GDP level forecast error from 4.60% to 4.06% across 39 OECD and middle-income economies, a 12% relative improvement. Adding a linear drift to μ(t) reduces it further to 3.99%. Intangible capital alone does not improve out-of-sample prediction (MAPE 4.72%), but jointly identifying (μ, β) against both production data (Penn World Table) and wealth data (World Bank CWON) reconciles the flow and stock accounts to within 1–2% for most advanced economies. The joint identification also reveals that neither parameter is well identified from production data alone; the wealth-side constraint is essential.</w:t>
       </w:r>
     </w:p>
     <w:p>
       <w:pPr>
-        <w:spacing w:after="120" w:line="360" w:lineRule="auto"/>
-        <w:ind w:firstLine="240"/>
+        <w:spacing w:after="120" w:before="0" w:line="360" w:lineRule="auto"/>
       </w:pPr>
       <w:r>
         <w:rPr>
@@ -267,13 +251,12 @@
           <w:i w:val="0"/>
           <w:sz w:val="22"/>
         </w:rPr>
-        <w:t>This paper argues that capital accounting has an exact analogue of the Bongaarts-Feeney-Goldstein-Lutz-Scherbov correction, hiding in plain sight. The analogy is not rhetorical: every demographic quantity has a capital counterpart under a precise change of variables (Section 3.4, Table 2). Births are investment flows. Population stocks are capital stocks. The mean age at childbearing is the mean lag between investment and its productive deployment — the engineering and organisational "time-to-build" that Kydland and Prescott (1982) introduced but that has never been allowed to drift over time in standard production-function estimation. The parity-specific variance σ has a direct balance-sheet equivalent: the intangible capital share β that CHS have estimated but that official wealth accounts such as the CWON still treat as non-existent or residual.</w:t>
+        <w:t>The demographic analogy that motivates the joint treatment of μ and β is a heuristic borrowing from Bongaarts and Feeney (1998) and Goldstein, Lutz, and Scherbov (2003). In demography, a rising mean age at childbearing was shown to depress period fertility mechanically, and a "forgotten" parity-specific variance parameter was shown to restore the consistency between period and cohort accounts. The structural similarity — a flow statistic contaminated by drift in a timing distribution, with a single omitted quantity parameter — is suggestive. However, a caveat is in order from the outset. The time-to-build in capital accounting is a gestation lag with a clear engineering interpretation (Kydland and Prescott, 1982), not a statistical artifact of period-cohort aggregation. The demographic tempo adjustment corrects a purely compositional bias; the capital-accounting adjustment corrects a production-function timing mis-specification. The two problems involve different statistical objects and different identifying assumptions. The analogy is a useful pedagogical device and a source of hypotheses, not a claim of formal equivalence. We return to this distinction in Sections 3.4 and 6.2.</w:t>
       </w:r>
     </w:p>
     <w:p>
       <w:pPr>
-        <w:spacing w:after="120" w:line="360" w:lineRule="auto"/>
-        <w:ind w:firstLine="240"/>
+        <w:spacing w:after="120" w:before="0" w:line="360" w:lineRule="auto"/>
       </w:pPr>
       <w:r>
         <w:rPr>
@@ -282,13 +265,40 @@
           <w:i w:val="0"/>
           <w:sz w:val="22"/>
         </w:rPr>
-        <w:t>Our contribution is four-fold. First, we write down the flow–stock identity dW/dt = S(Y) − δW in parameterised form, making the hidden parameters {μ(t), β} explicit on the flow side and on the stock side simultaneously. Second, we show that a time-varying time-to-build μ(t) — estimated with a two-parameter tempo drift μ(t) = μ₀ + μ₁·(t − t₀) — reduces the median out-of-sample MAPE of GDP level forecasts from 4.60 % to 3.99 % across 39 countries, a 13 % relative improvement that rivals gains from adding entirely new production factors. Third, we demonstrate that when the tempo and intangible corrections are jointly identified against CWON stock data, production-side and wealth-side likelihoods agree on a consistent pair (μ̂ₖ, β̂ₖ) for every country, which in our reading is the first empirical success of the "unified national-wealth accounting" programme that Stiglitz-Sen-Fitoussi called for. Fourth, we preview a companion paper extending the same tempo-plus-forgotten-parameter machinery to health expenditure and population health outcomes, where preliminary evidence shows the medical time-to-build lag has been widening at +0.15 years per year since 2000.</w:t>
+        <w:t>The remainder of the paper is organised as follows. Section 2 reviews the relevant literatures in capital accounting, intangible capital, and wealth measurement. Section 3 develops the time-varying PIM production function, the intangible augmentation, and the joint flow-stock identification framework. Section 4 describes the data, the five nested models M0–M4, and the estimation protocol. Section 5 reports results, including out-of-sample forecasts, flow-stock reconciliation, and bootstrap confidence intervals. Section 6 discusses implications for the interpretation of the Solow residual, the demographic analogy, and the Beyond-GDP debate, and explicitly states limitations. Section 7 concludes.</w:t>
       </w:r>
     </w:p>
     <w:p>
       <w:pPr>
-        <w:spacing w:after="120" w:line="360" w:lineRule="auto"/>
-        <w:ind w:firstLine="240"/>
+        <w:spacing w:before="240" w:after="120"/>
+      </w:pPr>
+      <w:r>
+        <w:rPr>
+          <w:rFonts w:ascii="Times New Roman" w:hAnsi="Times New Roman" w:eastAsia="MS Mincho"/>
+          <w:b/>
+          <w:i w:val="0"/>
+          <w:sz w:val="24"/>
+        </w:rPr>
+        <w:t>2. Related literature</w:t>
+      </w:r>
+    </w:p>
+    <w:p>
+      <w:pPr>
+        <w:spacing w:before="240" w:after="120"/>
+      </w:pPr>
+      <w:r>
+        <w:rPr>
+          <w:rFonts w:ascii="Times New Roman" w:hAnsi="Times New Roman" w:eastAsia="MS Mincho"/>
+          <w:b/>
+          <w:i w:val="0"/>
+          <w:sz w:val="22"/>
+        </w:rPr>
+        <w:t>2.1 Capital accounting, PIM, and asset-specific measurement</w:t>
+      </w:r>
+    </w:p>
+    <w:p>
+      <w:pPr>
+        <w:spacing w:after="120" w:before="0" w:line="360" w:lineRule="auto"/>
       </w:pPr>
       <w:r>
         <w:rPr>
@@ -297,27 +307,12 @@
           <w:i w:val="0"/>
           <w:sz w:val="22"/>
         </w:rPr>
-        <w:t>The remainder of the paper is organised as follows. Section 2 reviews the capital-accounting, intangibles, and tempo-demography literatures that our framework stitches together. Section 3 develops the theory. Section 4 describes the data and methods and defines five models M0–M4 of increasing generality. Section 5 reports results. Section 6 discusses the Solow-residual reinterpretation, the flow–stock reconciliation, and policy implications for Beyond-GDP. Section 7 concludes.</w:t>
+        <w:t>The perpetual inventory method (PIM) is the standard framework for constructing capital stocks in national accounts and in cross-country datasets such as the Penn World Table (PWT; Feenstra, Inklaar, and Timmer, 2015). The OECD Measuring Capital manual (OECD, 2009) codifies best practice: asset-specific service lives, age-efficiency profiles (geometric, linear, or hyperbolic), and vintage corrections. The PIM is not a single equation but a family of implementations whose accuracy depends on how well the assumed retirement and depreciation patterns match the actual composition of investment.</w:t>
       </w:r>
     </w:p>
     <w:p>
       <w:pPr>
-        <w:spacing w:before="240" w:after="120"/>
-      </w:pPr>
-      <w:r>
-        <w:rPr>
-          <w:rFonts w:ascii="Times New Roman" w:hAnsi="Times New Roman" w:eastAsia="MS Mincho"/>
-          <w:b/>
-          <w:i w:val="0"/>
-          <w:sz w:val="26"/>
-        </w:rPr>
-        <w:t>2. Related literature</w:t>
-      </w:r>
-    </w:p>
-    <w:p>
-      <w:pPr>
-        <w:spacing w:after="120" w:line="360" w:lineRule="auto"/>
-        <w:ind w:firstLine="240"/>
+        <w:spacing w:after="120" w:before="0" w:line="360" w:lineRule="auto"/>
       </w:pPr>
       <w:r>
         <w:rPr>
@@ -326,13 +321,12 @@
           <w:i w:val="0"/>
           <w:sz w:val="22"/>
         </w:rPr>
-        <w:t>Capital accounting and time-to-build. Since Kydland and Prescott (1982) it has been standard practice to insert a multi-period investment lag into business-cycle models. Empirical estimates are overwhelmingly based on fixed lag structures: a single μ is estimated once for an entire sample, or a small number of regime-dependent μs are estimated for recession and expansion states (Mayer, 1960; Koeva, 2000). Kaboski (2005) documents cross-industry heterogeneity but, again, in a time-invariant fashion. More recent work (Altug, 1989; Christiano and Todd, 1996; Edge, 2007) has explored stochastic extensions in which the lag distribution is allowed to depend on sectoral composition, but still does not allow μ to drift systematically over decades. We know of no prior study that lets the typical investment-to-output lag drift in the way that demographers have documented for the mean age at childbearing. The omission is consequential because post-1990 investment has shifted substantially toward long-lead assets — custom industrial software, cloud infrastructure, pharmaceutical R&amp;D, complex engineering systems — whose gestation periods differ by nearly an order of magnitude from the plant-and-equipment of the 1960s on which the original lag literature was calibrated (OECD, 2013; Corrado et al., 2020).</w:t>
+        <w:t>A large empirical literature has estimated time-to-build parameters from project-level and industry-level data. Mayer (1960) found mean gestation lags of 1–2 years for US manufacturing plant and equipment. Koeva (2000) reported similar estimates from cross-country aggregates. Kydland and Prescott (1982) embedded a multi-period investment lag in a business-cycle model and showed it improves propagation of technology shocks. Kaboski (2005) documented cross-industry heterogeneity — construction and mining have longer lags than retail and services — but estimated time-invariant lags within each industry. Altug (1989), Christiano and Todd (1996), and Edge (2007) allowed the lag distribution to vary with sectoral composition or stochastic structure, but did not allow the mean lag to drift systematically over the multi-decade horizons that characterise the post-1990 shift toward intangible-intensive investment.</w:t>
       </w:r>
     </w:p>
     <w:p>
       <w:pPr>
-        <w:spacing w:after="120" w:line="360" w:lineRule="auto"/>
-        <w:ind w:firstLine="240"/>
+        <w:spacing w:after="120" w:before="0" w:line="360" w:lineRule="auto"/>
       </w:pPr>
       <w:r>
         <w:rPr>
@@ -341,13 +335,12 @@
           <w:i w:val="0"/>
           <w:sz w:val="22"/>
         </w:rPr>
-        <w:t>Intangible capital. The programme begun by Corrado, Hulten, and Sichel (2005, 2009) has by now produced robust international evidence that software, R&amp;D, design, brand, organisational capital, and training account for 30–60 % of productivity growth in advanced economies (INTAN-Invest: Corrado et al., 2016; Roth, 2023). The 2008 revision of the System of National Accounts (SNA) formally incorporated R&amp;D into produced capital, but broader intangibles — organisational capital, brand, training, purchased design services, some categories of financial innovation — remain excluded from most official balance sheets, including the World Bank CWON (Lange et al., 2018, Chap. 3). De Rassenfosse and Jaffe (2018) and Haskel and Westlake (2017, 2022) emphasise that this omission biases not only the level of measured capital but also the implied productivity growth rate whenever the intangible share is expanding — exactly the setting of our 1995-2019 sample. Importantly, the intangible share β is not a global constant: Japan, Germany, and some East-Asian economies retain a smaller intangible share than the United States even under harmonised measurement (Corrado et al., 2020), so β ought to be a country-specific parameter, which is how we treat it in Section 4.</w:t>
+        <w:t>Our work builds on this literature by letting the mean time-to-build drift linearly over time. While sectoral composition change has been the most studied channel through which the aggregate lag could evolve (OECD, 2009, Chap. 5), we model the drift parsimoniously as a linear trend, without attributing it to any single structural cause. A complementary tradition — vintage capital models (Solow, 1960; Jorgenson, 1973; Hulten, 1992) — recognises that capital of different vintages embodies different technologies and therefore different effective ages. Our approach is distinct from and simpler than vintage models: we do not track each vintage separately but instead adjust the timing with which all investment enters the stock, which is a coarser but more tractable correction for the aggregate production-function context.</w:t>
       </w:r>
     </w:p>
     <w:p>
       <w:pPr>
-        <w:spacing w:after="120" w:line="360" w:lineRule="auto"/>
-        <w:ind w:firstLine="240"/>
+        <w:spacing w:after="120" w:before="0" w:line="360" w:lineRule="auto"/>
       </w:pPr>
       <w:r>
         <w:rPr>
@@ -356,13 +349,26 @@
           <w:i w:val="0"/>
           <w:sz w:val="22"/>
         </w:rPr>
-        <w:t>Wealth accounting. The Beyond-GDP movement, from Stiglitz-Sen-Fitoussi (2009) through Jorgenson (2018) and Managi-Kumar (2018), proposes to replace or augment GDP with wealth-style aggregates. Empirically, however, the three main aggregates — SEEA, IWI, and CWON — disagree materially both with each other and with independently reconstructed perpetual-inventory stocks (Arrow et al., 2012; Dasgupta, 2021). The mainstream diagnosis blames measurement error and the treatment of natural capital. We show that a more mundane culprit — a mis-specified time-to-build and an omitted intangible share — explains a sizeable fraction of the discrepancy.</w:t>
+        <w:t>We also acknowledge a limitation that the asset-specific PIM literature would flag: our aggregate μ(t) collapses potentially heterogeneous asset-level lags into a single parameter. If short-lived equipment (IT hardware, vehicles) and long-lived structures (R&amp;D labs, power plants) have diverging lag trends, the aggregate μ(t) may mask offsetting compositional shifts. Section 6.5 discusses the implications.</w:t>
       </w:r>
     </w:p>
     <w:p>
       <w:pPr>
-        <w:spacing w:after="120" w:line="360" w:lineRule="auto"/>
-        <w:ind w:firstLine="240"/>
+        <w:spacing w:before="240" w:after="120"/>
+      </w:pPr>
+      <w:r>
+        <w:rPr>
+          <w:rFonts w:ascii="Times New Roman" w:hAnsi="Times New Roman" w:eastAsia="MS Mincho"/>
+          <w:b/>
+          <w:i w:val="0"/>
+          <w:sz w:val="22"/>
+        </w:rPr>
+        <w:t>2.2 Intangible capital</w:t>
+      </w:r>
+    </w:p>
+    <w:p>
+      <w:pPr>
+        <w:spacing w:after="120" w:before="0" w:line="360" w:lineRule="auto"/>
       </w:pPr>
       <w:r>
         <w:rPr>
@@ -371,13 +377,12 @@
           <w:i w:val="0"/>
           <w:sz w:val="22"/>
         </w:rPr>
-        <w:t>Tempo and forgotten parameters in demography. Bongaarts and Feeney (1998) introduced the adjustment TFR\ = TFR/(1 − r(t)) where r(t)* is the annual change in the mean age at childbearing. Goldstein, Lutz, and Scherbov (2003) showed that Bongaarts-Feeney was an upper bound unless a parity-specific "forgotten" variance σ was re-introduced. Kohler, Billari, and Ortega (2002) and Bongaarts and Sobotka (2012) confirmed both findings across Europe. The structural lesson — that flow statistics of a stock process are contaminated by drift in the timing distribution, and that a single omitted quantity parameter restores consistency — is exactly the lesson we now transplant to the capital account.</w:t>
+        <w:t>The programme begun by Corrado, Hulten, and Sichel (2005, 2009) has by now produced robust international evidence that software, R&amp;D, design, brand, organisational capital, and training account for 30–60% of productivity growth in advanced economies (INTAN-Invest: Corrado et al., 2016; Roth, 2023). The 2008 revision of the SNA formally incorporated R&amp;D into produced capital, but broader intangibles — organisational capital, brand, training, purchased design services, some categories of financial innovation — remain excluded from most official balance sheets, including the World Bank CWON (Lange et al., 2018, Chap. 3). De Rassenfosse and Jaffe (2018) and Haskel and Westlake (2017, 2022) emphasise that this omission biases not only the level of measured capital but also the implied productivity growth rate whenever the intangible share is expanding.</w:t>
       </w:r>
     </w:p>
     <w:p>
       <w:pPr>
-        <w:spacing w:after="120" w:line="360" w:lineRule="auto"/>
-        <w:ind w:firstLine="240"/>
+        <w:spacing w:after="120" w:before="0" w:line="360" w:lineRule="auto"/>
       </w:pPr>
       <w:r>
         <w:rPr>
@@ -386,13 +391,26 @@
           <w:i w:val="0"/>
           <w:sz w:val="22"/>
         </w:rPr>
-        <w:t>Healthcare and human capital sustainability. A companion paper (in preparation) documents that the lag μ_H from medical expenditure to life-expectancy outcomes has been rising by roughly 0.15 years per year since 2000, and that an analogous "forgotten" parameter β_H — the share of expenditure directed to prevention and R&amp;D, as opposed to curative care — accounts for a further share of the US-Japan life-expectancy gap. That paper exploits exactly the same quantum-tempo decomposition developed here.</w:t>
+        <w:t>Our treatment follows CHS (2009) in assuming a geometric PIM for intangible capital with a fixed depreciation rate δ_I = 0.15. This is a deliberate simplification. More recent work (Corrado et al., 2020) uses asset-specific depreciation rates for different intangible categories, which would refine the measurement. However, given that our R&amp;D expenditure data are at the national aggregate level and our sample spans 39 countries with varying data quality, the single-depreciation assumption is a necessary compromise. Importantly, the intangible share β is not a global constant: Japan, Germany, and some East-Asian economies retain a smaller intangible share than the United States even under harmonised measurement (Corrado et al., 2020), so β ought to be a country-specific parameter, which is how we treat it in Section 4.</w:t>
       </w:r>
     </w:p>
     <w:p>
       <w:pPr>
-        <w:spacing w:after="120" w:line="360" w:lineRule="auto"/>
-        <w:ind w:firstLine="240"/>
+        <w:spacing w:before="240" w:after="120"/>
+      </w:pPr>
+      <w:r>
+        <w:rPr>
+          <w:rFonts w:ascii="Times New Roman" w:hAnsi="Times New Roman" w:eastAsia="MS Mincho"/>
+          <w:b/>
+          <w:i w:val="0"/>
+          <w:sz w:val="22"/>
+        </w:rPr>
+        <w:t>2.3 Wealth accounting and flow-stock reconciliation</w:t>
+      </w:r>
+    </w:p>
+    <w:p>
+      <w:pPr>
+        <w:spacing w:after="120" w:before="0" w:line="360" w:lineRule="auto"/>
       </w:pPr>
       <w:r>
         <w:rPr>
@@ -401,7 +419,21 @@
           <w:i w:val="0"/>
           <w:sz w:val="22"/>
         </w:rPr>
-        <w:t>The gap this paper fills. The papers above individually treat (i) capital time-to-build, (ii) intangibles, (iii) wealth aggregates, and (iv) demographic tempo. To our knowledge, no prior work simultaneously (a) estimates a time-varying time-to-build, (b) recovers the CHS intangible share, and (c) disciplines both with a wealth-accounting identity. This paper does. A secondary contribution, often overlooked in the accounting literature but central to our methodology, is to treat the PIM and the wealth-stock equations as two equally informative windows onto the same latent process — exactly as demographers treat period and cohort data — rather than as competing aggregates whose disagreement is a nuisance to be absorbed into residuals.</w:t>
+        <w:t>The Beyond-GDP movement, from Stiglitz-Sen-Fitoussi (2009) through Jorgenson (2018) and Managi-Kumar (2018), proposes to replace or augment GDP with wealth-style aggregates. Empirically, however, the three main aggregates — SEEA, IWI, and CWON — disagree materially both with each other and with independently reconstructed perpetual-inventory stocks (Arrow et al., 2012; Dasgupta, 2021). The mainstream diagnosis blames measurement error and the treatment of natural capital. We show that a more mundane culprit — a mis-specified time-to-build and an omitted intangible share — explains a sizeable fraction of the discrepancy.</w:t>
+      </w:r>
+    </w:p>
+    <w:p>
+      <w:pPr>
+        <w:spacing w:after="120" w:before="0" w:line="360" w:lineRule="auto"/>
+      </w:pPr>
+      <w:r>
+        <w:rPr>
+          <w:rFonts w:ascii="Times New Roman" w:hAnsi="Times New Roman" w:eastAsia="MS Mincho"/>
+          <w:b w:val="0"/>
+          <w:i w:val="0"/>
+          <w:sz w:val="22"/>
+        </w:rPr>
+        <w:t>A separate strand of work has examined the consistency between flow-based and stock-based accounts from an accounting-identity perspective. Jorgenson (2018) emphasises that the production and wealth accounts are linked by the accumulation identity dW/dt = S(Y) − δW, but notes that empirical implementations rarely enforce this linkage. Our joint identification framework (Section 3.3) is a direct econometric application of this identity, which distinguishes it from most existing wealth-accounting studies that treat the production and wealth sides independently.</w:t>
       </w:r>
     </w:p>
     <w:p>
@@ -413,9 +445,65 @@
           <w:rFonts w:ascii="Times New Roman" w:hAnsi="Times New Roman" w:eastAsia="MS Mincho"/>
           <w:b/>
           <w:i w:val="0"/>
-          <w:sz w:val="26"/>
+          <w:sz w:val="22"/>
         </w:rPr>
-        <w:t>3. Theory</w:t>
+        <w:t>2.4 Tempo effects in demography: a heuristic analogy</w:t>
+      </w:r>
+    </w:p>
+    <w:p>
+      <w:pPr>
+        <w:spacing w:after="120" w:before="0" w:line="360" w:lineRule="auto"/>
+      </w:pPr>
+      <w:r>
+        <w:rPr>
+          <w:rFonts w:ascii="Times New Roman" w:hAnsi="Times New Roman" w:eastAsia="MS Mincho"/>
+          <w:b w:val="0"/>
+          <w:i w:val="0"/>
+          <w:sz w:val="22"/>
+        </w:rPr>
+        <w:t>Bongaarts and Feeney (1998) introduced the adjustment TFR\ = TFR/(1 − r(t)) where r(t)* is the annual change in the mean age at childbearing. Goldstein, Lutz, and Scherbov (2003) showed that Bongaarts-Feeney was an upper bound unless a parity-specific "forgotten" variance σ was re-introduced. Kohler, Billari, and Ortega (2002) and Bongaarts and Sobotka (2012) confirmed both findings across Europe. The structural lesson — that flow statistics of a stock process can be contaminated by drift in the timing distribution, and that a single omitted quantity parameter can restore consistency — is the heuristic that motivates our joint treatment of μ and β.</w:t>
+      </w:r>
+    </w:p>
+    <w:p>
+      <w:pPr>
+        <w:spacing w:after="120" w:before="0" w:line="360" w:lineRule="auto"/>
+      </w:pPr>
+      <w:r>
+        <w:rPr>
+          <w:rFonts w:ascii="Times New Roman" w:hAnsi="Times New Roman" w:eastAsia="MS Mincho"/>
+          <w:b w:val="0"/>
+          <w:i w:val="0"/>
+          <w:sz w:val="22"/>
+        </w:rPr>
+        <w:t>We emphasise that this is a heuristic analogy, not a formal identity. The demographic tempo effect corrects a compositional bias arising from period-cohort aggregation in heterogeneous populations. The capital-accounting correction adjusts a production-function timing mis-specification. The mathematical forms are similar (a distributed lag with a drifting mean), but the identifying assumptions and the interpretation of the parameters differ. We use the demographic vocabulary ("tempo", "forgotten parameter") as a pedagogical convenience and to highlight the structural symmetry, but we do not claim that the two problems reduce to the same statistical object.</w:t>
+      </w:r>
+    </w:p>
+    <w:p>
+      <w:pPr>
+        <w:spacing w:before="240" w:after="120"/>
+      </w:pPr>
+      <w:r>
+        <w:rPr>
+          <w:rFonts w:ascii="Times New Roman" w:hAnsi="Times New Roman" w:eastAsia="MS Mincho"/>
+          <w:b/>
+          <w:i w:val="0"/>
+          <w:sz w:val="22"/>
+        </w:rPr>
+        <w:t>2.5 The gap this paper fills</w:t>
+      </w:r>
+    </w:p>
+    <w:p>
+      <w:pPr>
+        <w:spacing w:after="120" w:before="0" w:line="360" w:lineRule="auto"/>
+      </w:pPr>
+      <w:r>
+        <w:rPr>
+          <w:rFonts w:ascii="Times New Roman" w:hAnsi="Times New Roman" w:eastAsia="MS Mincho"/>
+          <w:b w:val="0"/>
+          <w:i w:val="0"/>
+          <w:sz w:val="22"/>
+        </w:rPr>
+        <w:t>The literatures above individually treat (i) capital time-to-build, (ii) intangibles, (iii) wealth aggregates, and (iv) demographic tempo. To our knowledge, no prior work simultaneously (a) estimates a time-varying time-to-build, (b) recovers the CHS intangible share, and (c) disciplines both with a wealth-accounting identity. A secondary contribution is to treat the PIM and the wealth-stock equations as two equally informative windows onto the same latent process rather than as competing aggregates whose disagreement is a nuisance to be absorbed into residuals.</w:t>
       </w:r>
     </w:p>
     <w:p>
@@ -429,13 +517,26 @@
           <w:i w:val="0"/>
           <w:sz w:val="24"/>
         </w:rPr>
-        <w:t>3.1 Flow-side production function with tempo</w:t>
+        <w:t>3. Theory</w:t>
       </w:r>
     </w:p>
     <w:p>
       <w:pPr>
-        <w:spacing w:after="120" w:line="360" w:lineRule="auto"/>
-        <w:ind w:firstLine="240"/>
+        <w:spacing w:before="240" w:after="120"/>
+      </w:pPr>
+      <w:r>
+        <w:rPr>
+          <w:rFonts w:ascii="Times New Roman" w:hAnsi="Times New Roman" w:eastAsia="MS Mincho"/>
+          <w:b/>
+          <w:i w:val="0"/>
+          <w:sz w:val="22"/>
+        </w:rPr>
+        <w:t>3.1 Flow-side production function with time-varying time-to-build</w:t>
+      </w:r>
+    </w:p>
+    <w:p>
+      <w:pPr>
+        <w:spacing w:after="120" w:before="0" w:line="360" w:lineRule="auto"/>
       </w:pPr>
       <w:r>
         <w:rPr>
@@ -449,8 +550,7 @@
     </w:p>
     <w:p>
       <w:pPr>
-        <w:spacing w:after="120" w:line="360" w:lineRule="auto"/>
-        <w:ind w:firstLine="240"/>
+        <w:spacing w:after="120" w:before="0" w:line="360" w:lineRule="auto"/>
       </w:pPr>
       <w:r>
         <w:rPr>
@@ -464,8 +564,7 @@
     </w:p>
     <w:p>
       <w:pPr>
-        <w:spacing w:after="120" w:line="360" w:lineRule="auto"/>
-        <w:ind w:firstLine="240"/>
+        <w:spacing w:after="120" w:before="0" w:line="360" w:lineRule="auto"/>
       </w:pPr>
       <w:r>
         <w:rPr>
@@ -479,8 +578,7 @@
     </w:p>
     <w:p>
       <w:pPr>
-        <w:spacing w:after="120" w:line="360" w:lineRule="auto"/>
-        <w:ind w:firstLine="240"/>
+        <w:spacing w:after="120" w:before="0" w:line="360" w:lineRule="auto"/>
       </w:pPr>
       <w:r>
         <w:rPr>
@@ -494,8 +592,7 @@
     </w:p>
     <w:p>
       <w:pPr>
-        <w:spacing w:after="120" w:line="360" w:lineRule="auto"/>
-        <w:ind w:firstLine="240"/>
+        <w:spacing w:after="120" w:before="0" w:line="360" w:lineRule="auto"/>
       </w:pPr>
       <w:r>
         <w:rPr>
@@ -504,13 +601,12 @@
           <w:i w:val="0"/>
           <w:sz w:val="22"/>
         </w:rPr>
-        <w:t>with geometric weights w_s(μ) = (1 − θ)·θ^s and θ = μ/(1+μ), so the mean lag is exactly μ years. The key novelty relative to the existing lag literature is to allow μ to drift linearly over time:</w:t>
+        <w:t>with geometric weights w_s(μ) = (1 − θ)·θ^s and θ = μ/(1+μ), so the mean lag is exactly μ years. Our first extension is to allow μ to drift linearly over time:</w:t>
       </w:r>
     </w:p>
     <w:p>
       <w:pPr>
-        <w:spacing w:after="120" w:line="360" w:lineRule="auto"/>
-        <w:ind w:firstLine="240"/>
+        <w:spacing w:after="120" w:before="0" w:line="360" w:lineRule="auto"/>
       </w:pPr>
       <w:r>
         <w:rPr>
@@ -524,8 +620,7 @@
     </w:p>
     <w:p>
       <w:pPr>
-        <w:spacing w:after="120" w:line="360" w:lineRule="auto"/>
-        <w:ind w:firstLine="240"/>
+        <w:spacing w:after="120" w:before="0" w:line="360" w:lineRule="auto"/>
       </w:pPr>
       <w:r>
         <w:rPr>
@@ -534,7 +629,21 @@
           <w:i w:val="0"/>
           <w:sz w:val="22"/>
         </w:rPr>
-        <w:t>where μ₁ captures the "tempo" in Bongaarts-Feeney's sense. A positive μ₁ indicates that typical projects are becoming longer-lived — for example because new investment is increasingly digital infrastructure, R&amp;D platforms, or complex systems that require multi-year assembly — and a negative μ₁ would indicate the opposite.</w:t>
+        <w:t>where μ₁ captures the secular trend in the mean time-to-build. A positive μ₁ indicates that typical projects are becoming longer-lived — for example because new investment is increasingly digital infrastructure, R&amp;D platforms, or complex systems that require multi-year assembly — and a negative μ₁ would indicate the opposite.</w:t>
+      </w:r>
+    </w:p>
+    <w:p>
+      <w:pPr>
+        <w:spacing w:after="120" w:before="0" w:line="360" w:lineRule="auto"/>
+      </w:pPr>
+      <w:r>
+        <w:rPr>
+          <w:rFonts w:ascii="Times New Roman" w:hAnsi="Times New Roman" w:eastAsia="MS Mincho"/>
+          <w:b w:val="0"/>
+          <w:i w:val="0"/>
+          <w:sz w:val="22"/>
+        </w:rPr>
+        <w:t>Equation (M2) is a reduced form. We do not attribute the drift to any single structural cause; it could reflect sectoral composition change (OECD, 2009), rising intangible intensity (Corrado et al., 2016), or regulatory lengthening of project approval times. The linear specification is the simplest possible and is motivated by the demographic literature's treatment of the mean age at childbearing (Bongaarts and Feeney, 1998), but we emphasise that this is a modelling choice rather than a structural estimate. We test a constant-lag alternative (M1) alongside M2 in all specifications.</w:t>
       </w:r>
     </w:p>
     <w:p>
@@ -546,15 +655,14 @@
           <w:rFonts w:ascii="Times New Roman" w:hAnsi="Times New Roman" w:eastAsia="MS Mincho"/>
           <w:b/>
           <w:i w:val="0"/>
-          <w:sz w:val="24"/>
+          <w:sz w:val="22"/>
         </w:rPr>
-        <w:t>3.2 Stock-side intangibles: the forgotten β</w:t>
+        <w:t>3.2 Stock-side intangibles</w:t>
       </w:r>
     </w:p>
     <w:p>
       <w:pPr>
-        <w:spacing w:after="120" w:line="360" w:lineRule="auto"/>
-        <w:ind w:firstLine="240"/>
+        <w:spacing w:after="120" w:before="0" w:line="360" w:lineRule="auto"/>
       </w:pPr>
       <w:r>
         <w:rPr>
@@ -568,8 +676,7 @@
     </w:p>
     <w:p>
       <w:pPr>
-        <w:spacing w:after="120" w:line="360" w:lineRule="auto"/>
-        <w:ind w:firstLine="240"/>
+        <w:spacing w:after="120" w:before="0" w:line="360" w:lineRule="auto"/>
       </w:pPr>
       <w:r>
         <w:rPr>
@@ -583,8 +690,7 @@
     </w:p>
     <w:p>
       <w:pPr>
-        <w:spacing w:after="120" w:line="360" w:lineRule="auto"/>
-        <w:ind w:firstLine="240"/>
+        <w:spacing w:after="120" w:before="0" w:line="360" w:lineRule="auto"/>
       </w:pPr>
       <w:r>
         <w:rPr>
@@ -593,7 +699,7 @@
           <w:i w:val="0"/>
           <w:sz w:val="22"/>
         </w:rPr>
-        <w:t>where β is the intangible share. Standard practice imposes β = 0 (Solow; also M0 and M1 here). Estimating β &gt; 0 is the capital-accounting analogue of re-introducing the parity-specific variance σ in Goldstein-Lutz-Scherbov.</w:t>
+        <w:t>where β is the intangible output share. Standard practice imposes β = 0 (Solow; also M0 and M1 here). We estimate β per country.</w:t>
       </w:r>
     </w:p>
     <w:p>
@@ -605,15 +711,14 @@
           <w:rFonts w:ascii="Times New Roman" w:hAnsi="Times New Roman" w:eastAsia="MS Mincho"/>
           <w:b/>
           <w:i w:val="0"/>
-          <w:sz w:val="24"/>
+          <w:sz w:val="22"/>
         </w:rPr>
         <w:t>3.3 Unifying identity: the flow-stock joint loss</w:t>
       </w:r>
     </w:p>
     <w:p>
       <w:pPr>
-        <w:spacing w:after="120" w:line="360" w:lineRule="auto"/>
-        <w:ind w:firstLine="240"/>
+        <w:spacing w:after="120" w:before="0" w:line="360" w:lineRule="auto"/>
       </w:pPr>
       <w:r>
         <w:rPr>
@@ -627,8 +732,7 @@
     </w:p>
     <w:p>
       <w:pPr>
-        <w:spacing w:after="120" w:line="360" w:lineRule="auto"/>
-        <w:ind w:firstLine="240"/>
+        <w:spacing w:after="120" w:before="0" w:line="360" w:lineRule="auto"/>
       </w:pPr>
       <w:r>
         <w:rPr>
@@ -642,8 +746,7 @@
     </w:p>
     <w:p>
       <w:pPr>
-        <w:spacing w:after="120" w:line="360" w:lineRule="auto"/>
-        <w:ind w:firstLine="240"/>
+        <w:spacing w:after="120" w:before="0" w:line="360" w:lineRule="auto"/>
       </w:pPr>
       <w:r>
         <w:rPr>
@@ -657,8 +760,7 @@
     </w:p>
     <w:p>
       <w:pPr>
-        <w:spacing w:after="120" w:line="360" w:lineRule="auto"/>
-        <w:ind w:firstLine="240"/>
+        <w:spacing w:after="120" w:before="0" w:line="360" w:lineRule="auto"/>
       </w:pPr>
       <w:r>
         <w:rPr>
@@ -672,8 +774,7 @@
     </w:p>
     <w:p>
       <w:pPr>
-        <w:spacing w:after="120" w:line="360" w:lineRule="auto"/>
-        <w:ind w:firstLine="240"/>
+        <w:spacing w:after="120" w:before="0" w:line="360" w:lineRule="auto"/>
       </w:pPr>
       <w:r>
         <w:rPr>
@@ -694,15 +795,14 @@
           <w:rFonts w:ascii="Times New Roman" w:hAnsi="Times New Roman" w:eastAsia="MS Mincho"/>
           <w:b/>
           <w:i w:val="0"/>
-          <w:sz w:val="24"/>
+          <w:sz w:val="22"/>
         </w:rPr>
-        <w:t>3.4 Quantum–tempo correspondence between population and capital</w:t>
+        <w:t>3.4 Heuristic correspondence between population and capital accounting</w:t>
       </w:r>
     </w:p>
     <w:p>
       <w:pPr>
-        <w:spacing w:after="120" w:line="360" w:lineRule="auto"/>
-        <w:ind w:firstLine="240"/>
+        <w:spacing w:after="120" w:before="0" w:line="360" w:lineRule="auto"/>
       </w:pPr>
       <w:r>
         <w:rPr>
@@ -711,21 +811,7 @@
           <w:i w:val="0"/>
           <w:sz w:val="22"/>
         </w:rPr>
-        <w:t>Table 2 lays out the one-to-one mapping between the demographic variables that Bongaarts-Feeney-Goldstein-Lutz-Scherbov analysed and the capital-accounting variables we analyse. Every demographic entity has a capital entity with the same role in the book-keeping identity and in the quantum-tempo decomposition. This is more than mnemonic: it implies that the statistical tools used to identify σ from fertility tempo (cohort-consistency tests, Brass relational models) have direct analogues in capital accounting, which we exploit.</w:t>
-      </w:r>
-    </w:p>
-    <w:p>
-      <w:pPr>
-        <w:spacing w:before="240" w:after="120"/>
-      </w:pPr>
-      <w:r>
-        <w:rPr>
-          <w:rFonts w:ascii="Times New Roman" w:hAnsi="Times New Roman" w:eastAsia="MS Mincho"/>
-          <w:b/>
-          <w:i w:val="0"/>
-          <w:sz w:val="26"/>
-        </w:rPr>
-        <w:t>4. Data and methods</w:t>
+        <w:t>Table A1 (Appendix) lays out the mapping between the demographic variables that Bongaarts-Feeney-Goldstein-Lutz-Scherbov analysed and the capital-accounting variables we analyse. We include this mapping for two reasons. First, it helps readers familiar with the demographic literature to see the structural parallels. Second, it highlights where the analogy breaks down: capital stocks depreciate via an estimated δ_t rather than via well-measured mortality rates, and the time-to-build is a gestation lag rather than a period-cohort aggregation bias. The mapping is a pedagogical device, not a formal equivalence.</w:t>
       </w:r>
     </w:p>
     <w:p>
@@ -739,13 +825,26 @@
           <w:i w:val="0"/>
           <w:sz w:val="24"/>
         </w:rPr>
+        <w:t>4. Data and methods</w:t>
+      </w:r>
+    </w:p>
+    <w:p>
+      <w:pPr>
+        <w:spacing w:before="240" w:after="120"/>
+      </w:pPr>
+      <w:r>
+        <w:rPr>
+          <w:rFonts w:ascii="Times New Roman" w:hAnsi="Times New Roman" w:eastAsia="MS Mincho"/>
+          <w:b/>
+          <w:i w:val="0"/>
+          <w:sz w:val="22"/>
+        </w:rPr>
         <w:t>4.1 Data</w:t>
       </w:r>
     </w:p>
     <w:p>
       <w:pPr>
-        <w:spacing w:after="120" w:line="360" w:lineRule="auto"/>
-        <w:ind w:firstLine="240"/>
+        <w:spacing w:after="120" w:before="0" w:line="360" w:lineRule="auto"/>
       </w:pPr>
       <w:r>
         <w:rPr>
@@ -759,8 +858,7 @@
     </w:p>
     <w:p>
       <w:pPr>
-        <w:spacing w:after="120" w:line="360" w:lineRule="auto"/>
-        <w:ind w:firstLine="240"/>
+        <w:spacing w:after="120" w:before="0" w:line="360" w:lineRule="auto"/>
       </w:pPr>
       <w:r>
         <w:rPr>
@@ -781,15 +879,14 @@
           <w:rFonts w:ascii="Times New Roman" w:hAnsi="Times New Roman" w:eastAsia="MS Mincho"/>
           <w:b/>
           <w:i w:val="0"/>
-          <w:sz w:val="24"/>
+          <w:sz w:val="22"/>
         </w:rPr>
-        <w:t>4.2 Models M0–M4</w:t>
+        <w:t>4.2 Models M0–M4 and additional benchmarks</w:t>
       </w:r>
     </w:p>
     <w:p>
       <w:pPr>
-        <w:spacing w:after="120" w:line="360" w:lineRule="auto"/>
-        <w:ind w:firstLine="240"/>
+        <w:spacing w:after="120" w:before="0" w:line="360" w:lineRule="auto"/>
       </w:pPr>
       <w:r>
         <w:rPr>
@@ -803,8 +900,7 @@
     </w:p>
     <w:p>
       <w:pPr>
-        <w:spacing w:after="120" w:line="360" w:lineRule="auto"/>
-        <w:ind w:firstLine="240"/>
+        <w:spacing w:after="120" w:before="0" w:line="360" w:lineRule="auto"/>
       </w:pPr>
       <w:r>
         <w:rPr>
@@ -813,13 +909,12 @@
           <w:i w:val="0"/>
           <w:sz w:val="22"/>
         </w:rPr>
-        <w:t xml:space="preserve"> M0: Solow baseline, K_tang* as M0 above, β = 0.</w:t>
+        <w:t xml:space="preserve"> M0: Solow baseline, K_tang* as (M0), β = 0.</w:t>
       </w:r>
     </w:p>
     <w:p>
       <w:pPr>
-        <w:spacing w:after="120" w:line="360" w:lineRule="auto"/>
-        <w:ind w:firstLine="240"/>
+        <w:spacing w:after="120" w:before="0" w:line="360" w:lineRule="auto"/>
       </w:pPr>
       <w:r>
         <w:rPr>
@@ -833,8 +928,7 @@
     </w:p>
     <w:p>
       <w:pPr>
-        <w:spacing w:after="120" w:line="360" w:lineRule="auto"/>
-        <w:ind w:firstLine="240"/>
+        <w:spacing w:after="120" w:before="0" w:line="360" w:lineRule="auto"/>
       </w:pPr>
       <w:r>
         <w:rPr>
@@ -848,8 +942,7 @@
     </w:p>
     <w:p>
       <w:pPr>
-        <w:spacing w:after="120" w:line="360" w:lineRule="auto"/>
-        <w:ind w:firstLine="240"/>
+        <w:spacing w:after="120" w:before="0" w:line="360" w:lineRule="auto"/>
       </w:pPr>
       <w:r>
         <w:rPr>
@@ -863,8 +956,7 @@
     </w:p>
     <w:p>
       <w:pPr>
-        <w:spacing w:after="120" w:line="360" w:lineRule="auto"/>
-        <w:ind w:firstLine="240"/>
+        <w:spacing w:after="120" w:before="0" w:line="360" w:lineRule="auto"/>
       </w:pPr>
       <w:r>
         <w:rPr>
@@ -878,8 +970,49 @@
     </w:p>
     <w:p>
       <w:pPr>
-        <w:spacing w:after="120" w:line="360" w:lineRule="auto"/>
-        <w:ind w:firstLine="240"/>
+        <w:spacing w:after="120" w:before="0" w:line="360" w:lineRule="auto"/>
+      </w:pPr>
+      <w:r>
+        <w:rPr>
+          <w:rFonts w:ascii="Times New Roman" w:hAnsi="Times New Roman" w:eastAsia="MS Mincho"/>
+          <w:b w:val="0"/>
+          <w:i w:val="0"/>
+          <w:sz w:val="22"/>
+        </w:rPr>
+        <w:t>To address the question of whether the improvement in fit comes from allowing any positive lag versus specifically from the time variation in μ(t), we also estimate two additional benchmarks:</w:t>
+      </w:r>
+    </w:p>
+    <w:p>
+      <w:pPr>
+        <w:spacing w:after="120" w:before="0" w:line="360" w:lineRule="auto"/>
+      </w:pPr>
+      <w:r>
+        <w:rPr>
+          <w:rFonts w:ascii="Times New Roman" w:hAnsi="Times New Roman" w:eastAsia="MS Mincho"/>
+          <w:b w:val="0"/>
+          <w:i w:val="0"/>
+          <w:sz w:val="22"/>
+        </w:rPr>
+        <w:t>* M1a (AR(1) distributed lag): K(t) = (1 − δ)K(t−1) + φ·I(t−1) + (1−φ)·I(t−2). This is a fixed two-period distributed lag with a single parameter φ ∈ [0, 1] estimated per country, which nests M0 (φ = 1) and M1 with μ = 1 (φ = 0) as special cases. Unlike M1, M1a does not use the geometric lag kernel; it provides an alternative non-parametric benchmark against which the geometric assumption of M1–M2 can be tested.</w:t>
+      </w:r>
+    </w:p>
+    <w:p>
+      <w:pPr>
+        <w:spacing w:after="120" w:before="0" w:line="360" w:lineRule="auto"/>
+      </w:pPr>
+      <w:r>
+        <w:rPr>
+          <w:rFonts w:ascii="Times New Roman" w:hAnsi="Times New Roman" w:eastAsia="MS Mincho"/>
+          <w:b w:val="0"/>
+          <w:i w:val="0"/>
+          <w:sz w:val="22"/>
+        </w:rPr>
+        <w:t>* M2a (broken-trend μ): μ(t) = μ₀ + μ₁·max(0, t − t_break), where t_break is a single structural break estimated by grid search over {1990, 1995, 2000, 2005, 2010}. This tests whether the linear drift in M2 is driven by a single regime change rather than a gradual trend.</w:t>
+      </w:r>
+    </w:p>
+    <w:p>
+      <w:pPr>
+        <w:spacing w:after="120" w:before="0" w:line="360" w:lineRule="auto"/>
       </w:pPr>
       <w:r>
         <w:rPr>
@@ -893,8 +1026,7 @@
     </w:p>
     <w:p>
       <w:pPr>
-        <w:spacing w:after="120" w:line="360" w:lineRule="auto"/>
-        <w:ind w:firstLine="240"/>
+        <w:spacing w:after="120" w:before="0" w:line="360" w:lineRule="auto"/>
       </w:pPr>
       <w:r>
         <w:rPr>
@@ -908,8 +1040,7 @@
     </w:p>
     <w:p>
       <w:pPr>
-        <w:spacing w:after="120" w:line="360" w:lineRule="auto"/>
-        <w:ind w:firstLine="240"/>
+        <w:spacing w:after="120" w:before="0" w:line="360" w:lineRule="auto"/>
       </w:pPr>
       <w:r>
         <w:rPr>
@@ -923,8 +1054,7 @@
     </w:p>
     <w:p>
       <w:pPr>
-        <w:spacing w:after="120" w:line="360" w:lineRule="auto"/>
-        <w:ind w:firstLine="240"/>
+        <w:spacing w:after="120" w:before="0" w:line="360" w:lineRule="auto"/>
       </w:pPr>
       <w:r>
         <w:rPr>
@@ -945,15 +1075,14 @@
           <w:rFonts w:ascii="Times New Roman" w:hAnsi="Times New Roman" w:eastAsia="MS Mincho"/>
           <w:b/>
           <w:i w:val="0"/>
-          <w:sz w:val="24"/>
+          <w:sz w:val="22"/>
         </w:rPr>
         <w:t>4.3 Estimation protocol and grid search</w:t>
       </w:r>
     </w:p>
     <w:p>
       <w:pPr>
-        <w:spacing w:after="120" w:line="360" w:lineRule="auto"/>
-        <w:ind w:firstLine="240"/>
+        <w:spacing w:after="120" w:before="0" w:line="360" w:lineRule="auto"/>
       </w:pPr>
       <w:r>
         <w:rPr>
@@ -974,15 +1103,14 @@
           <w:rFonts w:ascii="Times New Roman" w:hAnsi="Times New Roman" w:eastAsia="MS Mincho"/>
           <w:b/>
           <w:i w:val="0"/>
-          <w:sz w:val="24"/>
+          <w:sz w:val="22"/>
         </w:rPr>
         <w:t>4.4 Bootstrap confidence intervals</w:t>
       </w:r>
     </w:p>
     <w:p>
       <w:pPr>
-        <w:spacing w:after="120" w:line="360" w:lineRule="auto"/>
-        <w:ind w:firstLine="240"/>
+        <w:spacing w:after="120" w:before="0" w:line="360" w:lineRule="auto"/>
       </w:pPr>
       <w:r>
         <w:rPr>
@@ -1003,15 +1131,14 @@
           <w:rFonts w:ascii="Times New Roman" w:hAnsi="Times New Roman" w:eastAsia="MS Mincho"/>
           <w:b/>
           <w:i w:val="0"/>
-          <w:sz w:val="24"/>
+          <w:sz w:val="22"/>
         </w:rPr>
         <w:t>4.5 γ_price sensitivity</w:t>
       </w:r>
     </w:p>
     <w:p>
       <w:pPr>
-        <w:spacing w:after="120" w:line="360" w:lineRule="auto"/>
-        <w:ind w:firstLine="240"/>
+        <w:spacing w:after="120" w:before="0" w:line="360" w:lineRule="auto"/>
       </w:pPr>
       <w:r>
         <w:rPr>
@@ -1032,9 +1159,394 @@
           <w:rFonts w:ascii="Times New Roman" w:hAnsi="Times New Roman" w:eastAsia="MS Mincho"/>
           <w:b/>
           <w:i w:val="0"/>
-          <w:sz w:val="26"/>
+          <w:sz w:val="24"/>
         </w:rPr>
         <w:t>5. Results</w:t>
+      </w:r>
+    </w:p>
+    <w:p>
+      <w:pPr>
+        <w:spacing w:before="240" w:after="120"/>
+      </w:pPr>
+      <w:r>
+        <w:rPr>
+          <w:rFonts w:ascii="Times New Roman" w:hAnsi="Times New Roman" w:eastAsia="MS Mincho"/>
+          <w:b/>
+          <w:i w:val="0"/>
+          <w:sz w:val="22"/>
+        </w:rPr>
+        <w:t>5.1 In-sample parameter distributions and fit</w:t>
+      </w:r>
+    </w:p>
+    <w:p>
+      <w:pPr>
+        <w:spacing w:after="120" w:before="0" w:line="360" w:lineRule="auto"/>
+      </w:pPr>
+      <w:r>
+        <w:rPr>
+          <w:rFonts w:ascii="Times New Roman" w:hAnsi="Times New Roman" w:eastAsia="MS Mincho"/>
+          <w:b w:val="0"/>
+          <w:i w:val="0"/>
+          <w:sz w:val="22"/>
+        </w:rPr>
+        <w:t>[Table 1 here]</w:t>
+      </w:r>
+    </w:p>
+    <w:p>
+      <w:pPr>
+        <w:spacing w:after="120" w:before="0" w:line="360" w:lineRule="auto"/>
+      </w:pPr>
+      <w:r>
+        <w:rPr>
+          <w:rFonts w:ascii="Times New Roman" w:hAnsi="Times New Roman" w:eastAsia="MS Mincho"/>
+          <w:b w:val="0"/>
+          <w:i w:val="0"/>
+          <w:sz w:val="22"/>
+        </w:rPr>
+        <w:t>Table 1 summarises the five models. Three facts deserve particular emphasis. First, the median in-sample growth-rate RMSE hardly moves across M0–M4 (3.07–3.10 pp). This is what standard Solow-accounting practitioners have found repeatedly when they experimented with alternative capital constructions (Jorgenson and Griliches, 1967; Hulten, 1992), and it is one reason why the profession has settled on M0 as the canonical baseline: within-sample growth-rate fit does not discipline μ at all. Second, the median level MAPE under M0 is 4.10%, meaning that a carefully re-estimated TFP trajectory can absorb nearly all of a 4% miscalibration in the capital stock at every point in time while preserving the first-differenced fit. This illustrates the warning of Griliches (1996) that "TFP is the measure of our ignorance". Third, the distribution of estimated μ across the 39 countries is highly non-degenerate. The interquartile range under M1 runs from below 0.1 years to above 1.2 years, and the drift μ₁ under M2 has an IQR that includes both negative and positive values. The median country has a M1 constant lag μ\ ≈ 0.3 years and a M2 drift μ₁ close to zero on average but with wide dispersion across countries (IQR roughly [−0.02, +0.05]). Median intangible share β under M3 is about 0.06 for production-only fitting.</w:t>
+      </w:r>
+    </w:p>
+    <w:p>
+      <w:pPr>
+        <w:spacing w:before="240" w:after="120"/>
+      </w:pPr>
+      <w:r>
+        <w:rPr>
+          <w:rFonts w:ascii="Times New Roman" w:hAnsi="Times New Roman" w:eastAsia="MS Mincho"/>
+          <w:b/>
+          <w:i w:val="0"/>
+          <w:sz w:val="22"/>
+        </w:rPr>
+        <w:t>5.2 Out-of-sample prediction: where the gains come from</w:t>
+      </w:r>
+    </w:p>
+    <w:p>
+      <w:pPr>
+        <w:spacing w:after="120" w:before="0" w:line="360" w:lineRule="auto"/>
+      </w:pPr>
+      <w:r>
+        <w:rPr>
+          <w:rFonts w:ascii="Times New Roman" w:hAnsi="Times New Roman" w:eastAsia="MS Mincho"/>
+          <w:b w:val="0"/>
+          <w:i w:val="0"/>
+          <w:sz w:val="22"/>
+        </w:rPr>
+        <w:t>[Figure 1 here]</w:t>
+      </w:r>
+    </w:p>
+    <w:p>
+      <w:pPr>
+        <w:spacing w:after="120" w:before="0" w:line="360" w:lineRule="auto"/>
+      </w:pPr>
+      <w:r>
+        <w:rPr>
+          <w:rFonts w:ascii="Times New Roman" w:hAnsi="Times New Roman" w:eastAsia="MS Mincho"/>
+          <w:b w:val="0"/>
+          <w:i w:val="0"/>
+          <w:sz w:val="22"/>
+        </w:rPr>
+        <w:t>Figure 1 shows the key out-of-sample results. With parameters fit on 1970–2014 and level forecasts produced for 2015–2019, the median out-of-sample MAPE is:</w:t>
+      </w:r>
+    </w:p>
+    <w:p>
+      <w:pPr>
+        <w:spacing w:after="40" w:before="40"/>
+        <w:ind w:left="283"/>
+      </w:pPr>
+      <w:r>
+        <w:rPr>
+          <w:rFonts w:ascii="Courier New" w:hAnsi="Courier New" w:eastAsia="MS Mincho"/>
+          <w:b w:val="0"/>
+          <w:i w:val="0"/>
+          <w:sz w:val="18"/>
+        </w:rPr>
+        <w:t>| Model | Out-of-sample MAPE (median, %) |</w:t>
+      </w:r>
+    </w:p>
+    <w:p>
+      <w:pPr>
+        <w:spacing w:after="120" w:before="0" w:line="360" w:lineRule="auto"/>
+      </w:pPr>
+      <w:r>
+        <w:rPr>
+          <w:rFonts w:ascii="Times New Roman" w:hAnsi="Times New Roman" w:eastAsia="MS Mincho"/>
+          <w:b w:val="0"/>
+          <w:i w:val="0"/>
+          <w:sz w:val="22"/>
+        </w:rPr>
+        <w:t>|-------|-------------------------------|</w:t>
+      </w:r>
+    </w:p>
+    <w:p>
+      <w:pPr>
+        <w:spacing w:after="40" w:before="40"/>
+        <w:ind w:left="283"/>
+      </w:pPr>
+      <w:r>
+        <w:rPr>
+          <w:rFonts w:ascii="Courier New" w:hAnsi="Courier New" w:eastAsia="MS Mincho"/>
+          <w:b w:val="0"/>
+          <w:i w:val="0"/>
+          <w:sz w:val="18"/>
+        </w:rPr>
+        <w:t>| M0 (Solow baseline) | 4.60 |</w:t>
+      </w:r>
+    </w:p>
+    <w:p>
+      <w:pPr>
+        <w:spacing w:after="40" w:before="40"/>
+        <w:ind w:left="283"/>
+      </w:pPr>
+      <w:r>
+        <w:rPr>
+          <w:rFonts w:ascii="Courier New" w:hAnsi="Courier New" w:eastAsia="MS Mincho"/>
+          <w:b w:val="0"/>
+          <w:i w:val="0"/>
+          <w:sz w:val="18"/>
+        </w:rPr>
+        <w:t>| M1a (AR(1) distributed lag) | 4.10 |</w:t>
+      </w:r>
+    </w:p>
+    <w:p>
+      <w:pPr>
+        <w:spacing w:after="40" w:before="40"/>
+        <w:ind w:left="283"/>
+      </w:pPr>
+      <w:r>
+        <w:rPr>
+          <w:rFonts w:ascii="Courier New" w:hAnsi="Courier New" w:eastAsia="MS Mincho"/>
+          <w:b w:val="0"/>
+          <w:i w:val="0"/>
+          <w:sz w:val="18"/>
+        </w:rPr>
+        <w:t>| M1 (constant lag) | 4.06 |</w:t>
+      </w:r>
+    </w:p>
+    <w:p>
+      <w:pPr>
+        <w:spacing w:after="40" w:before="40"/>
+        <w:ind w:left="283"/>
+      </w:pPr>
+      <w:r>
+        <w:rPr>
+          <w:rFonts w:ascii="Courier New" w:hAnsi="Courier New" w:eastAsia="MS Mincho"/>
+          <w:b w:val="0"/>
+          <w:i w:val="0"/>
+          <w:sz w:val="18"/>
+        </w:rPr>
+        <w:t>| M2 (time-varying μ(t)) | 3.99 |</w:t>
+      </w:r>
+    </w:p>
+    <w:p>
+      <w:pPr>
+        <w:spacing w:after="40" w:before="40"/>
+        <w:ind w:left="283"/>
+      </w:pPr>
+      <w:r>
+        <w:rPr>
+          <w:rFonts w:ascii="Courier New" w:hAnsi="Courier New" w:eastAsia="MS Mincho"/>
+          <w:b w:val="0"/>
+          <w:i w:val="0"/>
+          <w:sz w:val="18"/>
+        </w:rPr>
+        <w:t>| M3 (intangibles only) | 4.72 |</w:t>
+      </w:r>
+    </w:p>
+    <w:p>
+      <w:pPr>
+        <w:spacing w:after="40" w:before="40"/>
+        <w:ind w:left="283"/>
+      </w:pPr>
+      <w:r>
+        <w:rPr>
+          <w:rFonts w:ascii="Courier New" w:hAnsi="Courier New" w:eastAsia="MS Mincho"/>
+          <w:b w:val="0"/>
+          <w:i w:val="0"/>
+          <w:sz w:val="18"/>
+        </w:rPr>
+        <w:t>| M4 (joint μ + β) | 4.61 |</w:t>
+      </w:r>
+    </w:p>
+    <w:p>
+      <w:pPr>
+        <w:spacing w:after="120" w:before="0" w:line="360" w:lineRule="auto"/>
+      </w:pPr>
+      <w:r>
+        <w:rPr>
+          <w:rFonts w:ascii="Times New Roman" w:hAnsi="Times New Roman" w:eastAsia="MS Mincho"/>
+          <w:b w:val="0"/>
+          <w:i w:val="0"/>
+          <w:sz w:val="22"/>
+        </w:rPr>
+        <w:t>Three findings stand out.</w:t>
+      </w:r>
+    </w:p>
+    <w:p>
+      <w:pPr>
+        <w:spacing w:after="120" w:before="0" w:line="360" w:lineRule="auto"/>
+      </w:pPr>
+      <w:r>
+        <w:rPr>
+          <w:rFonts w:ascii="Times New Roman" w:hAnsi="Times New Roman" w:eastAsia="MS Mincho"/>
+          <w:b w:val="0"/>
+          <w:i w:val="0"/>
+          <w:sz w:val="22"/>
+        </w:rPr>
+        <w:t>First, the main improvement comes from allowing a positive time-to-build, not from time variation per se. M1 (constant lag) reduces MAPE from 4.60% to 4.06%, achieving the bulk of the total improvement. M2 (time-varying lag) improves further to 3.99%, confirming that the linear drift adds a modest incremental gain (0.07 pp) relative to a constant lag. M1a (AR(1) distributed lag) achieves 4.10%, close to M1, indicating that the result is not sensitive to the geometric lag specification. The implication is clear: the standard PIM assumption of instantaneous investment is the dominant source of mis-specification, and the time-varying extension is a secondary refinement.</w:t>
+      </w:r>
+    </w:p>
+    <w:p>
+      <w:pPr>
+        <w:spacing w:after="120" w:before="0" w:line="360" w:lineRule="auto"/>
+      </w:pPr>
+      <w:r>
+        <w:rPr>
+          <w:rFonts w:ascii="Times New Roman" w:hAnsi="Times New Roman" w:eastAsia="MS Mincho"/>
+          <w:b w:val="0"/>
+          <w:i w:val="0"/>
+          <w:sz w:val="22"/>
+        </w:rPr>
+        <w:t>Second, intangible capital alone (M3) does not improve out-of-sample prediction (MAPE 4.72%), and combining all corrections (M4, MAPE 4.61%) does not outperform M1 alone. This is a negative result that deserves honest reporting. Adding a co-moving intangible stock widens forecast uncertainty, especially under the 2015–2019 global slowdown that affected R&amp;D-intensive countries disproportionately. The joint identification (M4) returns MAPE close to M0, which is explained by the fact that the wealth-side constraint pulls (μ, β) away from the production-side optimum. The value of M4 is not in improved GDP prediction but in flow-stock consistency, as shown below.</w:t>
+      </w:r>
+    </w:p>
+    <w:p>
+      <w:pPr>
+        <w:spacing w:after="120" w:before="0" w:line="360" w:lineRule="auto"/>
+      </w:pPr>
+      <w:r>
+        <w:rPr>
+          <w:rFonts w:ascii="Times New Roman" w:hAnsi="Times New Roman" w:eastAsia="MS Mincho"/>
+          <w:b w:val="0"/>
+          <w:i w:val="0"/>
+          <w:sz w:val="22"/>
+        </w:rPr>
+        <w:t>Third, the gains are heterogeneous across countries. Among the ten economies with the highest R&amp;D-to-GDP ratios (Israel, Korea, Sweden, Austria, Japan, Germany, Denmark, Finland, Belgium, US), the M0→M2 improvement averages 17.4%; among the ten with the lowest R&amp;D intensity (Mexico, Colombia, Turkey, Chile, Greece, Portugal, Spain, Italy, Slovakia, Latvia), it averages only 6.2%. This pattern is consistent with the intuition that time-to-build matters most where the asset mix is shifting most rapidly.</w:t>
+      </w:r>
+    </w:p>
+    <w:p>
+      <w:pPr>
+        <w:spacing w:before="240" w:after="120"/>
+      </w:pPr>
+      <w:r>
+        <w:rPr>
+          <w:rFonts w:ascii="Times New Roman" w:hAnsi="Times New Roman" w:eastAsia="MS Mincho"/>
+          <w:b/>
+          <w:i w:val="0"/>
+          <w:sz w:val="22"/>
+        </w:rPr>
+        <w:t>5.3 Flow–stock consistency: the value of joint identification</w:t>
+      </w:r>
+    </w:p>
+    <w:p>
+      <w:pPr>
+        <w:spacing w:after="120" w:before="0" w:line="360" w:lineRule="auto"/>
+      </w:pPr>
+      <w:r>
+        <w:rPr>
+          <w:rFonts w:ascii="Times New Roman" w:hAnsi="Times New Roman" w:eastAsia="MS Mincho"/>
+          <w:b w:val="0"/>
+          <w:i w:val="0"/>
+          <w:sz w:val="22"/>
+        </w:rPr>
+        <w:t>[Figure 2 here]</w:t>
+      </w:r>
+    </w:p>
+    <w:p>
+      <w:pPr>
+        <w:spacing w:after="120" w:before="0" w:line="360" w:lineRule="auto"/>
+      </w:pPr>
+      <w:r>
+        <w:rPr>
+          <w:rFonts w:ascii="Times New Roman" w:hAnsi="Times New Roman" w:eastAsia="MS Mincho"/>
+          <w:b w:val="0"/>
+          <w:i w:val="0"/>
+          <w:sz w:val="22"/>
+        </w:rPr>
+        <w:t>Figure 2 shows PIM-reconstructed capital K_tang(t; μ̂) + β̂ · K_I(t) alongside CWON-produced capital NW.PCA.TO, both within-country demeaned in log space, for six representative countries. The shape of the trajectories is what has to agree if the two accounts represent the same latent stock. The United States, Korea, and Israel — three R&amp;D-intensive economies — show near-identity: the PIM series tracks CWON to within 1–2% in log terms over the full 1995–2019 window. Germany and the Netherlands show small but visible widening after 2010, consistent with the delayed SNA 2008 incorporation of R&amp;D on the CWON side. Japan is the outlier, with a gap of roughly 0.05–0.08 log units by 2019.</w:t>
+      </w:r>
+    </w:p>
+    <w:p>
+      <w:pPr>
+        <w:spacing w:after="120" w:before="0" w:line="360" w:lineRule="auto"/>
+      </w:pPr>
+      <w:r>
+        <w:rPr>
+          <w:rFonts w:ascii="Times New Roman" w:hAnsi="Times New Roman" w:eastAsia="MS Mincho"/>
+          <w:b w:val="0"/>
+          <w:i w:val="0"/>
+          <w:sz w:val="22"/>
+        </w:rPr>
+        <w:t>[Figure 3 here]</w:t>
+      </w:r>
+    </w:p>
+    <w:p>
+      <w:pPr>
+        <w:spacing w:after="120" w:before="0" w:line="360" w:lineRule="auto"/>
+      </w:pPr>
+      <w:r>
+        <w:rPr>
+          <w:rFonts w:ascii="Times New Roman" w:hAnsi="Times New Roman" w:eastAsia="MS Mincho"/>
+          <w:b w:val="0"/>
+          <w:i w:val="0"/>
+          <w:sz w:val="22"/>
+        </w:rPr>
+        <w:t>Figure 3 examines whether the Japan anomaly is driven by an asset-price revaluation effect γ_price. A γ_price ∈ [−0.04, +0.04] shifts the Japanese log-ratio by roughly 0.25 log units, implying that the observed ~0.06-log-unit gap corresponds to γ_price ≈ 0.02 per year — the order of magnitude of the Japanese land-price deflation from 1995 to 2005 (Nishimura and Saita, 2005; Hamano and Zhao, 2017). The Japan gap is therefore a revaluation artefact, not a real capital-quantity discrepancy.</w:t>
+      </w:r>
+    </w:p>
+    <w:p>
+      <w:pPr>
+        <w:spacing w:before="240" w:after="120"/>
+      </w:pPr>
+      <w:r>
+        <w:rPr>
+          <w:rFonts w:ascii="Times New Roman" w:hAnsi="Times New Roman" w:eastAsia="MS Mincho"/>
+          <w:b/>
+          <w:i w:val="0"/>
+          <w:sz w:val="22"/>
+        </w:rPr>
+        <w:t>5.4 Identification: the role of the wealth constraint</w:t>
+      </w:r>
+    </w:p>
+    <w:p>
+      <w:pPr>
+        <w:spacing w:after="120" w:before="0" w:line="360" w:lineRule="auto"/>
+      </w:pPr>
+      <w:r>
+        <w:rPr>
+          <w:rFonts w:ascii="Times New Roman" w:hAnsi="Times New Roman" w:eastAsia="MS Mincho"/>
+          <w:b w:val="0"/>
+          <w:i w:val="0"/>
+          <w:sz w:val="22"/>
+        </w:rPr>
+        <w:t>[Figure 4 here]</w:t>
+      </w:r>
+    </w:p>
+    <w:p>
+      <w:pPr>
+        <w:spacing w:after="120" w:before="0" w:line="360" w:lineRule="auto"/>
+      </w:pPr>
+      <w:r>
+        <w:rPr>
+          <w:rFonts w:ascii="Times New Roman" w:hAnsi="Times New Roman" w:eastAsia="MS Mincho"/>
+          <w:b w:val="0"/>
+          <w:i w:val="0"/>
+          <w:sz w:val="22"/>
+        </w:rPr>
+        <w:t>Bootstrap confidence intervals on the joint estimates reveal that μ and β are only weakly identified from production-side residuals alone — the median 95% interval on μ spans almost the entire grid [0.01, 6.0], and the median interval on β spans about 70% of its grid [0.0, 0.34]. Adding the wealth-side constraint tightens both substantially: joint identification rejects μ = 0 for 35 of 39 countries at 5% and β = 0 for 28 of 39 countries. This is the main contribution of the unified framework: neither production nor wealth alone pins down the structural parameters; together they do. The out-of-sample GDP prediction is not the appropriate metric for evaluating M4; the flow-stock reconciliation is.</w:t>
+      </w:r>
+    </w:p>
+    <w:p>
+      <w:pPr>
+        <w:spacing w:after="120" w:before="0" w:line="360" w:lineRule="auto"/>
+      </w:pPr>
+      <w:r>
+        <w:rPr>
+          <w:rFonts w:ascii="Times New Roman" w:hAnsi="Times New Roman" w:eastAsia="MS Mincho"/>
+          <w:b w:val="0"/>
+          <w:i w:val="0"/>
+          <w:sz w:val="22"/>
+        </w:rPr>
+        <w:t>The shape of the 95% region in (μ, β) space is strongly country-specific. For R&amp;D-intensive economies (Israel, Korea, Sweden, US) the posterior region is a tight ellipse in the north-east quadrant (μ ≥ 0.3, β ≥ 0.08). For asset-mix-stable economies (Mexico, Colombia, Turkey, Chile) the region is a wide diagonal ridge. The ridge collapses to a point only after the wealth constraint is added. Countries where the 95% region remains a broad ridge even under joint identification are those for which CWON coverage is thinner, and country-specific conclusions for those economies should be cross-checked with national-accounts micro-data.</w:t>
       </w:r>
     </w:p>
     <w:p>
@@ -1048,12 +1560,12 @@
           <w:i w:val="0"/>
           <w:sz w:val="24"/>
         </w:rPr>
-        <w:t>5.1 In-sample parameter distributions and fit</w:t>
+        <w:t>6. Discussion</w:t>
       </w:r>
     </w:p>
     <w:p>
       <w:pPr>
-        <w:spacing w:before="360" w:after="120"/>
+        <w:spacing w:before="240" w:after="120"/>
       </w:pPr>
       <w:r>
         <w:rPr>
@@ -1062,8 +1574,13 @@
           <w:i w:val="0"/>
           <w:sz w:val="22"/>
         </w:rPr>
-        <w:t>Table 1.</w:t>
+        <w:t>6.1 What the time-varying time-to-build means for the Solow residual</w:t>
       </w:r>
+    </w:p>
+    <w:p>
+      <w:pPr>
+        <w:spacing w:after="120" w:before="0" w:line="360" w:lineRule="auto"/>
+      </w:pPr>
       <w:r>
         <w:rPr>
           <w:rFonts w:ascii="Times New Roman" w:hAnsi="Times New Roman" w:eastAsia="MS Mincho"/>
@@ -1071,652 +1588,12 @@
           <w:i w:val="0"/>
           <w:sz w:val="22"/>
         </w:rPr>
-        <w:t xml:space="preserve">  M0-M4: in-sample and out-of-sample performance across 39 countries. Medians across countries; IQR in brackets.</w:t>
+        <w:t>The standard Solow decomposition attributes the residual to TFP. Under M0 (instant PIM, β = 0) any mis-specification in the timing or composition of capital flows through directly into TFP. We show that a share of Solow-residual variation across our 39 countries can be re-assigned to a time-to-build correction. This is not a claim that innovation is unimportant; it is a claim that the accounting should be cleaner before residual interpretation begins.</w:t>
       </w:r>
     </w:p>
-    <w:tbl>
-      <w:tblPr>
-        <w:tblStyle w:val="TableGrid"/>
-        <w:tblW w:type="auto" w:w="0"/>
-        <w:tblLook w:firstColumn="1" w:firstRow="1" w:lastColumn="0" w:lastRow="0" w:noHBand="0" w:noVBand="1" w:val="04A0"/>
-      </w:tblPr>
-      <w:tblGrid>
-        <w:gridCol w:w="1568"/>
-        <w:gridCol w:w="1568"/>
-        <w:gridCol w:w="1568"/>
-        <w:gridCol w:w="1568"/>
-        <w:gridCol w:w="1568"/>
-        <w:gridCol w:w="1568"/>
-      </w:tblGrid>
-      <w:tr>
-        <w:tc>
-          <w:tcPr>
-            <w:tcW w:type="dxa" w:w="1568"/>
-          </w:tcPr>
-          <w:p>
-            <w:r/>
-            <w:r>
-              <w:rPr>
-                <w:rFonts w:ascii="Times New Roman" w:hAnsi="Times New Roman" w:eastAsia="MS Mincho"/>
-                <w:b/>
-                <w:i w:val="0"/>
-                <w:sz w:val="20"/>
-              </w:rPr>
-              <w:t>Model</w:t>
-            </w:r>
-          </w:p>
-        </w:tc>
-        <w:tc>
-          <w:tcPr>
-            <w:tcW w:type="dxa" w:w="1568"/>
-          </w:tcPr>
-          <w:p>
-            <w:r/>
-            <w:r>
-              <w:rPr>
-                <w:rFonts w:ascii="Times New Roman" w:hAnsi="Times New Roman" w:eastAsia="MS Mincho"/>
-                <w:b/>
-                <w:i w:val="0"/>
-                <w:sz w:val="20"/>
-              </w:rPr>
-              <w:t>Description</w:t>
-            </w:r>
-          </w:p>
-        </w:tc>
-        <w:tc>
-          <w:tcPr>
-            <w:tcW w:type="dxa" w:w="1568"/>
-          </w:tcPr>
-          <w:p>
-            <w:r/>
-            <w:r>
-              <w:rPr>
-                <w:rFonts w:ascii="Times New Roman" w:hAnsi="Times New Roman" w:eastAsia="MS Mincho"/>
-                <w:b/>
-                <w:i w:val="0"/>
-                <w:sz w:val="20"/>
-              </w:rPr>
-              <w:t>Growth RMSE median (pp)</w:t>
-            </w:r>
-          </w:p>
-        </w:tc>
-        <w:tc>
-          <w:tcPr>
-            <w:tcW w:type="dxa" w:w="1568"/>
-          </w:tcPr>
-          <w:p>
-            <w:r/>
-            <w:r>
-              <w:rPr>
-                <w:rFonts w:ascii="Times New Roman" w:hAnsi="Times New Roman" w:eastAsia="MS Mincho"/>
-                <w:b/>
-                <w:i w:val="0"/>
-                <w:sz w:val="20"/>
-              </w:rPr>
-              <w:t>Growth RMSE IQR (pp)</w:t>
-            </w:r>
-          </w:p>
-        </w:tc>
-        <w:tc>
-          <w:tcPr>
-            <w:tcW w:type="dxa" w:w="1568"/>
-          </w:tcPr>
-          <w:p>
-            <w:r/>
-            <w:r>
-              <w:rPr>
-                <w:rFonts w:ascii="Times New Roman" w:hAnsi="Times New Roman" w:eastAsia="MS Mincho"/>
-                <w:b/>
-                <w:i w:val="0"/>
-                <w:sz w:val="20"/>
-              </w:rPr>
-              <w:t>Level MAPE median (\%)</w:t>
-            </w:r>
-          </w:p>
-        </w:tc>
-        <w:tc>
-          <w:tcPr>
-            <w:tcW w:type="dxa" w:w="1568"/>
-          </w:tcPr>
-          <w:p>
-            <w:r/>
-            <w:r>
-              <w:rPr>
-                <w:rFonts w:ascii="Times New Roman" w:hAnsi="Times New Roman" w:eastAsia="MS Mincho"/>
-                <w:b/>
-                <w:i w:val="0"/>
-                <w:sz w:val="20"/>
-              </w:rPr>
-              <w:t>OOS MAPE median (\%)</w:t>
-            </w:r>
-          </w:p>
-        </w:tc>
-      </w:tr>
-      <w:tr>
-        <w:tc>
-          <w:tcPr>
-            <w:tcW w:type="dxa" w:w="1568"/>
-          </w:tcPr>
-          <w:p>
-            <w:r/>
-            <w:r>
-              <w:rPr>
-                <w:rFonts w:ascii="Times New Roman" w:hAnsi="Times New Roman" w:eastAsia="MS Mincho"/>
-                <w:b w:val="0"/>
-                <w:i w:val="0"/>
-                <w:sz w:val="20"/>
-              </w:rPr>
-              <w:t>M0</w:t>
-            </w:r>
-          </w:p>
-        </w:tc>
-        <w:tc>
-          <w:tcPr>
-            <w:tcW w:type="dxa" w:w="1568"/>
-          </w:tcPr>
-          <w:p>
-            <w:r/>
-            <w:r>
-              <w:rPr>
-                <w:rFonts w:ascii="Times New Roman" w:hAnsi="Times New Roman" w:eastAsia="MS Mincho"/>
-                <w:b w:val="0"/>
-                <w:i w:val="0"/>
-                <w:sz w:val="20"/>
-              </w:rPr>
-              <w:t>Instant PIM (Solow baseline)</w:t>
-            </w:r>
-          </w:p>
-        </w:tc>
-        <w:tc>
-          <w:tcPr>
-            <w:tcW w:type="dxa" w:w="1568"/>
-          </w:tcPr>
-          <w:p>
-            <w:r/>
-            <w:r>
-              <w:rPr>
-                <w:rFonts w:ascii="Times New Roman" w:hAnsi="Times New Roman" w:eastAsia="MS Mincho"/>
-                <w:b w:val="0"/>
-                <w:i w:val="0"/>
-                <w:sz w:val="20"/>
-              </w:rPr>
-              <w:t>3.095</w:t>
-            </w:r>
-          </w:p>
-        </w:tc>
-        <w:tc>
-          <w:tcPr>
-            <w:tcW w:type="dxa" w:w="1568"/>
-          </w:tcPr>
-          <w:p>
-            <w:r/>
-            <w:r>
-              <w:rPr>
-                <w:rFonts w:ascii="Times New Roman" w:hAnsi="Times New Roman" w:eastAsia="MS Mincho"/>
-                <w:b w:val="0"/>
-                <w:i w:val="0"/>
-                <w:sz w:val="20"/>
-              </w:rPr>
-              <w:t>[2.03, 3.85]</w:t>
-            </w:r>
-          </w:p>
-        </w:tc>
-        <w:tc>
-          <w:tcPr>
-            <w:tcW w:type="dxa" w:w="1568"/>
-          </w:tcPr>
-          <w:p>
-            <w:r/>
-            <w:r>
-              <w:rPr>
-                <w:rFonts w:ascii="Times New Roman" w:hAnsi="Times New Roman" w:eastAsia="MS Mincho"/>
-                <w:b w:val="0"/>
-                <w:i w:val="0"/>
-                <w:sz w:val="20"/>
-              </w:rPr>
-              <w:t>4.104</w:t>
-            </w:r>
-          </w:p>
-        </w:tc>
-        <w:tc>
-          <w:tcPr>
-            <w:tcW w:type="dxa" w:w="1568"/>
-          </w:tcPr>
-          <w:p>
-            <w:r/>
-            <w:r>
-              <w:rPr>
-                <w:rFonts w:ascii="Times New Roman" w:hAnsi="Times New Roman" w:eastAsia="MS Mincho"/>
-                <w:b w:val="0"/>
-                <w:i w:val="0"/>
-                <w:sz w:val="20"/>
-              </w:rPr>
-              <w:t>4.605</w:t>
-            </w:r>
-          </w:p>
-        </w:tc>
-      </w:tr>
-      <w:tr>
-        <w:tc>
-          <w:tcPr>
-            <w:tcW w:type="dxa" w:w="1568"/>
-          </w:tcPr>
-          <w:p>
-            <w:r/>
-            <w:r>
-              <w:rPr>
-                <w:rFonts w:ascii="Times New Roman" w:hAnsi="Times New Roman" w:eastAsia="MS Mincho"/>
-                <w:b w:val="0"/>
-                <w:i w:val="0"/>
-                <w:sz w:val="20"/>
-              </w:rPr>
-              <w:t>M1</w:t>
-            </w:r>
-          </w:p>
-        </w:tc>
-        <w:tc>
-          <w:tcPr>
-            <w:tcW w:type="dxa" w:w="1568"/>
-          </w:tcPr>
-          <w:p>
-            <w:r/>
-            <w:r>
-              <w:rPr>
-                <w:rFonts w:ascii="Times New Roman" w:hAnsi="Times New Roman" w:eastAsia="MS Mincho"/>
-                <w:b w:val="0"/>
-                <w:i w:val="0"/>
-                <w:sz w:val="20"/>
-              </w:rPr>
-              <w:t>Constant lag $\mu^\star$</w:t>
-            </w:r>
-          </w:p>
-        </w:tc>
-        <w:tc>
-          <w:tcPr>
-            <w:tcW w:type="dxa" w:w="1568"/>
-          </w:tcPr>
-          <w:p>
-            <w:r/>
-            <w:r>
-              <w:rPr>
-                <w:rFonts w:ascii="Times New Roman" w:hAnsi="Times New Roman" w:eastAsia="MS Mincho"/>
-                <w:b w:val="0"/>
-                <w:i w:val="0"/>
-                <w:sz w:val="20"/>
-              </w:rPr>
-              <w:t>3.087</w:t>
-            </w:r>
-          </w:p>
-        </w:tc>
-        <w:tc>
-          <w:tcPr>
-            <w:tcW w:type="dxa" w:w="1568"/>
-          </w:tcPr>
-          <w:p>
-            <w:r/>
-            <w:r>
-              <w:rPr>
-                <w:rFonts w:ascii="Times New Roman" w:hAnsi="Times New Roman" w:eastAsia="MS Mincho"/>
-                <w:b w:val="0"/>
-                <w:i w:val="0"/>
-                <w:sz w:val="20"/>
-              </w:rPr>
-              <w:t>[2.01, 3.74]</w:t>
-            </w:r>
-          </w:p>
-        </w:tc>
-        <w:tc>
-          <w:tcPr>
-            <w:tcW w:type="dxa" w:w="1568"/>
-          </w:tcPr>
-          <w:p>
-            <w:r/>
-            <w:r>
-              <w:rPr>
-                <w:rFonts w:ascii="Times New Roman" w:hAnsi="Times New Roman" w:eastAsia="MS Mincho"/>
-                <w:b w:val="0"/>
-                <w:i w:val="0"/>
-                <w:sz w:val="20"/>
-              </w:rPr>
-              <w:t>4.105</w:t>
-            </w:r>
-          </w:p>
-        </w:tc>
-        <w:tc>
-          <w:tcPr>
-            <w:tcW w:type="dxa" w:w="1568"/>
-          </w:tcPr>
-          <w:p>
-            <w:r/>
-            <w:r>
-              <w:rPr>
-                <w:rFonts w:ascii="Times New Roman" w:hAnsi="Times New Roman" w:eastAsia="MS Mincho"/>
-                <w:b w:val="0"/>
-                <w:i w:val="0"/>
-                <w:sz w:val="20"/>
-              </w:rPr>
-              <w:t>4.058</w:t>
-            </w:r>
-          </w:p>
-        </w:tc>
-      </w:tr>
-      <w:tr>
-        <w:tc>
-          <w:tcPr>
-            <w:tcW w:type="dxa" w:w="1568"/>
-          </w:tcPr>
-          <w:p>
-            <w:r/>
-            <w:r>
-              <w:rPr>
-                <w:rFonts w:ascii="Times New Roman" w:hAnsi="Times New Roman" w:eastAsia="MS Mincho"/>
-                <w:b w:val="0"/>
-                <w:i w:val="0"/>
-                <w:sz w:val="20"/>
-              </w:rPr>
-              <w:t>M2</w:t>
-            </w:r>
-          </w:p>
-        </w:tc>
-        <w:tc>
-          <w:tcPr>
-            <w:tcW w:type="dxa" w:w="1568"/>
-          </w:tcPr>
-          <w:p>
-            <w:r/>
-            <w:r>
-              <w:rPr>
-                <w:rFonts w:ascii="Times New Roman" w:hAnsi="Times New Roman" w:eastAsia="MS Mincho"/>
-                <w:b w:val="0"/>
-                <w:i w:val="0"/>
-                <w:sz w:val="20"/>
-              </w:rPr>
-              <w:t>Time-varying lag $\mu(t)=\mu_0+\mu_1(t-t_0)$</w:t>
-            </w:r>
-          </w:p>
-        </w:tc>
-        <w:tc>
-          <w:tcPr>
-            <w:tcW w:type="dxa" w:w="1568"/>
-          </w:tcPr>
-          <w:p>
-            <w:r/>
-            <w:r>
-              <w:rPr>
-                <w:rFonts w:ascii="Times New Roman" w:hAnsi="Times New Roman" w:eastAsia="MS Mincho"/>
-                <w:b w:val="0"/>
-                <w:i w:val="0"/>
-                <w:sz w:val="20"/>
-              </w:rPr>
-              <w:t>3.065</w:t>
-            </w:r>
-          </w:p>
-        </w:tc>
-        <w:tc>
-          <w:tcPr>
-            <w:tcW w:type="dxa" w:w="1568"/>
-          </w:tcPr>
-          <w:p>
-            <w:r/>
-            <w:r>
-              <w:rPr>
-                <w:rFonts w:ascii="Times New Roman" w:hAnsi="Times New Roman" w:eastAsia="MS Mincho"/>
-                <w:b w:val="0"/>
-                <w:i w:val="0"/>
-                <w:sz w:val="20"/>
-              </w:rPr>
-              <w:t>[2.01, 3.73]</w:t>
-            </w:r>
-          </w:p>
-        </w:tc>
-        <w:tc>
-          <w:tcPr>
-            <w:tcW w:type="dxa" w:w="1568"/>
-          </w:tcPr>
-          <w:p>
-            <w:r/>
-            <w:r>
-              <w:rPr>
-                <w:rFonts w:ascii="Times New Roman" w:hAnsi="Times New Roman" w:eastAsia="MS Mincho"/>
-                <w:b w:val="0"/>
-                <w:i w:val="0"/>
-                <w:sz w:val="20"/>
-              </w:rPr>
-              <w:t>4.189</w:t>
-            </w:r>
-          </w:p>
-        </w:tc>
-        <w:tc>
-          <w:tcPr>
-            <w:tcW w:type="dxa" w:w="1568"/>
-          </w:tcPr>
-          <w:p>
-            <w:r/>
-            <w:r>
-              <w:rPr>
-                <w:rFonts w:ascii="Times New Roman" w:hAnsi="Times New Roman" w:eastAsia="MS Mincho"/>
-                <w:b w:val="0"/>
-                <w:i w:val="0"/>
-                <w:sz w:val="20"/>
-              </w:rPr>
-              <w:t>3.986</w:t>
-            </w:r>
-          </w:p>
-        </w:tc>
-      </w:tr>
-      <w:tr>
-        <w:tc>
-          <w:tcPr>
-            <w:tcW w:type="dxa" w:w="1568"/>
-          </w:tcPr>
-          <w:p>
-            <w:r/>
-            <w:r>
-              <w:rPr>
-                <w:rFonts w:ascii="Times New Roman" w:hAnsi="Times New Roman" w:eastAsia="MS Mincho"/>
-                <w:b w:val="0"/>
-                <w:i w:val="0"/>
-                <w:sz w:val="20"/>
-              </w:rPr>
-              <w:t>M3</w:t>
-            </w:r>
-          </w:p>
-        </w:tc>
-        <w:tc>
-          <w:tcPr>
-            <w:tcW w:type="dxa" w:w="1568"/>
-          </w:tcPr>
-          <w:p>
-            <w:r/>
-            <w:r>
-              <w:rPr>
-                <w:rFonts w:ascii="Times New Roman" w:hAnsi="Times New Roman" w:eastAsia="MS Mincho"/>
-                <w:b w:val="0"/>
-                <w:i w:val="0"/>
-                <w:sz w:val="20"/>
-              </w:rPr>
-              <w:t>Instant PIM + intangible $K_I$</w:t>
-            </w:r>
-          </w:p>
-        </w:tc>
-        <w:tc>
-          <w:tcPr>
-            <w:tcW w:type="dxa" w:w="1568"/>
-          </w:tcPr>
-          <w:p>
-            <w:r/>
-            <w:r>
-              <w:rPr>
-                <w:rFonts w:ascii="Times New Roman" w:hAnsi="Times New Roman" w:eastAsia="MS Mincho"/>
-                <w:b w:val="0"/>
-                <w:i w:val="0"/>
-                <w:sz w:val="20"/>
-              </w:rPr>
-              <w:t>3.095</w:t>
-            </w:r>
-          </w:p>
-        </w:tc>
-        <w:tc>
-          <w:tcPr>
-            <w:tcW w:type="dxa" w:w="1568"/>
-          </w:tcPr>
-          <w:p>
-            <w:r/>
-            <w:r>
-              <w:rPr>
-                <w:rFonts w:ascii="Times New Roman" w:hAnsi="Times New Roman" w:eastAsia="MS Mincho"/>
-                <w:b w:val="0"/>
-                <w:i w:val="0"/>
-                <w:sz w:val="20"/>
-              </w:rPr>
-              <w:t>[2.01, 3.82]</w:t>
-            </w:r>
-          </w:p>
-        </w:tc>
-        <w:tc>
-          <w:tcPr>
-            <w:tcW w:type="dxa" w:w="1568"/>
-          </w:tcPr>
-          <w:p>
-            <w:r/>
-            <w:r>
-              <w:rPr>
-                <w:rFonts w:ascii="Times New Roman" w:hAnsi="Times New Roman" w:eastAsia="MS Mincho"/>
-                <w:b w:val="0"/>
-                <w:i w:val="0"/>
-                <w:sz w:val="20"/>
-              </w:rPr>
-              <w:t>4.068</w:t>
-            </w:r>
-          </w:p>
-        </w:tc>
-        <w:tc>
-          <w:tcPr>
-            <w:tcW w:type="dxa" w:w="1568"/>
-          </w:tcPr>
-          <w:p>
-            <w:r/>
-            <w:r>
-              <w:rPr>
-                <w:rFonts w:ascii="Times New Roman" w:hAnsi="Times New Roman" w:eastAsia="MS Mincho"/>
-                <w:b w:val="0"/>
-                <w:i w:val="0"/>
-                <w:sz w:val="20"/>
-              </w:rPr>
-              <w:t>4.722</w:t>
-            </w:r>
-          </w:p>
-        </w:tc>
-      </w:tr>
-      <w:tr>
-        <w:tc>
-          <w:tcPr>
-            <w:tcW w:type="dxa" w:w="1568"/>
-          </w:tcPr>
-          <w:p>
-            <w:r/>
-            <w:r>
-              <w:rPr>
-                <w:rFonts w:ascii="Times New Roman" w:hAnsi="Times New Roman" w:eastAsia="MS Mincho"/>
-                <w:b w:val="0"/>
-                <w:i w:val="0"/>
-                <w:sz w:val="20"/>
-              </w:rPr>
-              <w:t>M4</w:t>
-            </w:r>
-          </w:p>
-        </w:tc>
-        <w:tc>
-          <w:tcPr>
-            <w:tcW w:type="dxa" w:w="1568"/>
-          </w:tcPr>
-          <w:p>
-            <w:r/>
-            <w:r>
-              <w:rPr>
-                <w:rFonts w:ascii="Times New Roman" w:hAnsi="Times New Roman" w:eastAsia="MS Mincho"/>
-                <w:b w:val="0"/>
-                <w:i w:val="0"/>
-                <w:sz w:val="20"/>
-              </w:rPr>
-              <w:t>Joint tempo+intangible (GDP \&amp; CWON)</w:t>
-            </w:r>
-          </w:p>
-        </w:tc>
-        <w:tc>
-          <w:tcPr>
-            <w:tcW w:type="dxa" w:w="1568"/>
-          </w:tcPr>
-          <w:p>
-            <w:r/>
-            <w:r>
-              <w:rPr>
-                <w:rFonts w:ascii="Times New Roman" w:hAnsi="Times New Roman" w:eastAsia="MS Mincho"/>
-                <w:b w:val="0"/>
-                <w:i w:val="0"/>
-                <w:sz w:val="20"/>
-              </w:rPr>
-              <w:t>3.078</w:t>
-            </w:r>
-          </w:p>
-        </w:tc>
-        <w:tc>
-          <w:tcPr>
-            <w:tcW w:type="dxa" w:w="1568"/>
-          </w:tcPr>
-          <w:p>
-            <w:r/>
-            <w:r>
-              <w:rPr>
-                <w:rFonts w:ascii="Times New Roman" w:hAnsi="Times New Roman" w:eastAsia="MS Mincho"/>
-                <w:b w:val="0"/>
-                <w:i w:val="0"/>
-                <w:sz w:val="20"/>
-              </w:rPr>
-              <w:t>[2.08, 3.82]</w:t>
-            </w:r>
-          </w:p>
-        </w:tc>
-        <w:tc>
-          <w:tcPr>
-            <w:tcW w:type="dxa" w:w="1568"/>
-          </w:tcPr>
-          <w:p>
-            <w:r/>
-            <w:r>
-              <w:rPr>
-                <w:rFonts w:ascii="Times New Roman" w:hAnsi="Times New Roman" w:eastAsia="MS Mincho"/>
-                <w:b w:val="0"/>
-                <w:i w:val="0"/>
-                <w:sz w:val="20"/>
-              </w:rPr>
-              <w:t>4.062</w:t>
-            </w:r>
-          </w:p>
-        </w:tc>
-        <w:tc>
-          <w:tcPr>
-            <w:tcW w:type="dxa" w:w="1568"/>
-          </w:tcPr>
-          <w:p>
-            <w:r/>
-            <w:r>
-              <w:rPr>
-                <w:rFonts w:ascii="Times New Roman" w:hAnsi="Times New Roman" w:eastAsia="MS Mincho"/>
-                <w:b w:val="0"/>
-                <w:i w:val="0"/>
-                <w:sz w:val="20"/>
-              </w:rPr>
-              <w:t>4.606</w:t>
-            </w:r>
-          </w:p>
-        </w:tc>
-      </w:tr>
-    </w:tbl>
     <w:p>
       <w:pPr>
-        <w:spacing w:after="120" w:line="360" w:lineRule="auto"/>
-        <w:ind w:firstLine="240"/>
+        <w:spacing w:after="120" w:before="0" w:line="360" w:lineRule="auto"/>
       </w:pPr>
       <w:r>
         <w:rPr>
@@ -1725,7 +1602,245 @@
           <w:i w:val="0"/>
           <w:sz w:val="22"/>
         </w:rPr>
-        <w:t>Table 1 summarises the five models. Three facts deserve particular emphasis. First, the median in-sample growth-rate RMSE hardly moves across M0-M4 (3.07-3.10 pp). This is what standard Solow-accounting practitioners have found repeatedly when they experimented with alternative capital constructions (Jorgenson and Griliches, 1967; Hulten, 1992), and it is one reason why the profession has settled on M0 as the canonical baseline: within-sample growth-rate fit does not discipline μ at all. Second, the median level MAPE under M0 is 4.10 %, meaning that a carefully re-estimated TFP trajectory can absorb nearly all of a 4 % miscalibration in the capital stock at every point in time while preserving the first-differenced fit. This perfectly illustrates the warning of Griliches (1996) that "TFP is the measure of our ignorance": any capital mis-specification that varies on decade-scale time-frequencies will be silently reabsorbed into decade-scale TFP, and then re-interpreted as innovation. Third, and most importantly for the method developed here, the distribution of estimated μ across the 39 countries is highly non-degenerate. The interquartile range under M1 runs from below 0.1 years to above 1.2 years, and the tempo drift μ₁ under M2 has an IQR that includes both substantially negative and substantially positive values. The universal-μ assumption implicit in M0 is therefore not merely statistically violated — it is violated in both directions across the sample, which implies that any single-parameter global correction (including the 5-year or 10-year fixed lags popular in business-cycle calibration) will be biased in roughly half of the sample. The median country has a M1 constant lag μ\ ≈ 0.3 years and a M2 tempo drift μ₁ close to zero on average but with wide dispersion across countries (IQR roughly [−0.02, +0.05]). Median intangible share β under M3 is about 0.06 for production-only fitting and 0.06 under joint identification with CWON (M4). The in-sample growth-rate RMSE is statistically indistinguishable across M0–M4 at the median (all within 3.07–3.10 pp), confirming that the production function is close to flat in μ when evaluated only on in-sample growth-rate residuals, as Koeva (2000) also found. In-sample level MAPE improves monotonically from M0 (4.10 %) to M4 (4.06 %). These apparently small in-sample differences conceal much larger out-of-sample differences, which we turn to next.</w:t>
+        <w:t>At the same time, the results of Section 5.2 impose caution. The improvement in out-of-sample fit from M0 to M1 (4.60% → 4.06%) is larger than the incremental gain from M1 to M2 (4.06% → 3.99%), and M1a (AR(1) lag, 4.10%) achieves similar performance without the geometric kernel. The practical implication is that any positive time-to-build specification improves predictions, but the precise functional form of the lag distribution is of second-order importance. Researchers who prefer a simpler fixed-lag adjustment over a drifting one will capture most of the benefit.</w:t>
+      </w:r>
+    </w:p>
+    <w:p>
+      <w:pPr>
+        <w:spacing w:before="240" w:after="120"/>
+      </w:pPr>
+      <w:r>
+        <w:rPr>
+          <w:rFonts w:ascii="Times New Roman" w:hAnsi="Times New Roman" w:eastAsia="MS Mincho"/>
+          <w:b/>
+          <w:i w:val="0"/>
+          <w:sz w:val="22"/>
+        </w:rPr>
+        <w:t>6.2 The demographic analogy: where it holds and where it does not</w:t>
+      </w:r>
+    </w:p>
+    <w:p>
+      <w:pPr>
+        <w:spacing w:after="120" w:before="0" w:line="360" w:lineRule="auto"/>
+      </w:pPr>
+      <w:r>
+        <w:rPr>
+          <w:rFonts w:ascii="Times New Roman" w:hAnsi="Times New Roman" w:eastAsia="MS Mincho"/>
+          <w:b w:val="0"/>
+          <w:i w:val="0"/>
+          <w:sz w:val="22"/>
+        </w:rPr>
+        <w:t>The heuristic analogy to Bongaarts-Feeney (1998) and Goldstein-Lutz-Scherbov (2003) served as the motivation for this paper, and we have used demographic vocabulary ("tempo", "forgotten parameter") throughout. We now offer an explicit assessment of where the analogy is useful and where it is misleading.</w:t>
+      </w:r>
+    </w:p>
+    <w:p>
+      <w:pPr>
+        <w:spacing w:after="120" w:before="0" w:line="360" w:lineRule="auto"/>
+      </w:pPr>
+      <w:r>
+        <w:rPr>
+          <w:rFonts w:ascii="Times New Roman" w:hAnsi="Times New Roman" w:eastAsia="MS Mincho"/>
+          <w:b w:val="0"/>
+          <w:i w:val="0"/>
+          <w:sz w:val="22"/>
+        </w:rPr>
+        <w:t>Where the analogy holds. Both demography and capital accounting face a flow statistic (period TFR; GDP) that depends on a stock process (population; capital) through a timing kernel whose mean drifts. Both fields have a single omitted quantity parameter (parity-specific variance σ; intangible share β) that, when re-introduced, improves the consistency between alternative measurements of the same underlying stock. Both fields benefit from a parametric decomposition that separates timing drift from quantity adjustment.</w:t>
+      </w:r>
+    </w:p>
+    <w:p>
+      <w:pPr>
+        <w:spacing w:after="120" w:before="0" w:line="360" w:lineRule="auto"/>
+      </w:pPr>
+      <w:r>
+        <w:rPr>
+          <w:rFonts w:ascii="Times New Roman" w:hAnsi="Times New Roman" w:eastAsia="MS Mincho"/>
+          <w:b w:val="0"/>
+          <w:i w:val="0"/>
+          <w:sz w:val="22"/>
+        </w:rPr>
+        <w:t>Where the analogy breaks down. (i) The demographic tempo effect is a compositional bias: a rising mean age at childbearing mechanically depresses period TFR even when cohort fertility is unchanged, because births are spread over a longer interval. The capital-accounting time-to-build is a gestation lag: investment takes time to become productive, which is a technological constraint rather than a compositional artifact. (ii) The demographic "forgotten parameter" σ captures unobserved heterogeneity in parity progression; the intangible share β captures a real produced asset that is excluded from the production function. σ is a statistical variance; β is an output share. (iii) Capital stocks depreciate via δ_t, which itself is an estimated quantity in PWT (Inklaar and Timmer, 2013) and may drift over time, whereas demographic stocks depreciate via well-measured mortality rates. A drifting δ_t could absorb some of what we attribute to μ(t), and disentangling these two drifts requires auxiliary data not uniformly available.</w:t>
+      </w:r>
+    </w:p>
+    <w:p>
+      <w:pPr>
+        <w:spacing w:after="120" w:before="0" w:line="360" w:lineRule="auto"/>
+      </w:pPr>
+      <w:r>
+        <w:rPr>
+          <w:rFonts w:ascii="Times New Roman" w:hAnsi="Times New Roman" w:eastAsia="MS Mincho"/>
+          <w:b w:val="0"/>
+          <w:i w:val="0"/>
+          <w:sz w:val="22"/>
+        </w:rPr>
+        <w:t>We retain the demographic vocabulary for readability and because it generates useful hypotheses, but we emphasise that the capital-accounting corrections are economically distinct from their demographic analogues and must be validated on their own terms.</w:t>
+      </w:r>
+    </w:p>
+    <w:p>
+      <w:pPr>
+        <w:spacing w:before="240" w:after="120"/>
+      </w:pPr>
+      <w:r>
+        <w:rPr>
+          <w:rFonts w:ascii="Times New Roman" w:hAnsi="Times New Roman" w:eastAsia="MS Mincho"/>
+          <w:b/>
+          <w:i w:val="0"/>
+          <w:sz w:val="22"/>
+        </w:rPr>
+        <w:t>6.3 Flow–stock reconciliation and Beyond-GDP</w:t>
+      </w:r>
+    </w:p>
+    <w:p>
+      <w:pPr>
+        <w:spacing w:after="120" w:before="0" w:line="360" w:lineRule="auto"/>
+      </w:pPr>
+      <w:r>
+        <w:rPr>
+          <w:rFonts w:ascii="Times New Roman" w:hAnsi="Times New Roman" w:eastAsia="MS Mincho"/>
+          <w:b w:val="0"/>
+          <w:i w:val="0"/>
+          <w:sz w:val="22"/>
+        </w:rPr>
+        <w:t>The Beyond-GDP programme has spent twenty years arguing that flow measures (GDP) should be replaced or augmented by stock measures (IWI, CWON, SEEA). Our results suggest a more constructive synthesis: flow and stock measures can be reconciled by parameterising the accumulation identity that links them. When μ(t) and β are jointly identified, the PIM stock and the CWON produced-capital series agree to within 1–2% for most advanced economies (Section 5.3). This suggests that the practical route to Beyond-GDP is not to abandon the flow account but to audit it for mis-specified timing and omitted assets — just as the period total fertility rate was audited in the late 1990s.</w:t>
+      </w:r>
+    </w:p>
+    <w:p>
+      <w:pPr>
+        <w:spacing w:after="120" w:before="0" w:line="360" w:lineRule="auto"/>
+      </w:pPr>
+      <w:r>
+        <w:rPr>
+          <w:rFonts w:ascii="Times New Roman" w:hAnsi="Times New Roman" w:eastAsia="MS Mincho"/>
+          <w:b w:val="0"/>
+          <w:i w:val="0"/>
+          <w:sz w:val="22"/>
+        </w:rPr>
+        <w:t>Three implications follow. First, the argument that flow and stock accounts are irreconcilable is not supported by the data once both are parameterised consistently. Second, composite indices that combine produced, human, and natural capital into a single headline number are premature until the component-by-component reconciliation of produced capital accounts has been resolved. Third, the demographic-tempo literature evolved from a one-parameter to a multi-parameter framework over a decade (Bongaarts and Feeney, 1998; Goldstein et al., 2003; Bongaarts and Sobotka, 2012). Capital-accounting time-to-build correction is at the same early stage: the one-parameter version here is not the last word, and further parameters — asset-class heterogeneity in μ, time-varying β, interactions between μ and δ — are the natural next layer.</w:t>
+      </w:r>
+    </w:p>
+    <w:p>
+      <w:pPr>
+        <w:spacing w:before="240" w:after="120"/>
+      </w:pPr>
+      <w:r>
+        <w:rPr>
+          <w:rFonts w:ascii="Times New Roman" w:hAnsi="Times New Roman" w:eastAsia="MS Mincho"/>
+          <w:b/>
+          <w:i w:val="0"/>
+          <w:sz w:val="22"/>
+        </w:rPr>
+        <w:t>6.4 Extensions to other domains</w:t>
+      </w:r>
+    </w:p>
+    <w:p>
+      <w:pPr>
+        <w:spacing w:after="120" w:before="0" w:line="360" w:lineRule="auto"/>
+      </w:pPr>
+      <w:r>
+        <w:rPr>
+          <w:rFonts w:ascii="Times New Roman" w:hAnsi="Times New Roman" w:eastAsia="MS Mincho"/>
+          <w:b w:val="0"/>
+          <w:i w:val="0"/>
+          <w:sz w:val="22"/>
+        </w:rPr>
+        <w:t>The same approach — a time-varying timing parameter plus an omitted stock — extends naturally to health expenditure, where the lag from expenditure to life-expectancy outcomes has been rising (companion paper, in preparation), and potentially to human capital and climate adaptation capital. We mention these extensions briefly to indicate the breadth of the framework, but they are not contributions of the present paper.</w:t>
+      </w:r>
+    </w:p>
+    <w:p>
+      <w:pPr>
+        <w:spacing w:before="240" w:after="120"/>
+      </w:pPr>
+      <w:r>
+        <w:rPr>
+          <w:rFonts w:ascii="Times New Roman" w:hAnsi="Times New Roman" w:eastAsia="MS Mincho"/>
+          <w:b/>
+          <w:i w:val="0"/>
+          <w:sz w:val="22"/>
+        </w:rPr>
+        <w:t>6.5 Limitations</w:t>
+      </w:r>
+    </w:p>
+    <w:p>
+      <w:pPr>
+        <w:spacing w:after="120" w:before="0" w:line="360" w:lineRule="auto"/>
+      </w:pPr>
+      <w:r>
+        <w:rPr>
+          <w:rFonts w:ascii="Times New Roman" w:hAnsi="Times New Roman" w:eastAsia="MS Mincho"/>
+          <w:b w:val="0"/>
+          <w:i w:val="0"/>
+          <w:sz w:val="22"/>
+        </w:rPr>
+        <w:t>Several caveats apply, and we state them explicitly to guide future work.</w:t>
+      </w:r>
+    </w:p>
+    <w:p>
+      <w:pPr>
+        <w:spacing w:after="120" w:before="0" w:line="360" w:lineRule="auto"/>
+      </w:pPr>
+      <w:r>
+        <w:rPr>
+          <w:rFonts w:ascii="Times New Roman" w:hAnsi="Times New Roman" w:eastAsia="MS Mincho"/>
+          <w:b w:val="0"/>
+          <w:i w:val="0"/>
+          <w:sz w:val="22"/>
+        </w:rPr>
+        <w:t>Aggregate versus asset-specific lags. Our μ(t) collapses potentially heterogeneous asset-level lags into a single parameter. If short-lived equipment and long-lived structures have diverging lag trends (OECD, 2009, Chap. 5), the aggregate trend may mask offsetting compositional shifts. An asset-disaggregated version of our framework, along the lines of the OECD PIM manuals, would be a natural extension.</w:t>
+      </w:r>
+    </w:p>
+    <w:p>
+      <w:pPr>
+        <w:spacing w:after="120" w:before="0" w:line="360" w:lineRule="auto"/>
+      </w:pPr>
+      <w:r>
+        <w:rPr>
+          <w:rFonts w:ascii="Times New Roman" w:hAnsi="Times New Roman" w:eastAsia="MS Mincho"/>
+          <w:b w:val="0"/>
+          <w:i w:val="0"/>
+          <w:sz w:val="22"/>
+        </w:rPr>
+        <w:t>Identification of β. Our β is identified against CWON produced-capital, which combines national sources of heterogeneous quality. The treatment of land and sub-soil assets differs materially between Europe and the United States (Lange et al., 2018, Chap. 2), and the Japan gap is partly attributable to land-price revaluations that CWON carries but our PIM construction does not.</w:t>
+      </w:r>
+    </w:p>
+    <w:p>
+      <w:pPr>
+        <w:spacing w:after="120" w:before="0" w:line="360" w:lineRule="auto"/>
+      </w:pPr>
+      <w:r>
+        <w:rPr>
+          <w:rFonts w:ascii="Times New Roman" w:hAnsi="Times New Roman" w:eastAsia="MS Mincho"/>
+          <w:b w:val="0"/>
+          <w:i w:val="0"/>
+          <w:sz w:val="22"/>
+        </w:rPr>
+        <w:t>The role of δ. The depreciation rate δ_t is itself a derived estimate in PWT and is known to be imprecisely measured in transition economies (Inklaar and Timmer, 2013). If the true δ is drifting, some of what we attribute to μ(t) could be absorbed by δ(t). Disentangling these requires auxiliary data on capacity utilisation and asset retirements.</w:t>
+      </w:r>
+    </w:p>
+    <w:p>
+      <w:pPr>
+        <w:spacing w:after="120" w:before="0" w:line="360" w:lineRule="auto"/>
+      </w:pPr>
+      <w:r>
+        <w:rPr>
+          <w:rFonts w:ascii="Times New Roman" w:hAnsi="Times New Roman" w:eastAsia="MS Mincho"/>
+          <w:b w:val="0"/>
+          <w:i w:val="0"/>
+          <w:sz w:val="22"/>
+        </w:rPr>
+        <w:t>Sample size and identification. The bootstrap CIs (Section 5.4) are wide for countries with short series or volatile investment. The framework provides interval estimates and a direction, but country-specific policy conclusions should be cross-checked with national-accounts micro-data.</w:t>
+      </w:r>
+    </w:p>
+    <w:p>
+      <w:pPr>
+        <w:spacing w:after="120" w:before="0" w:line="360" w:lineRule="auto"/>
+      </w:pPr>
+      <w:r>
+        <w:rPr>
+          <w:rFonts w:ascii="Times New Roman" w:hAnsi="Times New Roman" w:eastAsia="MS Mincho"/>
+          <w:b w:val="0"/>
+          <w:i w:val="0"/>
+          <w:sz w:val="22"/>
+        </w:rPr>
+        <w:t>γ_price treatment. The price-revaluation experiment (Section 5.3) uses a single country-level scalar; a more careful treatment would use sector-specific deflators and Tornqvist chained price indices for intangibles (Jorgenson et al., 2018), and is left to future work.</w:t>
       </w:r>
     </w:p>
     <w:p>
@@ -1739,53 +1854,110 @@
           <w:i w:val="0"/>
           <w:sz w:val="24"/>
         </w:rPr>
-        <w:t>5.2 Out-of-sample prediction gains from the tempo correction</w:t>
+        <w:t>7. Conclusion</w:t>
       </w:r>
     </w:p>
     <w:p>
       <w:pPr>
-        <w:spacing w:before="360" w:after="120"/>
-        <w:jc w:val="center"/>
+        <w:spacing w:after="120" w:before="0" w:line="360" w:lineRule="auto"/>
       </w:pPr>
       <w:r>
-        <w:drawing>
-          <wp:inline xmlns:a="http://schemas.openxmlformats.org/drawingml/2006/main" xmlns:pic="http://schemas.openxmlformats.org/drawingml/2006/picture">
-            <wp:extent cx="5669280" cy="4638502"/>
-            <wp:docPr id="1" name="Picture 1"/>
-            <wp:cNvGraphicFramePr>
-              <a:graphicFrameLocks noChangeAspect="1"/>
-            </wp:cNvGraphicFramePr>
-            <a:graphic>
-              <a:graphicData uri="http://schemas.openxmlformats.org/drawingml/2006/picture">
-                <pic:pic>
-                  <pic:nvPicPr>
-                    <pic:cNvPr id="0" name="fig1_m_ranking_en.png"/>
-                    <pic:cNvPicPr/>
-                  </pic:nvPicPr>
-                  <pic:blipFill>
-                    <a:blip r:embed="rId9"/>
-                    <a:stretch>
-                      <a:fillRect/>
-                    </a:stretch>
-                  </pic:blipFill>
-                  <pic:spPr>
-                    <a:xfrm>
-                      <a:off x="0" y="0"/>
-                      <a:ext cx="5669280" cy="4638502"/>
-                    </a:xfrm>
-                    <a:prstGeom prst="rect"/>
-                  </pic:spPr>
-                </pic:pic>
-              </a:graphicData>
-            </a:graphic>
-          </wp:inline>
-        </w:drawing>
+        <w:rPr>
+          <w:rFonts w:ascii="Times New Roman" w:hAnsi="Times New Roman" w:eastAsia="MS Mincho"/>
+          <w:b w:val="0"/>
+          <w:i w:val="0"/>
+          <w:sz w:val="22"/>
+        </w:rPr>
+        <w:t>This paper has examined two specification choices in the standard perpetual inventory method for capital accounting: the assumption of zero time-to-build (instantaneous investment) and the exclusion of intangible capital. Across 39 OECD and middle-income economies, we find the following.</w:t>
       </w:r>
     </w:p>
     <w:p>
       <w:pPr>
-        <w:spacing w:after="240"/>
-        <w:jc w:val="center"/>
+        <w:spacing w:after="120" w:before="0" w:line="360" w:lineRule="auto"/>
+      </w:pPr>
+      <w:r>
+        <w:rPr>
+          <w:rFonts w:ascii="Times New Roman" w:hAnsi="Times New Roman" w:eastAsia="MS Mincho"/>
+          <w:b w:val="0"/>
+          <w:i w:val="0"/>
+          <w:sz w:val="22"/>
+        </w:rPr>
+        <w:t>First, allowing a positive time-to-build — whether constant or time-varying — reduces the median out-of-sample GDP level forecast error from 4.60% to approximately 4.0%, a 12–13% relative improvement. The bulk of this gain comes from recognising that investment has a lag, not from the time variation in the lag. A simple AR(1) distributed lag (M1a) achieves comparable performance, suggesting that the precise functional form is of second-order importance.</w:t>
+      </w:r>
+    </w:p>
+    <w:p>
+      <w:pPr>
+        <w:spacing w:after="120" w:before="0" w:line="360" w:lineRule="auto"/>
+      </w:pPr>
+      <w:r>
+        <w:rPr>
+          <w:rFonts w:ascii="Times New Roman" w:hAnsi="Times New Roman" w:eastAsia="MS Mincho"/>
+          <w:b w:val="0"/>
+          <w:i w:val="0"/>
+          <w:sz w:val="22"/>
+        </w:rPr>
+        <w:t>Second, adding intangible capital alone does not improve out-of-sample GDP prediction (M3, MAPE 4.72%), and the joint identification of time-to-build and intangibles (M4) does not improve over the constant-lag specification in terms of forecast accuracy. The value of the joint framework lies instead in flow-stock reconciliation: when μ and β are jointly identified against both production data and wealth data, the PIM stock and the CWON produced-capital series agree to within 1–2% for most advanced economies.</w:t>
+      </w:r>
+    </w:p>
+    <w:p>
+      <w:pPr>
+        <w:spacing w:after="120" w:before="0" w:line="360" w:lineRule="auto"/>
+      </w:pPr>
+      <w:r>
+        <w:rPr>
+          <w:rFonts w:ascii="Times New Roman" w:hAnsi="Times New Roman" w:eastAsia="MS Mincho"/>
+          <w:b w:val="0"/>
+          <w:i w:val="0"/>
+          <w:sz w:val="22"/>
+        </w:rPr>
+        <w:t>Third, neither μ nor β is well identified from production-side residuals alone. The wealth-side constraint is essential for pinning down both parameters, which is the primary methodological contribution of the unified framework.</w:t>
+      </w:r>
+    </w:p>
+    <w:p>
+      <w:pPr>
+        <w:spacing w:after="120" w:before="0" w:line="360" w:lineRule="auto"/>
+      </w:pPr>
+      <w:r>
+        <w:rPr>
+          <w:rFonts w:ascii="Times New Roman" w:hAnsi="Times New Roman" w:eastAsia="MS Mincho"/>
+          <w:b w:val="0"/>
+          <w:i w:val="0"/>
+          <w:sz w:val="22"/>
+        </w:rPr>
+        <w:t>The heuristic analogy to demographic tempo effects (Bongaarts-Feeney, Goldstein-Lutz-Scherbov) motivated the joint treatment of these parameters. We have been explicit about where the analogy holds (both fields face a flow statistic contaminated by drift in a timing kernel) and where it breaks down (time-to-build is a gestation lag, not a compositional bias; intangible capital is a real produced asset, not a statistical variance).</w:t>
+      </w:r>
+    </w:p>
+    <w:p>
+      <w:pPr>
+        <w:spacing w:after="120" w:before="0" w:line="360" w:lineRule="auto"/>
+      </w:pPr>
+      <w:r>
+        <w:rPr>
+          <w:rFonts w:ascii="Times New Roman" w:hAnsi="Times New Roman" w:eastAsia="MS Mincho"/>
+          <w:b w:val="0"/>
+          <w:i w:val="0"/>
+          <w:sz w:val="22"/>
+        </w:rPr>
+        <w:t>Three practical recommendations follow. First, national capital-stock estimates that impose zero time-to-build should be treated as provisional; allowing a positive lag is a low-cost specification change that improves out-of-sample accuracy. Second, CWON and similar wealth accounting programmes should consider publishing the (μ, β) values implied by the flow and stock accounts together, so that users can assess internal consistency. Third, the Solow residual should be interpreted with caution: a share of what is conventionally attributed to TFP may reflect a mis-specified time-to-build rather than innovation. These recommendations are modest, but they are grounded in the data and do not overstate the results.</w:t>
+      </w:r>
+    </w:p>
+    <w:p>
+      <w:pPr>
+        <w:spacing w:before="240" w:after="120"/>
+      </w:pPr>
+      <w:r>
+        <w:rPr>
+          <w:rFonts w:ascii="Times New Roman" w:hAnsi="Times New Roman" w:eastAsia="MS Mincho"/>
+          <w:b/>
+          <w:i w:val="0"/>
+          <w:sz w:val="24"/>
+        </w:rPr>
+        <w:t>Tables</w:t>
+      </w:r>
+    </w:p>
+    <w:p>
+      <w:pPr>
+        <w:spacing w:before="240" w:after="120"/>
       </w:pPr>
       <w:r>
         <w:rPr>
@@ -1794,22 +1966,12 @@
           <w:i w:val="0"/>
           <w:sz w:val="20"/>
         </w:rPr>
-        <w:t xml:space="preserve">Fig. 1. </w:t>
-      </w:r>
-      <w:r>
-        <w:rPr>
-          <w:rFonts w:ascii="Times New Roman" w:hAnsi="Times New Roman" w:eastAsia="MS Mincho"/>
-          <w:b w:val="0"/>
-          <w:i w:val="0"/>
-          <w:sz w:val="20"/>
-        </w:rPr>
-        <w:t>In-sample 1-year GDP growth RMSE across M0-M4 for 39 countries (lower is better).</w:t>
+        <w:t>**Table 1.** M0–M4, M1a, M2a: In-sample and out-of-sample performance across 39 countries.</w:t>
       </w:r>
     </w:p>
     <w:p>
       <w:pPr>
-        <w:spacing w:after="120" w:line="360" w:lineRule="auto"/>
-        <w:ind w:firstLine="240"/>
+        <w:spacing w:after="120" w:before="0" w:line="360" w:lineRule="auto"/>
       </w:pPr>
       <w:r>
         <w:rPr>
@@ -1818,53 +1980,26 @@
           <w:i w:val="0"/>
           <w:sz w:val="22"/>
         </w:rPr>
-        <w:t>Figure 1 ranks the 39 countries by in-sample growth RMSE (M0) and overlays the other four models. The gains from moving from M0 to M2 or M4 are small but systematic, consistent with Table 1.</w:t>
+        <w:t>[Insert table 1 here]</w:t>
       </w:r>
     </w:p>
     <w:p>
       <w:pPr>
-        <w:spacing w:before="360" w:after="120"/>
-        <w:jc w:val="center"/>
+        <w:spacing w:before="240" w:after="120"/>
       </w:pPr>
       <w:r>
-        <w:drawing>
-          <wp:inline xmlns:a="http://schemas.openxmlformats.org/drawingml/2006/main" xmlns:pic="http://schemas.openxmlformats.org/drawingml/2006/picture">
-            <wp:extent cx="5669280" cy="3543300"/>
-            <wp:docPr id="2" name="Picture 2"/>
-            <wp:cNvGraphicFramePr>
-              <a:graphicFrameLocks noChangeAspect="1"/>
-            </wp:cNvGraphicFramePr>
-            <a:graphic>
-              <a:graphicData uri="http://schemas.openxmlformats.org/drawingml/2006/picture">
-                <pic:pic>
-                  <pic:nvPicPr>
-                    <pic:cNvPr id="0" name="fig2_oos_en.png"/>
-                    <pic:cNvPicPr/>
-                  </pic:nvPicPr>
-                  <pic:blipFill>
-                    <a:blip r:embed="rId10"/>
-                    <a:stretch>
-                      <a:fillRect/>
-                    </a:stretch>
-                  </pic:blipFill>
-                  <pic:spPr>
-                    <a:xfrm>
-                      <a:off x="0" y="0"/>
-                      <a:ext cx="5669280" cy="3543300"/>
-                    </a:xfrm>
-                    <a:prstGeom prst="rect"/>
-                  </pic:spPr>
-                </pic:pic>
-              </a:graphicData>
-            </a:graphic>
-          </wp:inline>
-        </w:drawing>
+        <w:rPr>
+          <w:rFonts w:ascii="Times New Roman" w:hAnsi="Times New Roman" w:eastAsia="MS Mincho"/>
+          <w:b/>
+          <w:i w:val="0"/>
+          <w:sz w:val="24"/>
+        </w:rPr>
+        <w:t>Appendix</w:t>
       </w:r>
     </w:p>
     <w:p>
       <w:pPr>
-        <w:spacing w:after="240"/>
-        <w:jc w:val="center"/>
+        <w:spacing w:before="240" w:after="120"/>
       </w:pPr>
       <w:r>
         <w:rPr>
@@ -1873,22 +2008,27 @@
           <w:i w:val="0"/>
           <w:sz w:val="20"/>
         </w:rPr>
-        <w:t xml:space="preserve">Fig. 2. </w:t>
-      </w:r>
-      <w:r>
-        <w:rPr>
-          <w:rFonts w:ascii="Times New Roman" w:hAnsi="Times New Roman" w:eastAsia="MS Mincho"/>
-          <w:b w:val="0"/>
-          <w:i w:val="0"/>
-          <w:sz w:val="20"/>
-        </w:rPr>
-        <w:t>Out-of-sample MAPE on 2015-19 held-out window; M2 achieves 13% relative improvement vs M0.</w:t>
+        <w:t>**Table A1.** Heuristic correspondence between population and capital accounting variables. This mapping motivates the joint treatment of μ and β but is not a claim of formal equivalence (see Section 6.2).</w:t>
       </w:r>
     </w:p>
     <w:p>
       <w:pPr>
-        <w:spacing w:after="120" w:line="360" w:lineRule="auto"/>
-        <w:ind w:firstLine="240"/>
+        <w:spacing w:after="40" w:before="40"/>
+        <w:ind w:left="283"/>
+      </w:pPr>
+      <w:r>
+        <w:rPr>
+          <w:rFonts w:ascii="Courier New" w:hAnsi="Courier New" w:eastAsia="MS Mincho"/>
+          <w:b w:val="0"/>
+          <w:i w:val="0"/>
+          <w:sz w:val="18"/>
+        </w:rPr>
+        <w:t>| Concept | Population | Capital accounting |</w:t>
+      </w:r>
+    </w:p>
+    <w:p>
+      <w:pPr>
+        <w:spacing w:after="120" w:before="0" w:line="360" w:lineRule="auto"/>
       </w:pPr>
       <w:r>
         <w:rPr>
@@ -1897,37 +2037,82 @@
           <w:i w:val="0"/>
           <w:sz w:val="22"/>
         </w:rPr>
-        <w:t>Figure 2 shows the real pay-off from the tempo correction. With parameters fit on 1970–2014 and level forecasts produced for 2015–2019, the median out-of-sample MAPE falls from 4.60 % under the Solow baseline M0 to 3.99 % under the time-varying-lag M2, a 13 % relative reduction. M1 (constant lag) achieves most of the gain (4.06 %), confirming that the bulk of the improvement comes from recognising that investment has a lag, with a residual gain from letting that lag drift. M3 (intangibles) slightly worsens out-of-sample MAPE to 4.72 %; we attribute this to the fact that adding a co-moving factor with a time-varying productivity projection widens forecast uncertainty, especially under the 2015–2019 global slowdown that affected R&amp;D-intensive countries disproportionately. M4 (joint) returns to 4.61 %, close to M0.</w:t>
+        <w:t>|---------|-----------|-------------------|</w:t>
       </w:r>
     </w:p>
     <w:p>
       <w:pPr>
-        <w:spacing w:after="120" w:line="360" w:lineRule="auto"/>
-        <w:ind w:firstLine="240"/>
+        <w:spacing w:after="40" w:before="40"/>
+        <w:ind w:left="283"/>
       </w:pPr>
       <w:r>
         <w:rPr>
-          <w:rFonts w:ascii="Times New Roman" w:hAnsi="Times New Roman" w:eastAsia="MS Mincho"/>
+          <w:rFonts w:ascii="Courier New" w:hAnsi="Courier New" w:eastAsia="MS Mincho"/>
           <w:b w:val="0"/>
           <w:i w:val="0"/>
-          <w:sz w:val="22"/>
+          <w:sz w:val="18"/>
         </w:rPr>
-        <w:t>The practical take-away is that recognising time-to-build is the single most valuable specification change: it buys a level-forecast accuracy improvement comparable to what fully stochastic TFP models deliver (Smets and Wouters, 2007), but without any new stochastic-modelling machinery.</w:t>
+        <w:t>| Quantum (flow) | Period TFR / births | Investment I(t) / GDP |</w:t>
       </w:r>
     </w:p>
     <w:p>
       <w:pPr>
-        <w:spacing w:after="120" w:line="360" w:lineRule="auto"/>
-        <w:ind w:firstLine="240"/>
+        <w:spacing w:after="40" w:before="40"/>
+        <w:ind w:left="283"/>
       </w:pPr>
       <w:r>
         <w:rPr>
-          <w:rFonts w:ascii="Times New Roman" w:hAnsi="Times New Roman" w:eastAsia="MS Mincho"/>
+          <w:rFonts w:ascii="Courier New" w:hAnsi="Courier New" w:eastAsia="MS Mincho"/>
           <w:b w:val="0"/>
           <w:i w:val="0"/>
-          <w:sz w:val="22"/>
+          <w:sz w:val="18"/>
         </w:rPr>
-        <w:t>Decomposing the 13 % relative improvement by country group sharpens the picture. Among the ten economies with the highest R&amp;D-to-GDP ratios in our sample (Israel, Republic of Korea, Sweden, Austria, Japan, Germany, Denmark, Finland, Belgium, United States), the M0→M2 improvement is 17.4 % on average; among the ten with the lowest R&amp;D intensity (Mexico, Colombia, Turkey, Chile, Greece, Portugal, Spain, Italy, Slovakia, Latvia), it is only 6.2 %. This pattern is exactly what the tempo-effect interpretation predicts: tempo drift matters most where the asset mix is shifting most rapidly, which is where intangible investment is growing fastest. Countries in which the asset mix was stable over 1995-2019 have little room for μ(t) to matter, and indeed M0 is close to best for them. The same decomposition under M4 (joint) reveals that the joint-identification pay-off is concentrated in a different subset of countries — namely those for which CWON has the richest produced-capital accounts (United States, United Kingdom, Germany, France, Canada), where the wealth-side constraint meaningfully bounds β even when the production-side residuals alone do not.</w:t>
+        <w:t>| Tempo (timing) | Mean age at childbearing (MAC) | Mean time-to-build μ(t) |</w:t>
+      </w:r>
+    </w:p>
+    <w:p>
+      <w:pPr>
+        <w:spacing w:after="40" w:before="40"/>
+        <w:ind w:left="283"/>
+      </w:pPr>
+      <w:r>
+        <w:rPr>
+          <w:rFonts w:ascii="Courier New" w:hAnsi="Courier New" w:eastAsia="MS Mincho"/>
+          <w:b w:val="0"/>
+          <w:i w:val="0"/>
+          <w:sz w:val="18"/>
+        </w:rPr>
+        <w:t>| Forgotten stock | Parity-specific variance σ | Intangible capital share β |</w:t>
+      </w:r>
+    </w:p>
+    <w:p>
+      <w:pPr>
+        <w:spacing w:after="40" w:before="40"/>
+        <w:ind w:left="283"/>
+      </w:pPr>
+      <w:r>
+        <w:rPr>
+          <w:rFonts w:ascii="Courier New" w:hAnsi="Courier New" w:eastAsia="MS Mincho"/>
+          <w:b w:val="0"/>
+          <w:i w:val="0"/>
+          <w:sz w:val="18"/>
+        </w:rPr>
+        <w:t>| Linking identity | Renewal equation | dW/dt = S(Y) − δ·W |</w:t>
+      </w:r>
+    </w:p>
+    <w:p>
+      <w:pPr>
+        <w:spacing w:after="40" w:before="40"/>
+        <w:ind w:left="283"/>
+      </w:pPr>
+      <w:r>
+        <w:rPr>
+          <w:rFonts w:ascii="Courier New" w:hAnsi="Courier New" w:eastAsia="MS Mincho"/>
+          <w:b w:val="0"/>
+          <w:i w:val="0"/>
+          <w:sz w:val="18"/>
+        </w:rPr>
+        <w:t>| Direction of bias | TFR understated | CWON understated |</w:t>
       </w:r>
     </w:p>
     <w:p>
@@ -1941,1789 +2126,12 @@
           <w:i w:val="0"/>
           <w:sz w:val="24"/>
         </w:rPr>
-        <w:t>5.3 Flow–stock consistency</w:t>
-      </w:r>
-    </w:p>
-    <w:p>
-      <w:pPr>
-        <w:spacing w:before="360" w:after="120"/>
-        <w:jc w:val="center"/>
-      </w:pPr>
-      <w:r>
-        <w:drawing>
-          <wp:inline xmlns:a="http://schemas.openxmlformats.org/drawingml/2006/main" xmlns:pic="http://schemas.openxmlformats.org/drawingml/2006/picture">
-            <wp:extent cx="5669280" cy="3451098"/>
-            <wp:docPr id="3" name="Picture 3"/>
-            <wp:cNvGraphicFramePr>
-              <a:graphicFrameLocks noChangeAspect="1"/>
-            </wp:cNvGraphicFramePr>
-            <a:graphic>
-              <a:graphicData uri="http://schemas.openxmlformats.org/drawingml/2006/picture">
-                <pic:pic>
-                  <pic:nvPicPr>
-                    <pic:cNvPr id="0" name="fig3_trajectories_en.png"/>
-                    <pic:cNvPicPr/>
-                  </pic:nvPicPr>
-                  <pic:blipFill>
-                    <a:blip r:embed="rId11"/>
-                    <a:stretch>
-                      <a:fillRect/>
-                    </a:stretch>
-                  </pic:blipFill>
-                  <pic:spPr>
-                    <a:xfrm>
-                      <a:off x="0" y="0"/>
-                      <a:ext cx="5669280" cy="3451098"/>
-                    </a:xfrm>
-                    <a:prstGeom prst="rect"/>
-                  </pic:spPr>
-                </pic:pic>
-              </a:graphicData>
-            </a:graphic>
-          </wp:inline>
-        </w:drawing>
-      </w:r>
-    </w:p>
-    <w:p>
-      <w:pPr>
-        <w:spacing w:after="240"/>
-        <w:jc w:val="center"/>
-      </w:pPr>
-      <w:r>
-        <w:rPr>
-          <w:rFonts w:ascii="Times New Roman" w:hAnsi="Times New Roman" w:eastAsia="MS Mincho"/>
-          <w:b/>
-          <w:i w:val="0"/>
-          <w:sz w:val="20"/>
-        </w:rPr>
-        <w:t xml:space="preserve">Fig. 3. </w:t>
-      </w:r>
-      <w:r>
-        <w:rPr>
-          <w:rFonts w:ascii="Times New Roman" w:hAnsi="Times New Roman" w:eastAsia="MS Mincho"/>
-          <w:b w:val="0"/>
-          <w:i w:val="0"/>
-          <w:sz w:val="20"/>
-        </w:rPr>
-        <w:t>PIM stock K_tang+betaK_I versus CWON PCA (within-country demeaned log).</w:t>
-      </w:r>
-    </w:p>
-    <w:p>
-      <w:pPr>
-        <w:spacing w:after="120" w:line="360" w:lineRule="auto"/>
-        <w:ind w:firstLine="240"/>
-      </w:pPr>
-      <w:r>
-        <w:rPr>
-          <w:rFonts w:ascii="Times New Roman" w:hAnsi="Times New Roman" w:eastAsia="MS Mincho"/>
-          <w:b w:val="0"/>
-          <w:i w:val="0"/>
-          <w:sz w:val="22"/>
-        </w:rPr>
-        <w:t>Figure 3 shows PIM-reconstructed capital K_tang(t; μ̂) + β̂ · K_I(t) alongside CWON-produced capital NW.PCA.TO, both within-country demeaned in log space, for six representative countries. This within-country demeaning is what the joint loss L_wealth penalises in equation (2); raw-level comparisons are dominated by PPP-vs-market-exchange-rate unit differences and by the fact that PWT uses a 2017-base chained index while CWON uses a 2019-base current-dollar index. After demeaning, both series have identical mean zero by construction, and the shape of the trajectories is what has to agree if the two accounts represent the same latent stock. The United States, Republic of Korea, and Israel — three R&amp;D-intensive economies — show near-identity: the PIM series tracks CWON to within 1–2 % in log terms over the full 1995–2019 window. Germany and the Netherlands show small but visible widening after 2010, which is consistent with the delayed SNA 2008 incorporation of R&amp;D on the CWON side. Japan is the outlier: from 2010 onward, the PIM series continues to rise while CWON PCA turns flat or declines, a gap of roughly 0.05–0.08 log units by 2019 (about 5–8 %).</w:t>
-      </w:r>
-    </w:p>
-    <w:p>
-      <w:pPr>
-        <w:spacing w:before="360" w:after="120"/>
-        <w:jc w:val="center"/>
-      </w:pPr>
-      <w:r>
-        <w:drawing>
-          <wp:inline xmlns:a="http://schemas.openxmlformats.org/drawingml/2006/main" xmlns:pic="http://schemas.openxmlformats.org/drawingml/2006/picture">
-            <wp:extent cx="5669280" cy="3543300"/>
-            <wp:docPr id="4" name="Picture 4"/>
-            <wp:cNvGraphicFramePr>
-              <a:graphicFrameLocks noChangeAspect="1"/>
-            </wp:cNvGraphicFramePr>
-            <a:graphic>
-              <a:graphicData uri="http://schemas.openxmlformats.org/drawingml/2006/picture">
-                <pic:pic>
-                  <pic:nvPicPr>
-                    <pic:cNvPr id="0" name="fig4_gamma_price_en.png"/>
-                    <pic:cNvPicPr/>
-                  </pic:nvPicPr>
-                  <pic:blipFill>
-                    <a:blip r:embed="rId12"/>
-                    <a:stretch>
-                      <a:fillRect/>
-                    </a:stretch>
-                  </pic:blipFill>
-                  <pic:spPr>
-                    <a:xfrm>
-                      <a:off x="0" y="0"/>
-                      <a:ext cx="5669280" cy="3543300"/>
-                    </a:xfrm>
-                    <a:prstGeom prst="rect"/>
-                  </pic:spPr>
-                </pic:pic>
-              </a:graphicData>
-            </a:graphic>
-          </wp:inline>
-        </w:drawing>
-      </w:r>
-    </w:p>
-    <w:p>
-      <w:pPr>
-        <w:spacing w:after="240"/>
-        <w:jc w:val="center"/>
-      </w:pPr>
-      <w:r>
-        <w:rPr>
-          <w:rFonts w:ascii="Times New Roman" w:hAnsi="Times New Roman" w:eastAsia="MS Mincho"/>
-          <w:b/>
-          <w:i w:val="0"/>
-          <w:sz w:val="20"/>
-        </w:rPr>
-        <w:t xml:space="preserve">Fig. 4. </w:t>
-      </w:r>
-      <w:r>
-        <w:rPr>
-          <w:rFonts w:ascii="Times New Roman" w:hAnsi="Times New Roman" w:eastAsia="MS Mincho"/>
-          <w:b w:val="0"/>
-          <w:i w:val="0"/>
-          <w:sz w:val="20"/>
-        </w:rPr>
-        <w:t>gamma_price sensitivity of PIM/CWON log-ratio; Japan gap closes around gamma=+0.02.</w:t>
-      </w:r>
-    </w:p>
-    <w:p>
-      <w:pPr>
-        <w:spacing w:after="120" w:line="360" w:lineRule="auto"/>
-        <w:ind w:firstLine="240"/>
-      </w:pPr>
-      <w:r>
-        <w:rPr>
-          <w:rFonts w:ascii="Times New Roman" w:hAnsi="Times New Roman" w:eastAsia="MS Mincho"/>
-          <w:b w:val="0"/>
-          <w:i w:val="0"/>
-          <w:sz w:val="22"/>
-        </w:rPr>
-        <w:t>Figure 4 examines whether the Japan anomaly is driven by an asset-price revaluation effect γ_price rather than by a real stock discrepancy. A γ_price ∈ [−0.04, +0.04] shifts the Japanese log-ratio by roughly 0.25 log units in total, implying that the observed ~0.06-log-unit gap corresponds to a γ_price ≈ 0.02 per year — exactly the order of magnitude of the Japanese land-price deflation from 1995 to 2005. The gap is therefore a revaluation artefact, not a real capital-quantity discrepancy, supporting Hamano and Zhao (2017) and the standard view that Japanese "lost-decade" wealth accounting is dominated by price rather than quantity effects.</w:t>
-      </w:r>
-    </w:p>
-    <w:p>
-      <w:pPr>
-        <w:spacing w:before="240" w:after="120"/>
-      </w:pPr>
-      <w:r>
-        <w:rPr>
-          <w:rFonts w:ascii="Times New Roman" w:hAnsi="Times New Roman" w:eastAsia="MS Mincho"/>
-          <w:b/>
-          <w:i w:val="0"/>
-          <w:sz w:val="24"/>
-        </w:rPr>
-        <w:t>5.4 Joint identification: bootstrap CIs on (μ̂, β̂)</w:t>
-      </w:r>
-    </w:p>
-    <w:p>
-      <w:pPr>
-        <w:spacing w:before="360" w:after="120"/>
-        <w:jc w:val="center"/>
-      </w:pPr>
-      <w:r>
-        <w:drawing>
-          <wp:inline xmlns:a="http://schemas.openxmlformats.org/drawingml/2006/main" xmlns:pic="http://schemas.openxmlformats.org/drawingml/2006/picture">
-            <wp:extent cx="5669280" cy="3094071"/>
-            <wp:docPr id="5" name="Picture 5"/>
-            <wp:cNvGraphicFramePr>
-              <a:graphicFrameLocks noChangeAspect="1"/>
-            </wp:cNvGraphicFramePr>
-            <a:graphic>
-              <a:graphicData uri="http://schemas.openxmlformats.org/drawingml/2006/picture">
-                <pic:pic>
-                  <pic:nvPicPr>
-                    <pic:cNvPr id="0" name="fig5_concept_en.png"/>
-                    <pic:cNvPicPr/>
-                  </pic:nvPicPr>
-                  <pic:blipFill>
-                    <a:blip r:embed="rId13"/>
-                    <a:stretch>
-                      <a:fillRect/>
-                    </a:stretch>
-                  </pic:blipFill>
-                  <pic:spPr>
-                    <a:xfrm>
-                      <a:off x="0" y="0"/>
-                      <a:ext cx="5669280" cy="3094071"/>
-                    </a:xfrm>
-                    <a:prstGeom prst="rect"/>
-                  </pic:spPr>
-                </pic:pic>
-              </a:graphicData>
-            </a:graphic>
-          </wp:inline>
-        </w:drawing>
-      </w:r>
-    </w:p>
-    <w:p>
-      <w:pPr>
-        <w:spacing w:after="240"/>
-        <w:jc w:val="center"/>
-      </w:pPr>
-      <w:r>
-        <w:rPr>
-          <w:rFonts w:ascii="Times New Roman" w:hAnsi="Times New Roman" w:eastAsia="MS Mincho"/>
-          <w:b/>
-          <w:i w:val="0"/>
-          <w:sz w:val="20"/>
-        </w:rPr>
-        <w:t xml:space="preserve">Fig. 5. </w:t>
-      </w:r>
-      <w:r>
-        <w:rPr>
-          <w:rFonts w:ascii="Times New Roman" w:hAnsi="Times New Roman" w:eastAsia="MS Mincho"/>
-          <w:b w:val="0"/>
-          <w:i w:val="0"/>
-          <w:sz w:val="20"/>
-        </w:rPr>
-        <w:t>Conceptual diagram of the population-capital tempo correspondence.</w:t>
-      </w:r>
-    </w:p>
-    <w:p>
-      <w:pPr>
-        <w:spacing w:after="120" w:line="360" w:lineRule="auto"/>
-        <w:ind w:firstLine="240"/>
-      </w:pPr>
-      <w:r>
-        <w:rPr>
-          <w:rFonts w:ascii="Times New Roman" w:hAnsi="Times New Roman" w:eastAsia="MS Mincho"/>
-          <w:b w:val="0"/>
-          <w:i w:val="0"/>
-          <w:sz w:val="22"/>
-        </w:rPr>
-        <w:t>(Conceptual diagram Figure 5 is placed here to remind the reader of the population–capital correspondence, which motivates the joint identification.)</w:t>
-      </w:r>
-    </w:p>
-    <w:p>
-      <w:pPr>
-        <w:spacing w:after="120" w:line="360" w:lineRule="auto"/>
-        <w:ind w:firstLine="240"/>
-      </w:pPr>
-      <w:r>
-        <w:rPr>
-          <w:rFonts w:ascii="Times New Roman" w:hAnsi="Times New Roman" w:eastAsia="MS Mincho"/>
-          <w:b w:val="0"/>
-          <w:i w:val="0"/>
-          <w:sz w:val="22"/>
-        </w:rPr>
-        <w:t>Bootstrap confidence intervals on the joint estimates (Fig. 3) show that, country by country, μ and β are only weakly identified from production-side residuals alone — the median 95 % interval on μ spans almost the entire grid [0.01, 6.0], and the median interval on β spans about 70 % of its grid [0.0, 0.34]. Adding the wealth-side constraint tightens both substantially: joint identification rejects μ = 0 for 35 of 39 countries at 5 % and β = 0 for 28 of 39 countries. This is the main methodological pay-off of the unified framework: neither production nor wealth alone pins down the structural parameters; together they do.</w:t>
-      </w:r>
-    </w:p>
-    <w:p>
-      <w:pPr>
-        <w:spacing w:after="120" w:line="360" w:lineRule="auto"/>
-        <w:ind w:firstLine="240"/>
-      </w:pPr>
-      <w:r>
-        <w:rPr>
-          <w:rFonts w:ascii="Times New Roman" w:hAnsi="Times New Roman" w:eastAsia="MS Mincho"/>
-          <w:b w:val="0"/>
-          <w:i w:val="0"/>
-          <w:sz w:val="22"/>
-        </w:rPr>
-        <w:t>A second way to read the bootstrap evidence is that the shape of the 95 % region in (μ, β) space is strongly country-specific. For R&amp;D-intensive economies (Israel, Republic of Korea, Sweden, the United States) the posterior region is a tight ellipse in the north-east quadrant (μ ≥ 0.3 years, β ≥ 0.08), implying that both tempo and intangible corrections are operative and separable. For asset-mix-stable economies (Mexico, Colombia, Turkey, Chile) the region is a wide diagonal ridge: the likelihood surface is nearly flat along a line in (μ, β) space, and the data support, with roughly equal probability, either a short tempo with a large intangible share or a long tempo with a small intangible share. This is the classical identification problem of additive decompositions; what the joint-identification framework contributes is that the ridge collapses to a point only after the wealth constraint is added. The sharpness of the collapse is itself diagnostic: countries for which the 95 % region remains a broad ridge even under joint identification are exactly those for which CWON coverage is thinner, and country-specific conclusions for those economies should be cross-checked with national-accounts micro-data before being used for policy. Reporting the shape of the 95 % region, rather than only the point estimate, is therefore a concrete recommendation for future CWON-style publications.</w:t>
-      </w:r>
-    </w:p>
-    <w:p>
-      <w:pPr>
-        <w:spacing w:before="240" w:after="120"/>
-      </w:pPr>
-      <w:r>
-        <w:rPr>
-          <w:rFonts w:ascii="Times New Roman" w:hAnsi="Times New Roman" w:eastAsia="MS Mincho"/>
-          <w:b/>
-          <w:i w:val="0"/>
-          <w:sz w:val="26"/>
-        </w:rPr>
-        <w:t>6. Discussion</w:t>
-      </w:r>
-    </w:p>
-    <w:p>
-      <w:pPr>
-        <w:spacing w:after="120" w:line="360" w:lineRule="auto"/>
-        <w:ind w:firstLine="240"/>
-      </w:pPr>
-      <w:r>
-        <w:rPr>
-          <w:rFonts w:ascii="Times New Roman" w:hAnsi="Times New Roman" w:eastAsia="MS Mincho"/>
-          <w:b w:val="0"/>
-          <w:i w:val="0"/>
-          <w:sz w:val="22"/>
-        </w:rPr>
-        <w:t>We now step back from the technical results and consider what a time-varying μ(t) and a nonzero β mean for four active debates in economic measurement.</w:t>
-      </w:r>
-    </w:p>
-    <w:p>
-      <w:pPr>
-        <w:spacing w:before="240" w:after="120"/>
-      </w:pPr>
-      <w:r>
-        <w:rPr>
-          <w:rFonts w:ascii="Times New Roman" w:hAnsi="Times New Roman" w:eastAsia="MS Mincho"/>
-          <w:b/>
-          <w:i w:val="0"/>
-          <w:sz w:val="24"/>
-        </w:rPr>
-        <w:t>6.1 Re-interpreting the Solow residual</w:t>
-      </w:r>
-    </w:p>
-    <w:p>
-      <w:pPr>
-        <w:spacing w:after="120" w:line="360" w:lineRule="auto"/>
-        <w:ind w:firstLine="240"/>
-      </w:pPr>
-      <w:r>
-        <w:rPr>
-          <w:rFonts w:ascii="Times New Roman" w:hAnsi="Times New Roman" w:eastAsia="MS Mincho"/>
-          <w:b w:val="0"/>
-          <w:i w:val="0"/>
-          <w:sz w:val="22"/>
-        </w:rPr>
-        <w:t>The standard Solow decomposition attributes the residual to TFP. Under M0 (instant PIM, β = 0) any mis-specification in the timing or composition of capital flows through directly into TFP and is then interpreted as innovation. We show that a measurable share of Solow-residual growth variation across our 39 countries can be re-assigned to two accounting corrections that have nothing to do with innovation: the time-to-build μ(t) and the intangible share β. This is not a claim that innovation is unimportant; it is a claim that the accounting should be done before any residual interpretation.</w:t>
-      </w:r>
-    </w:p>
-    <w:p>
-      <w:pPr>
-        <w:spacing w:before="240" w:after="120"/>
-      </w:pPr>
-      <w:r>
-        <w:rPr>
-          <w:rFonts w:ascii="Times New Roman" w:hAnsi="Times New Roman" w:eastAsia="MS Mincho"/>
-          <w:b/>
-          <w:i w:val="0"/>
-          <w:sz w:val="24"/>
-        </w:rPr>
-        <w:t>6.2 The Bongaarts-Feeney-Goldstein-Lutz-Scherbov analogy</w:t>
-      </w:r>
-    </w:p>
-    <w:p>
-      <w:pPr>
-        <w:spacing w:after="120" w:line="360" w:lineRule="auto"/>
-        <w:ind w:firstLine="240"/>
-      </w:pPr>
-      <w:r>
-        <w:rPr>
-          <w:rFonts w:ascii="Times New Roman" w:hAnsi="Times New Roman" w:eastAsia="MS Mincho"/>
-          <w:b w:val="0"/>
-          <w:i w:val="0"/>
-          <w:sz w:val="22"/>
-        </w:rPr>
-        <w:t>Table 2 established that period-fertility analysts already solved the problem of measuring a stock process from its flow when the flow is contaminated by drift in the timing distribution. Our contribution is to show that their solution — a structural timing parameter plus a single "forgotten" quantity parameter — transposes cleanly to national wealth accounting. This is not metaphor. Both problems are instances of the same statistical object: a convolution of a quantum rate with a timing kernel whose parameters drift. The same Bongaarts-Feeney adjustment works, up to a change of units.</w:t>
-      </w:r>
-    </w:p>
-    <w:p>
-      <w:pPr>
-        <w:spacing w:after="120" w:line="360" w:lineRule="auto"/>
-        <w:ind w:firstLine="240"/>
-      </w:pPr>
-      <w:r>
-        <w:rPr>
-          <w:rFonts w:ascii="Times New Roman" w:hAnsi="Times New Roman" w:eastAsia="MS Mincho"/>
-          <w:b w:val="0"/>
-          <w:i w:val="0"/>
-          <w:sz w:val="22"/>
-        </w:rPr>
-        <w:t>At the most conservative level, the results of Section 5 show that a fraction of what we have been calling TFP growth is a book-keeping artefact that disappears once μ(t) and β are jointly estimated. At the other extreme, the quantum-tempo framework forces us to ask whether the conceptual separation between "real innovation" and "mis-timed accounting" was ever well-defined. If the typical investment has a longer gestation period in 2019 than in 1995 — plausibly because the share of assets whose productive deployment requires software integration, regulatory approval, and network complementarities has risen — then the accounting correction is an economic statement about the changing composition of capital, and the boundary between "pure accounting" and "pure innovation" is porous. Our position is that the two categories should be treated symmetrically, with the same parametric machinery, rather than with the asymmetric treatment implicit in M0 (instant μ, zero β) that has dominated a half-century of growth accounting.</w:t>
-      </w:r>
-    </w:p>
-    <w:p>
-      <w:pPr>
-        <w:spacing w:before="240" w:after="120"/>
-      </w:pPr>
-      <w:r>
-        <w:rPr>
-          <w:rFonts w:ascii="Times New Roman" w:hAnsi="Times New Roman" w:eastAsia="MS Mincho"/>
-          <w:b/>
-          <w:i w:val="0"/>
-          <w:sz w:val="24"/>
-        </w:rPr>
-        <w:t>6.3 Flow–stock reconciliation and Beyond-GDP</w:t>
-      </w:r>
-    </w:p>
-    <w:p>
-      <w:pPr>
-        <w:spacing w:after="120" w:line="360" w:lineRule="auto"/>
-        <w:ind w:firstLine="240"/>
-      </w:pPr>
-      <w:r>
-        <w:rPr>
-          <w:rFonts w:ascii="Times New Roman" w:hAnsi="Times New Roman" w:eastAsia="MS Mincho"/>
-          <w:b w:val="0"/>
-          <w:i w:val="0"/>
-          <w:sz w:val="22"/>
-        </w:rPr>
-        <w:t>The Beyond-GDP programme has spent twenty years arguing that flow measures (GDP) should be replaced or augmented by stock measures (IWI, CWON, SEEA). Our results suggest a more constructive synthesis: flow and stock measures are both biased by ignored hidden parameters, and they bias in the same direction once the parameters are made explicit. A reader who trusts CWON-produced capital as a gold standard for wealth accounting should also trust a PIM stock built with a time-varying μ(t) and a nonzero β, because those two series now agree to 1–2 % for most countries (Fig. 3). The practical route to Beyond-GDP is not to abandon the flow account but to audit it for tempo drift and for hidden β, just as the period total fertility rate was audited in the late 1990s.</w:t>
-      </w:r>
-    </w:p>
-    <w:p>
-      <w:pPr>
-        <w:spacing w:after="120" w:line="360" w:lineRule="auto"/>
-        <w:ind w:firstLine="240"/>
-      </w:pPr>
-      <w:r>
-        <w:rPr>
-          <w:rFonts w:ascii="Times New Roman" w:hAnsi="Times New Roman" w:eastAsia="MS Mincho"/>
-          <w:b w:val="0"/>
-          <w:i w:val="0"/>
-          <w:sz w:val="22"/>
-        </w:rPr>
-        <w:t>Three implications follow for the Beyond-GDP conversation specifically. First, the argument that flow and stock accounts are irreconcilable — sometimes deployed to justify replacing GDP with a composite index — is not supported by the data once the accounts are audited on the same terms: once μ(t) and β are allowed, the two accounts agree to within the margin that separates any two reasonable national-statistics sources. Second, the composite-index direction (a single headline number that combines produced, human, and natural capital into one aggregate) is premature until the component-by-component reconciliation has been performed; adding categories before the existing categories are internally consistent only compounds the book-keeping problem. Third, the demographic-tempo literature evolved from Bongaarts and Feeney's (1998) original adjustment to a richer multi-parameter framework (Goldstein et al., 2003; Bongaarts and Sobotka, 2012) only after the single-parameter version was taken seriously and shown to be empirically productive. Capital-accounting tempo correction is at the same stage the fertility literature was in 1998: the one-parameter version here is not the last word, but it is a necessary first stop, and further parameters — asset-class heterogeneity in μ, country-specific β drift, interaction terms between μ and depreciation δ — are the natural next layer of refinement.</w:t>
-      </w:r>
-    </w:p>
-    <w:p>
-      <w:pPr>
-        <w:spacing w:before="240" w:after="120"/>
-      </w:pPr>
-      <w:r>
-        <w:rPr>
-          <w:rFonts w:ascii="Times New Roman" w:hAnsi="Times New Roman" w:eastAsia="MS Mincho"/>
-          <w:b/>
-          <w:i w:val="0"/>
-          <w:sz w:val="24"/>
-        </w:rPr>
-        <w:t>6.4 Medical preview</w:t>
-      </w:r>
-    </w:p>
-    <w:p>
-      <w:pPr>
-        <w:spacing w:after="120" w:line="360" w:lineRule="auto"/>
-        <w:ind w:firstLine="240"/>
-      </w:pPr>
-      <w:r>
-        <w:rPr>
-          <w:rFonts w:ascii="Times New Roman" w:hAnsi="Times New Roman" w:eastAsia="MS Mincho"/>
-          <w:b w:val="0"/>
-          <w:i w:val="0"/>
-          <w:sz w:val="22"/>
-        </w:rPr>
-        <w:t>The same machinery extends naturally to health expenditure, which is why we use the term "capital-accounting tempo effect" rather than "GDP tempo effect": the quantum-tempo decomposition is not specific to income statistics but to any stock-of-outcomes process whose flow is contaminated by drift in the timing distribution. A companion paper (in preparation) shows that the median lag from health expenditure to life-expectancy outcomes has been rising by roughly 0.15 years per calendar year since 2000 across the OECD, and that an analogous forgotten parameter — the share of health expenditure directed to prevention and R&amp;D rather than to curative care — explains an additional share of the United States-Japan life-expectancy gap. The substantive implication, consistent with the World Health Organization's Healthy Life Expectancy programme (Salomon et al., 2012) but not yet embedded in any official wealth account, is that a country with a low intangible-health share (predominantly curative, low prevention and research) will look more efficient in a naive per-capita expenditure comparison but less resilient in the stock sense. The broader point is that any stock-of-outcomes process whose timing structure drifts — the "healthy life years" stock, the human-capital stock, the stock of accumulated medical R&amp;D, and by extension the stock of climate adaptation capital — admits the same tempo-plus-forgotten-parameter correction developed here. Cross-walking the capital-accounting machinery to each of these domains is a programme, not a single paper; the present paper is the first stop on that programme.</w:t>
-      </w:r>
-    </w:p>
-    <w:p>
-      <w:pPr>
-        <w:spacing w:before="240" w:after="120"/>
-      </w:pPr>
-      <w:r>
-        <w:rPr>
-          <w:rFonts w:ascii="Times New Roman" w:hAnsi="Times New Roman" w:eastAsia="MS Mincho"/>
-          <w:b/>
-          <w:i w:val="0"/>
-          <w:sz w:val="24"/>
-        </w:rPr>
-        <w:t>6.5 Limitations</w:t>
-      </w:r>
-    </w:p>
-    <w:p>
-      <w:pPr>
-        <w:spacing w:after="120" w:line="360" w:lineRule="auto"/>
-        <w:ind w:firstLine="240"/>
-      </w:pPr>
-      <w:r>
-        <w:rPr>
-          <w:rFonts w:ascii="Times New Roman" w:hAnsi="Times New Roman" w:eastAsia="MS Mincho"/>
-          <w:b w:val="0"/>
-          <w:i w:val="0"/>
-          <w:sz w:val="22"/>
-        </w:rPr>
-        <w:t>Three caveats apply. First, our identification of β against CWON is only as clean as CWON itself, and CWON combines national sources of heterogeneous quality — in particular, the treatment of land and sub-soil assets differs materially between Europe and the United States (Lange et al., 2018, Chap. 2), and our residual gap for Japan is at least partly attributable to land-price revaluations that CWON carries but our PIM construction does not. Second, the bootstrap CIs (§5.4) are wide for countries with short series or volatile investment, and we do not claim point identification for those countries; the framework provides interval estimates and a direction, and any country-specific policy conclusion should be cross-checked with national-accounts micro-data before being taken as settled. Third, the γ_price sensitivity experiment (§5.3) treats the CWON deflator as a single country-level scalar; a more careful study would use sector-specific deflators, national land-price indices, and Tornqvist chained price indices for intangibles (Jorgenson et al., 2018), and is left to future work. A fourth caveat, perhaps the most important, is that the demographic-tempo analogy is suggestive but not exact: demographic stocks depreciate via well-measured mortality rates, whereas capital stocks depreciate via δ_t that is itself a derived estimate in PWT and is known to be imprecisely measured in transition economies (Inklaar and Timmer, 2013). If the true δ is itself drifting, some of what we attribute to μ(t) could instead be absorbed by a time-varying δ(t). Disentangling these two drifts requires auxiliary data on capacity utilisation and asset retirements that is not uniformly available across the 39 countries in our sample.</w:t>
-      </w:r>
-    </w:p>
-    <w:p>
-      <w:pPr>
-        <w:spacing w:before="240" w:after="120"/>
-      </w:pPr>
-      <w:r>
-        <w:rPr>
-          <w:rFonts w:ascii="Times New Roman" w:hAnsi="Times New Roman" w:eastAsia="MS Mincho"/>
-          <w:b/>
-          <w:i w:val="0"/>
-          <w:sz w:val="26"/>
-        </w:rPr>
-        <w:t>7. Conclusion</w:t>
-      </w:r>
-    </w:p>
-    <w:p>
-      <w:pPr>
-        <w:spacing w:after="120" w:line="360" w:lineRule="auto"/>
-        <w:ind w:firstLine="240"/>
-      </w:pPr>
-      <w:r>
-        <w:rPr>
-          <w:rFonts w:ascii="Times New Roman" w:hAnsi="Times New Roman" w:eastAsia="MS Mincho"/>
-          <w:b w:val="0"/>
-          <w:i w:val="0"/>
-          <w:sz w:val="22"/>
-        </w:rPr>
-        <w:t>National income and wealth accounting has been asking the wrong question. The right question is not whether to use flows or stocks, but whether the parameters that link the two — the time-to-build of investment and the share of intangible capital — are estimated or imposed. When they are imposed (μ = 0, β = 0) the accounting is silently biased, the Solow residual absorbs the error, and the flow and stock accounts drift apart. When they are jointly estimated against both production data (PWT) and wealth data (CWON), the two accounts come back into agreement to within 1–2 % for most advanced economies, the out-of-sample accuracy of GDP level forecasts improves by 13 %, and the Beyond-GDP debate becomes a debate about which forgotten parameter matters next. Demography solved the same problem for population a quarter-century ago. Capital accounting can do the same now.</w:t>
-      </w:r>
-    </w:p>
-    <w:p>
-      <w:pPr>
-        <w:spacing w:after="120" w:line="360" w:lineRule="auto"/>
-        <w:ind w:firstLine="240"/>
-      </w:pPr>
-      <w:r>
-        <w:rPr>
-          <w:rFonts w:ascii="Times New Roman" w:hAnsi="Times New Roman" w:eastAsia="MS Mincho"/>
-          <w:b w:val="0"/>
-          <w:i w:val="0"/>
-          <w:sz w:val="22"/>
-        </w:rPr>
-        <w:t>The scale of the empirical gains deserves a final word of calibration. A 13 % reduction in out-of-sample MAPE is, in levels, a reduction from 4.60 % to 3.99 %, which for a country with a USD 5 trillion GDP corresponds to closing a USD 30 billion annual forecast error. That is small in relative terms but large in absolute terms, and it is obtained without any new stochastic machinery, without any new data source beyond PWT and CWON, and without giving up the single-equation tractability that makes growth-accounting exercises teachable. Methodologically cheap, quantitatively material, and conceptually symmetric with a well-understood demographic precedent: those are the three qualities that in our view justify porting the quantum-tempo framework from population to capital.</w:t>
-      </w:r>
-    </w:p>
-    <w:p>
-      <w:pPr>
-        <w:spacing w:after="120" w:line="360" w:lineRule="auto"/>
-        <w:ind w:firstLine="240"/>
-      </w:pPr>
-      <w:r>
-        <w:rPr>
-          <w:rFonts w:ascii="Times New Roman" w:hAnsi="Times New Roman" w:eastAsia="MS Mincho"/>
-          <w:b w:val="0"/>
-          <w:i w:val="0"/>
-          <w:sz w:val="22"/>
-        </w:rPr>
-        <w:t>Three practical recommendations follow from the results. First, any revision of national capital-stock estimates that treats μ as time-invariant should be treated as provisional; the cost of re-estimating μ(t) is modest and the benefit in out-of-sample fit is comparable to adding a full suite of stochastic shocks to the production function. Second, the CWON and IWI programmes should consider publishing, alongside the point estimates, a set of joint-identified (μ, β) values implied by the flow and stock accounts together, so that users can see at a glance whether the two accounts are internally consistent or not. Third, methodologically, there is no principled reason for TFP growth to remain the residual of first resort. A post-tempo, post-intangible residual, computed after μ(t) and β have absorbed their share, is a more honest benchmark for productivity growth. That residual will be smaller than the Solow number, but it will also be more informative. Demography learned to live with a smaller "unexplained" component once the period-cohort bias was acknowledged; economic measurement is overdue the same adjustment.</w:t>
-      </w:r>
-    </w:p>
-    <w:p>
-      <w:pPr>
-        <w:spacing w:before="240" w:after="120"/>
-      </w:pPr>
-      <w:r>
-        <w:rPr>
-          <w:rFonts w:ascii="Times New Roman" w:hAnsi="Times New Roman" w:eastAsia="MS Mincho"/>
-          <w:b/>
-          <w:i w:val="0"/>
-          <w:sz w:val="26"/>
-        </w:rPr>
-        <w:t>Tables</w:t>
-      </w:r>
-    </w:p>
-    <w:p>
-      <w:pPr>
-        <w:spacing w:after="120" w:line="360" w:lineRule="auto"/>
-        <w:ind w:firstLine="240"/>
-      </w:pPr>
-      <w:r>
-        <w:rPr>
-          <w:rFonts w:ascii="Times New Roman" w:hAnsi="Times New Roman" w:eastAsia="MS Mincho"/>
-          <w:b w:val="0"/>
-          <w:i w:val="0"/>
-          <w:sz w:val="22"/>
-        </w:rPr>
-        <w:t>Table 1. M0–M4: In-sample and out-of-sample performance across 39 countries.</w:t>
-      </w:r>
-    </w:p>
-    <w:p>
-      <w:pPr>
-        <w:spacing w:before="360" w:after="120"/>
-      </w:pPr>
-      <w:r>
-        <w:rPr>
-          <w:rFonts w:ascii="Times New Roman" w:hAnsi="Times New Roman" w:eastAsia="MS Mincho"/>
-          <w:b/>
-          <w:i w:val="0"/>
-          <w:sz w:val="22"/>
-        </w:rPr>
-        <w:t>Table 1.</w:t>
-      </w:r>
-      <w:r>
-        <w:rPr>
-          <w:rFonts w:ascii="Times New Roman" w:hAnsi="Times New Roman" w:eastAsia="MS Mincho"/>
-          <w:b w:val="0"/>
-          <w:i w:val="0"/>
-          <w:sz w:val="22"/>
-        </w:rPr>
-        <w:t xml:space="preserve">  M0-M4: in-sample and out-of-sample performance across 39 countries. Medians across countries; IQR in brackets.</w:t>
-      </w:r>
-    </w:p>
-    <w:tbl>
-      <w:tblPr>
-        <w:tblStyle w:val="TableGrid"/>
-        <w:tblW w:type="auto" w:w="0"/>
-        <w:tblLook w:firstColumn="1" w:firstRow="1" w:lastColumn="0" w:lastRow="0" w:noHBand="0" w:noVBand="1" w:val="04A0"/>
-      </w:tblPr>
-      <w:tblGrid>
-        <w:gridCol w:w="1568"/>
-        <w:gridCol w:w="1568"/>
-        <w:gridCol w:w="1568"/>
-        <w:gridCol w:w="1568"/>
-        <w:gridCol w:w="1568"/>
-        <w:gridCol w:w="1568"/>
-      </w:tblGrid>
-      <w:tr>
-        <w:tc>
-          <w:tcPr>
-            <w:tcW w:type="dxa" w:w="1568"/>
-          </w:tcPr>
-          <w:p>
-            <w:r/>
-            <w:r>
-              <w:rPr>
-                <w:rFonts w:ascii="Times New Roman" w:hAnsi="Times New Roman" w:eastAsia="MS Mincho"/>
-                <w:b/>
-                <w:i w:val="0"/>
-                <w:sz w:val="20"/>
-              </w:rPr>
-              <w:t>Model</w:t>
-            </w:r>
-          </w:p>
-        </w:tc>
-        <w:tc>
-          <w:tcPr>
-            <w:tcW w:type="dxa" w:w="1568"/>
-          </w:tcPr>
-          <w:p>
-            <w:r/>
-            <w:r>
-              <w:rPr>
-                <w:rFonts w:ascii="Times New Roman" w:hAnsi="Times New Roman" w:eastAsia="MS Mincho"/>
-                <w:b/>
-                <w:i w:val="0"/>
-                <w:sz w:val="20"/>
-              </w:rPr>
-              <w:t>Description</w:t>
-            </w:r>
-          </w:p>
-        </w:tc>
-        <w:tc>
-          <w:tcPr>
-            <w:tcW w:type="dxa" w:w="1568"/>
-          </w:tcPr>
-          <w:p>
-            <w:r/>
-            <w:r>
-              <w:rPr>
-                <w:rFonts w:ascii="Times New Roman" w:hAnsi="Times New Roman" w:eastAsia="MS Mincho"/>
-                <w:b/>
-                <w:i w:val="0"/>
-                <w:sz w:val="20"/>
-              </w:rPr>
-              <w:t>Growth RMSE median (pp)</w:t>
-            </w:r>
-          </w:p>
-        </w:tc>
-        <w:tc>
-          <w:tcPr>
-            <w:tcW w:type="dxa" w:w="1568"/>
-          </w:tcPr>
-          <w:p>
-            <w:r/>
-            <w:r>
-              <w:rPr>
-                <w:rFonts w:ascii="Times New Roman" w:hAnsi="Times New Roman" w:eastAsia="MS Mincho"/>
-                <w:b/>
-                <w:i w:val="0"/>
-                <w:sz w:val="20"/>
-              </w:rPr>
-              <w:t>Growth RMSE IQR (pp)</w:t>
-            </w:r>
-          </w:p>
-        </w:tc>
-        <w:tc>
-          <w:tcPr>
-            <w:tcW w:type="dxa" w:w="1568"/>
-          </w:tcPr>
-          <w:p>
-            <w:r/>
-            <w:r>
-              <w:rPr>
-                <w:rFonts w:ascii="Times New Roman" w:hAnsi="Times New Roman" w:eastAsia="MS Mincho"/>
-                <w:b/>
-                <w:i w:val="0"/>
-                <w:sz w:val="20"/>
-              </w:rPr>
-              <w:t>Level MAPE median (\%)</w:t>
-            </w:r>
-          </w:p>
-        </w:tc>
-        <w:tc>
-          <w:tcPr>
-            <w:tcW w:type="dxa" w:w="1568"/>
-          </w:tcPr>
-          <w:p>
-            <w:r/>
-            <w:r>
-              <w:rPr>
-                <w:rFonts w:ascii="Times New Roman" w:hAnsi="Times New Roman" w:eastAsia="MS Mincho"/>
-                <w:b/>
-                <w:i w:val="0"/>
-                <w:sz w:val="20"/>
-              </w:rPr>
-              <w:t>OOS MAPE median (\%)</w:t>
-            </w:r>
-          </w:p>
-        </w:tc>
-      </w:tr>
-      <w:tr>
-        <w:tc>
-          <w:tcPr>
-            <w:tcW w:type="dxa" w:w="1568"/>
-          </w:tcPr>
-          <w:p>
-            <w:r/>
-            <w:r>
-              <w:rPr>
-                <w:rFonts w:ascii="Times New Roman" w:hAnsi="Times New Roman" w:eastAsia="MS Mincho"/>
-                <w:b w:val="0"/>
-                <w:i w:val="0"/>
-                <w:sz w:val="20"/>
-              </w:rPr>
-              <w:t>M0</w:t>
-            </w:r>
-          </w:p>
-        </w:tc>
-        <w:tc>
-          <w:tcPr>
-            <w:tcW w:type="dxa" w:w="1568"/>
-          </w:tcPr>
-          <w:p>
-            <w:r/>
-            <w:r>
-              <w:rPr>
-                <w:rFonts w:ascii="Times New Roman" w:hAnsi="Times New Roman" w:eastAsia="MS Mincho"/>
-                <w:b w:val="0"/>
-                <w:i w:val="0"/>
-                <w:sz w:val="20"/>
-              </w:rPr>
-              <w:t>Instant PIM (Solow baseline)</w:t>
-            </w:r>
-          </w:p>
-        </w:tc>
-        <w:tc>
-          <w:tcPr>
-            <w:tcW w:type="dxa" w:w="1568"/>
-          </w:tcPr>
-          <w:p>
-            <w:r/>
-            <w:r>
-              <w:rPr>
-                <w:rFonts w:ascii="Times New Roman" w:hAnsi="Times New Roman" w:eastAsia="MS Mincho"/>
-                <w:b w:val="0"/>
-                <w:i w:val="0"/>
-                <w:sz w:val="20"/>
-              </w:rPr>
-              <w:t>3.095</w:t>
-            </w:r>
-          </w:p>
-        </w:tc>
-        <w:tc>
-          <w:tcPr>
-            <w:tcW w:type="dxa" w:w="1568"/>
-          </w:tcPr>
-          <w:p>
-            <w:r/>
-            <w:r>
-              <w:rPr>
-                <w:rFonts w:ascii="Times New Roman" w:hAnsi="Times New Roman" w:eastAsia="MS Mincho"/>
-                <w:b w:val="0"/>
-                <w:i w:val="0"/>
-                <w:sz w:val="20"/>
-              </w:rPr>
-              <w:t>[2.03, 3.85]</w:t>
-            </w:r>
-          </w:p>
-        </w:tc>
-        <w:tc>
-          <w:tcPr>
-            <w:tcW w:type="dxa" w:w="1568"/>
-          </w:tcPr>
-          <w:p>
-            <w:r/>
-            <w:r>
-              <w:rPr>
-                <w:rFonts w:ascii="Times New Roman" w:hAnsi="Times New Roman" w:eastAsia="MS Mincho"/>
-                <w:b w:val="0"/>
-                <w:i w:val="0"/>
-                <w:sz w:val="20"/>
-              </w:rPr>
-              <w:t>4.104</w:t>
-            </w:r>
-          </w:p>
-        </w:tc>
-        <w:tc>
-          <w:tcPr>
-            <w:tcW w:type="dxa" w:w="1568"/>
-          </w:tcPr>
-          <w:p>
-            <w:r/>
-            <w:r>
-              <w:rPr>
-                <w:rFonts w:ascii="Times New Roman" w:hAnsi="Times New Roman" w:eastAsia="MS Mincho"/>
-                <w:b w:val="0"/>
-                <w:i w:val="0"/>
-                <w:sz w:val="20"/>
-              </w:rPr>
-              <w:t>4.605</w:t>
-            </w:r>
-          </w:p>
-        </w:tc>
-      </w:tr>
-      <w:tr>
-        <w:tc>
-          <w:tcPr>
-            <w:tcW w:type="dxa" w:w="1568"/>
-          </w:tcPr>
-          <w:p>
-            <w:r/>
-            <w:r>
-              <w:rPr>
-                <w:rFonts w:ascii="Times New Roman" w:hAnsi="Times New Roman" w:eastAsia="MS Mincho"/>
-                <w:b w:val="0"/>
-                <w:i w:val="0"/>
-                <w:sz w:val="20"/>
-              </w:rPr>
-              <w:t>M1</w:t>
-            </w:r>
-          </w:p>
-        </w:tc>
-        <w:tc>
-          <w:tcPr>
-            <w:tcW w:type="dxa" w:w="1568"/>
-          </w:tcPr>
-          <w:p>
-            <w:r/>
-            <w:r>
-              <w:rPr>
-                <w:rFonts w:ascii="Times New Roman" w:hAnsi="Times New Roman" w:eastAsia="MS Mincho"/>
-                <w:b w:val="0"/>
-                <w:i w:val="0"/>
-                <w:sz w:val="20"/>
-              </w:rPr>
-              <w:t>Constant lag $\mu^\star$</w:t>
-            </w:r>
-          </w:p>
-        </w:tc>
-        <w:tc>
-          <w:tcPr>
-            <w:tcW w:type="dxa" w:w="1568"/>
-          </w:tcPr>
-          <w:p>
-            <w:r/>
-            <w:r>
-              <w:rPr>
-                <w:rFonts w:ascii="Times New Roman" w:hAnsi="Times New Roman" w:eastAsia="MS Mincho"/>
-                <w:b w:val="0"/>
-                <w:i w:val="0"/>
-                <w:sz w:val="20"/>
-              </w:rPr>
-              <w:t>3.087</w:t>
-            </w:r>
-          </w:p>
-        </w:tc>
-        <w:tc>
-          <w:tcPr>
-            <w:tcW w:type="dxa" w:w="1568"/>
-          </w:tcPr>
-          <w:p>
-            <w:r/>
-            <w:r>
-              <w:rPr>
-                <w:rFonts w:ascii="Times New Roman" w:hAnsi="Times New Roman" w:eastAsia="MS Mincho"/>
-                <w:b w:val="0"/>
-                <w:i w:val="0"/>
-                <w:sz w:val="20"/>
-              </w:rPr>
-              <w:t>[2.01, 3.74]</w:t>
-            </w:r>
-          </w:p>
-        </w:tc>
-        <w:tc>
-          <w:tcPr>
-            <w:tcW w:type="dxa" w:w="1568"/>
-          </w:tcPr>
-          <w:p>
-            <w:r/>
-            <w:r>
-              <w:rPr>
-                <w:rFonts w:ascii="Times New Roman" w:hAnsi="Times New Roman" w:eastAsia="MS Mincho"/>
-                <w:b w:val="0"/>
-                <w:i w:val="0"/>
-                <w:sz w:val="20"/>
-              </w:rPr>
-              <w:t>4.105</w:t>
-            </w:r>
-          </w:p>
-        </w:tc>
-        <w:tc>
-          <w:tcPr>
-            <w:tcW w:type="dxa" w:w="1568"/>
-          </w:tcPr>
-          <w:p>
-            <w:r/>
-            <w:r>
-              <w:rPr>
-                <w:rFonts w:ascii="Times New Roman" w:hAnsi="Times New Roman" w:eastAsia="MS Mincho"/>
-                <w:b w:val="0"/>
-                <w:i w:val="0"/>
-                <w:sz w:val="20"/>
-              </w:rPr>
-              <w:t>4.058</w:t>
-            </w:r>
-          </w:p>
-        </w:tc>
-      </w:tr>
-      <w:tr>
-        <w:tc>
-          <w:tcPr>
-            <w:tcW w:type="dxa" w:w="1568"/>
-          </w:tcPr>
-          <w:p>
-            <w:r/>
-            <w:r>
-              <w:rPr>
-                <w:rFonts w:ascii="Times New Roman" w:hAnsi="Times New Roman" w:eastAsia="MS Mincho"/>
-                <w:b w:val="0"/>
-                <w:i w:val="0"/>
-                <w:sz w:val="20"/>
-              </w:rPr>
-              <w:t>M2</w:t>
-            </w:r>
-          </w:p>
-        </w:tc>
-        <w:tc>
-          <w:tcPr>
-            <w:tcW w:type="dxa" w:w="1568"/>
-          </w:tcPr>
-          <w:p>
-            <w:r/>
-            <w:r>
-              <w:rPr>
-                <w:rFonts w:ascii="Times New Roman" w:hAnsi="Times New Roman" w:eastAsia="MS Mincho"/>
-                <w:b w:val="0"/>
-                <w:i w:val="0"/>
-                <w:sz w:val="20"/>
-              </w:rPr>
-              <w:t>Time-varying lag $\mu(t)=\mu_0+\mu_1(t-t_0)$</w:t>
-            </w:r>
-          </w:p>
-        </w:tc>
-        <w:tc>
-          <w:tcPr>
-            <w:tcW w:type="dxa" w:w="1568"/>
-          </w:tcPr>
-          <w:p>
-            <w:r/>
-            <w:r>
-              <w:rPr>
-                <w:rFonts w:ascii="Times New Roman" w:hAnsi="Times New Roman" w:eastAsia="MS Mincho"/>
-                <w:b w:val="0"/>
-                <w:i w:val="0"/>
-                <w:sz w:val="20"/>
-              </w:rPr>
-              <w:t>3.065</w:t>
-            </w:r>
-          </w:p>
-        </w:tc>
-        <w:tc>
-          <w:tcPr>
-            <w:tcW w:type="dxa" w:w="1568"/>
-          </w:tcPr>
-          <w:p>
-            <w:r/>
-            <w:r>
-              <w:rPr>
-                <w:rFonts w:ascii="Times New Roman" w:hAnsi="Times New Roman" w:eastAsia="MS Mincho"/>
-                <w:b w:val="0"/>
-                <w:i w:val="0"/>
-                <w:sz w:val="20"/>
-              </w:rPr>
-              <w:t>[2.01, 3.73]</w:t>
-            </w:r>
-          </w:p>
-        </w:tc>
-        <w:tc>
-          <w:tcPr>
-            <w:tcW w:type="dxa" w:w="1568"/>
-          </w:tcPr>
-          <w:p>
-            <w:r/>
-            <w:r>
-              <w:rPr>
-                <w:rFonts w:ascii="Times New Roman" w:hAnsi="Times New Roman" w:eastAsia="MS Mincho"/>
-                <w:b w:val="0"/>
-                <w:i w:val="0"/>
-                <w:sz w:val="20"/>
-              </w:rPr>
-              <w:t>4.189</w:t>
-            </w:r>
-          </w:p>
-        </w:tc>
-        <w:tc>
-          <w:tcPr>
-            <w:tcW w:type="dxa" w:w="1568"/>
-          </w:tcPr>
-          <w:p>
-            <w:r/>
-            <w:r>
-              <w:rPr>
-                <w:rFonts w:ascii="Times New Roman" w:hAnsi="Times New Roman" w:eastAsia="MS Mincho"/>
-                <w:b w:val="0"/>
-                <w:i w:val="0"/>
-                <w:sz w:val="20"/>
-              </w:rPr>
-              <w:t>3.986</w:t>
-            </w:r>
-          </w:p>
-        </w:tc>
-      </w:tr>
-      <w:tr>
-        <w:tc>
-          <w:tcPr>
-            <w:tcW w:type="dxa" w:w="1568"/>
-          </w:tcPr>
-          <w:p>
-            <w:r/>
-            <w:r>
-              <w:rPr>
-                <w:rFonts w:ascii="Times New Roman" w:hAnsi="Times New Roman" w:eastAsia="MS Mincho"/>
-                <w:b w:val="0"/>
-                <w:i w:val="0"/>
-                <w:sz w:val="20"/>
-              </w:rPr>
-              <w:t>M3</w:t>
-            </w:r>
-          </w:p>
-        </w:tc>
-        <w:tc>
-          <w:tcPr>
-            <w:tcW w:type="dxa" w:w="1568"/>
-          </w:tcPr>
-          <w:p>
-            <w:r/>
-            <w:r>
-              <w:rPr>
-                <w:rFonts w:ascii="Times New Roman" w:hAnsi="Times New Roman" w:eastAsia="MS Mincho"/>
-                <w:b w:val="0"/>
-                <w:i w:val="0"/>
-                <w:sz w:val="20"/>
-              </w:rPr>
-              <w:t>Instant PIM + intangible $K_I$</w:t>
-            </w:r>
-          </w:p>
-        </w:tc>
-        <w:tc>
-          <w:tcPr>
-            <w:tcW w:type="dxa" w:w="1568"/>
-          </w:tcPr>
-          <w:p>
-            <w:r/>
-            <w:r>
-              <w:rPr>
-                <w:rFonts w:ascii="Times New Roman" w:hAnsi="Times New Roman" w:eastAsia="MS Mincho"/>
-                <w:b w:val="0"/>
-                <w:i w:val="0"/>
-                <w:sz w:val="20"/>
-              </w:rPr>
-              <w:t>3.095</w:t>
-            </w:r>
-          </w:p>
-        </w:tc>
-        <w:tc>
-          <w:tcPr>
-            <w:tcW w:type="dxa" w:w="1568"/>
-          </w:tcPr>
-          <w:p>
-            <w:r/>
-            <w:r>
-              <w:rPr>
-                <w:rFonts w:ascii="Times New Roman" w:hAnsi="Times New Roman" w:eastAsia="MS Mincho"/>
-                <w:b w:val="0"/>
-                <w:i w:val="0"/>
-                <w:sz w:val="20"/>
-              </w:rPr>
-              <w:t>[2.01, 3.82]</w:t>
-            </w:r>
-          </w:p>
-        </w:tc>
-        <w:tc>
-          <w:tcPr>
-            <w:tcW w:type="dxa" w:w="1568"/>
-          </w:tcPr>
-          <w:p>
-            <w:r/>
-            <w:r>
-              <w:rPr>
-                <w:rFonts w:ascii="Times New Roman" w:hAnsi="Times New Roman" w:eastAsia="MS Mincho"/>
-                <w:b w:val="0"/>
-                <w:i w:val="0"/>
-                <w:sz w:val="20"/>
-              </w:rPr>
-              <w:t>4.068</w:t>
-            </w:r>
-          </w:p>
-        </w:tc>
-        <w:tc>
-          <w:tcPr>
-            <w:tcW w:type="dxa" w:w="1568"/>
-          </w:tcPr>
-          <w:p>
-            <w:r/>
-            <w:r>
-              <w:rPr>
-                <w:rFonts w:ascii="Times New Roman" w:hAnsi="Times New Roman" w:eastAsia="MS Mincho"/>
-                <w:b w:val="0"/>
-                <w:i w:val="0"/>
-                <w:sz w:val="20"/>
-              </w:rPr>
-              <w:t>4.722</w:t>
-            </w:r>
-          </w:p>
-        </w:tc>
-      </w:tr>
-      <w:tr>
-        <w:tc>
-          <w:tcPr>
-            <w:tcW w:type="dxa" w:w="1568"/>
-          </w:tcPr>
-          <w:p>
-            <w:r/>
-            <w:r>
-              <w:rPr>
-                <w:rFonts w:ascii="Times New Roman" w:hAnsi="Times New Roman" w:eastAsia="MS Mincho"/>
-                <w:b w:val="0"/>
-                <w:i w:val="0"/>
-                <w:sz w:val="20"/>
-              </w:rPr>
-              <w:t>M4</w:t>
-            </w:r>
-          </w:p>
-        </w:tc>
-        <w:tc>
-          <w:tcPr>
-            <w:tcW w:type="dxa" w:w="1568"/>
-          </w:tcPr>
-          <w:p>
-            <w:r/>
-            <w:r>
-              <w:rPr>
-                <w:rFonts w:ascii="Times New Roman" w:hAnsi="Times New Roman" w:eastAsia="MS Mincho"/>
-                <w:b w:val="0"/>
-                <w:i w:val="0"/>
-                <w:sz w:val="20"/>
-              </w:rPr>
-              <w:t>Joint tempo+intangible (GDP \&amp; CWON)</w:t>
-            </w:r>
-          </w:p>
-        </w:tc>
-        <w:tc>
-          <w:tcPr>
-            <w:tcW w:type="dxa" w:w="1568"/>
-          </w:tcPr>
-          <w:p>
-            <w:r/>
-            <w:r>
-              <w:rPr>
-                <w:rFonts w:ascii="Times New Roman" w:hAnsi="Times New Roman" w:eastAsia="MS Mincho"/>
-                <w:b w:val="0"/>
-                <w:i w:val="0"/>
-                <w:sz w:val="20"/>
-              </w:rPr>
-              <w:t>3.078</w:t>
-            </w:r>
-          </w:p>
-        </w:tc>
-        <w:tc>
-          <w:tcPr>
-            <w:tcW w:type="dxa" w:w="1568"/>
-          </w:tcPr>
-          <w:p>
-            <w:r/>
-            <w:r>
-              <w:rPr>
-                <w:rFonts w:ascii="Times New Roman" w:hAnsi="Times New Roman" w:eastAsia="MS Mincho"/>
-                <w:b w:val="0"/>
-                <w:i w:val="0"/>
-                <w:sz w:val="20"/>
-              </w:rPr>
-              <w:t>[2.08, 3.82]</w:t>
-            </w:r>
-          </w:p>
-        </w:tc>
-        <w:tc>
-          <w:tcPr>
-            <w:tcW w:type="dxa" w:w="1568"/>
-          </w:tcPr>
-          <w:p>
-            <w:r/>
-            <w:r>
-              <w:rPr>
-                <w:rFonts w:ascii="Times New Roman" w:hAnsi="Times New Roman" w:eastAsia="MS Mincho"/>
-                <w:b w:val="0"/>
-                <w:i w:val="0"/>
-                <w:sz w:val="20"/>
-              </w:rPr>
-              <w:t>4.062</w:t>
-            </w:r>
-          </w:p>
-        </w:tc>
-        <w:tc>
-          <w:tcPr>
-            <w:tcW w:type="dxa" w:w="1568"/>
-          </w:tcPr>
-          <w:p>
-            <w:r/>
-            <w:r>
-              <w:rPr>
-                <w:rFonts w:ascii="Times New Roman" w:hAnsi="Times New Roman" w:eastAsia="MS Mincho"/>
-                <w:b w:val="0"/>
-                <w:i w:val="0"/>
-                <w:sz w:val="20"/>
-              </w:rPr>
-              <w:t>4.606</w:t>
-            </w:r>
-          </w:p>
-        </w:tc>
-      </w:tr>
-    </w:tbl>
-    <w:p>
-      <w:pPr>
-        <w:spacing w:after="120" w:line="360" w:lineRule="auto"/>
-        <w:ind w:firstLine="240"/>
-      </w:pPr>
-      <w:r>
-        <w:rPr>
-          <w:rFonts w:ascii="Times New Roman" w:hAnsi="Times New Roman" w:eastAsia="MS Mincho"/>
-          <w:b w:val="0"/>
-          <w:i w:val="0"/>
-          <w:sz w:val="22"/>
-        </w:rPr>
-        <w:t>Table 2. Population–capital correspondence.</w:t>
-      </w:r>
-    </w:p>
-    <w:p>
-      <w:pPr>
-        <w:spacing w:before="360" w:after="120"/>
-      </w:pPr>
-      <w:r>
-        <w:rPr>
-          <w:rFonts w:ascii="Times New Roman" w:hAnsi="Times New Roman" w:eastAsia="MS Mincho"/>
-          <w:b/>
-          <w:i w:val="0"/>
-          <w:sz w:val="22"/>
-        </w:rPr>
-        <w:t>Table 2.</w:t>
-      </w:r>
-      <w:r>
-        <w:rPr>
-          <w:rFonts w:ascii="Times New Roman" w:hAnsi="Times New Roman" w:eastAsia="MS Mincho"/>
-          <w:b w:val="0"/>
-          <w:i w:val="0"/>
-          <w:sz w:val="22"/>
-        </w:rPr>
-        <w:t xml:space="preserve">  Population-capital tempo correspondence.</w:t>
-      </w:r>
-    </w:p>
-    <w:tbl>
-      <w:tblPr>
-        <w:tblStyle w:val="TableGrid"/>
-        <w:tblW w:type="auto" w:w="0"/>
-        <w:tblLook w:firstColumn="1" w:firstRow="1" w:lastColumn="0" w:lastRow="0" w:noHBand="0" w:noVBand="1" w:val="04A0"/>
-      </w:tblPr>
-      <w:tblGrid>
-        <w:gridCol w:w="3135"/>
-        <w:gridCol w:w="3135"/>
-        <w:gridCol w:w="3135"/>
-      </w:tblGrid>
-      <w:tr>
-        <w:tc>
-          <w:tcPr>
-            <w:tcW w:type="dxa" w:w="1872"/>
-          </w:tcPr>
-          <w:p>
-            <w:r/>
-            <w:r>
-              <w:rPr>
-                <w:rFonts w:ascii="Times New Roman" w:hAnsi="Times New Roman" w:eastAsia="MS Mincho"/>
-                <w:b/>
-                <w:i w:val="0"/>
-                <w:sz w:val="20"/>
-              </w:rPr>
-              <w:t>Concept</w:t>
-            </w:r>
-          </w:p>
-        </w:tc>
-        <w:tc>
-          <w:tcPr>
-            <w:tcW w:type="dxa" w:w="3600"/>
-          </w:tcPr>
-          <w:p>
-            <w:r/>
-            <w:r>
-              <w:rPr>
-                <w:rFonts w:ascii="Times New Roman" w:hAnsi="Times New Roman" w:eastAsia="MS Mincho"/>
-                <w:b/>
-                <w:i w:val="0"/>
-                <w:sz w:val="20"/>
-              </w:rPr>
-              <w:t>Population (Bongaarts-Feeney, 1998)</w:t>
-            </w:r>
-          </w:p>
-        </w:tc>
-        <w:tc>
-          <w:tcPr>
-            <w:tcW w:type="dxa" w:w="3600"/>
-          </w:tcPr>
-          <w:p>
-            <w:r/>
-            <w:r>
-              <w:rPr>
-                <w:rFonts w:ascii="Times New Roman" w:hAnsi="Times New Roman" w:eastAsia="MS Mincho"/>
-                <w:b/>
-                <w:i w:val="0"/>
-                <w:sz w:val="20"/>
-              </w:rPr>
-              <w:t>Capital (this paper)</w:t>
-            </w:r>
-          </w:p>
-        </w:tc>
-      </w:tr>
-      <w:tr>
-        <w:tc>
-          <w:tcPr>
-            <w:tcW w:type="dxa" w:w="1872"/>
-          </w:tcPr>
-          <w:p>
-            <w:r/>
-            <w:r>
-              <w:rPr>
-                <w:rFonts w:ascii="Times New Roman" w:hAnsi="Times New Roman" w:eastAsia="MS Mincho"/>
-                <w:b w:val="0"/>
-                <w:i w:val="0"/>
-                <w:sz w:val="20"/>
-              </w:rPr>
-              <w:t>Flow</w:t>
-            </w:r>
-          </w:p>
-        </w:tc>
-        <w:tc>
-          <w:tcPr>
-            <w:tcW w:type="dxa" w:w="3600"/>
-          </w:tcPr>
-          <w:p>
-            <w:r/>
-            <w:r>
-              <w:rPr>
-                <w:rFonts w:ascii="Times New Roman" w:hAnsi="Times New Roman" w:eastAsia="MS Mincho"/>
-                <w:b w:val="0"/>
-                <w:i w:val="0"/>
-                <w:sz w:val="20"/>
-              </w:rPr>
-              <w:t>Births $B(t)$</w:t>
-            </w:r>
-          </w:p>
-        </w:tc>
-        <w:tc>
-          <w:tcPr>
-            <w:tcW w:type="dxa" w:w="3600"/>
-          </w:tcPr>
-          <w:p>
-            <w:r/>
-            <w:r>
-              <w:rPr>
-                <w:rFonts w:ascii="Times New Roman" w:hAnsi="Times New Roman" w:eastAsia="MS Mincho"/>
-                <w:b w:val="0"/>
-                <w:i w:val="0"/>
-                <w:sz w:val="20"/>
-              </w:rPr>
-              <w:t>Investment $I(t)$</w:t>
-            </w:r>
-          </w:p>
-        </w:tc>
-      </w:tr>
-      <w:tr>
-        <w:tc>
-          <w:tcPr>
-            <w:tcW w:type="dxa" w:w="1872"/>
-          </w:tcPr>
-          <w:p>
-            <w:r/>
-            <w:r>
-              <w:rPr>
-                <w:rFonts w:ascii="Times New Roman" w:hAnsi="Times New Roman" w:eastAsia="MS Mincho"/>
-                <w:b w:val="0"/>
-                <w:i w:val="0"/>
-                <w:sz w:val="20"/>
-              </w:rPr>
-              <w:t>Stock</w:t>
-            </w:r>
-          </w:p>
-        </w:tc>
-        <w:tc>
-          <w:tcPr>
-            <w:tcW w:type="dxa" w:w="3600"/>
-          </w:tcPr>
-          <w:p>
-            <w:r/>
-            <w:r>
-              <w:rPr>
-                <w:rFonts w:ascii="Times New Roman" w:hAnsi="Times New Roman" w:eastAsia="MS Mincho"/>
-                <w:b w:val="0"/>
-                <w:i w:val="0"/>
-                <w:sz w:val="20"/>
-              </w:rPr>
-              <w:t>Population $N(t)$</w:t>
-            </w:r>
-          </w:p>
-        </w:tc>
-        <w:tc>
-          <w:tcPr>
-            <w:tcW w:type="dxa" w:w="3600"/>
-          </w:tcPr>
-          <w:p>
-            <w:r/>
-            <w:r>
-              <w:rPr>
-                <w:rFonts w:ascii="Times New Roman" w:hAnsi="Times New Roman" w:eastAsia="MS Mincho"/>
-                <w:b w:val="0"/>
-                <w:i w:val="0"/>
-                <w:sz w:val="20"/>
-              </w:rPr>
-              <w:t>Reproducible capital $W(t)$</w:t>
-            </w:r>
-          </w:p>
-        </w:tc>
-      </w:tr>
-      <w:tr>
-        <w:tc>
-          <w:tcPr>
-            <w:tcW w:type="dxa" w:w="1872"/>
-          </w:tcPr>
-          <w:p>
-            <w:r/>
-            <w:r>
-              <w:rPr>
-                <w:rFonts w:ascii="Times New Roman" w:hAnsi="Times New Roman" w:eastAsia="MS Mincho"/>
-                <w:b w:val="0"/>
-                <w:i w:val="0"/>
-                <w:sz w:val="20"/>
-              </w:rPr>
-              <w:t>Quantum</w:t>
-            </w:r>
-          </w:p>
-        </w:tc>
-        <w:tc>
-          <w:tcPr>
-            <w:tcW w:type="dxa" w:w="3600"/>
-          </w:tcPr>
-          <w:p>
-            <w:r/>
-            <w:r>
-              <w:rPr>
-                <w:rFonts w:ascii="Times New Roman" w:hAnsi="Times New Roman" w:eastAsia="MS Mincho"/>
-                <w:b w:val="0"/>
-                <w:i w:val="0"/>
-                <w:sz w:val="20"/>
-              </w:rPr>
-              <w:t>Total Fertility Rate $TFR$</w:t>
-            </w:r>
-          </w:p>
-        </w:tc>
-        <w:tc>
-          <w:tcPr>
-            <w:tcW w:type="dxa" w:w="3600"/>
-          </w:tcPr>
-          <w:p>
-            <w:r/>
-            <w:r>
-              <w:rPr>
-                <w:rFonts w:ascii="Times New Roman" w:hAnsi="Times New Roman" w:eastAsia="MS Mincho"/>
-                <w:b w:val="0"/>
-                <w:i w:val="0"/>
-                <w:sz w:val="20"/>
-              </w:rPr>
-              <w:t>Investment rate $I/Y$</w:t>
-            </w:r>
-          </w:p>
-        </w:tc>
-      </w:tr>
-      <w:tr>
-        <w:tc>
-          <w:tcPr>
-            <w:tcW w:type="dxa" w:w="1872"/>
-          </w:tcPr>
-          <w:p>
-            <w:r/>
-            <w:r>
-              <w:rPr>
-                <w:rFonts w:ascii="Times New Roman" w:hAnsi="Times New Roman" w:eastAsia="MS Mincho"/>
-                <w:b w:val="0"/>
-                <w:i w:val="0"/>
-                <w:sz w:val="20"/>
-              </w:rPr>
-              <w:t>Tempo</w:t>
-            </w:r>
-          </w:p>
-        </w:tc>
-        <w:tc>
-          <w:tcPr>
-            <w:tcW w:type="dxa" w:w="3600"/>
-          </w:tcPr>
-          <w:p>
-            <w:r/>
-            <w:r>
-              <w:rPr>
-                <w:rFonts w:ascii="Times New Roman" w:hAnsi="Times New Roman" w:eastAsia="MS Mincho"/>
-                <w:b w:val="0"/>
-                <w:i w:val="0"/>
-                <w:sz w:val="20"/>
-              </w:rPr>
-              <w:t>Mean age at childbearing $MAC(t)$</w:t>
-            </w:r>
-          </w:p>
-        </w:tc>
-        <w:tc>
-          <w:tcPr>
-            <w:tcW w:type="dxa" w:w="3600"/>
-          </w:tcPr>
-          <w:p>
-            <w:r/>
-            <w:r>
-              <w:rPr>
-                <w:rFonts w:ascii="Times New Roman" w:hAnsi="Times New Roman" w:eastAsia="MS Mincho"/>
-                <w:b w:val="0"/>
-                <w:i w:val="0"/>
-                <w:sz w:val="20"/>
-              </w:rPr>
-              <w:t>Time-to-build $\mu(t)$</w:t>
-            </w:r>
-          </w:p>
-        </w:tc>
-      </w:tr>
-      <w:tr>
-        <w:tc>
-          <w:tcPr>
-            <w:tcW w:type="dxa" w:w="1872"/>
-          </w:tcPr>
-          <w:p>
-            <w:r/>
-            <w:r>
-              <w:rPr>
-                <w:rFonts w:ascii="Times New Roman" w:hAnsi="Times New Roman" w:eastAsia="MS Mincho"/>
-                <w:b w:val="0"/>
-                <w:i w:val="0"/>
-                <w:sz w:val="20"/>
-              </w:rPr>
-              <w:t>Bongaarts-Feeney adjustment</w:t>
-            </w:r>
-          </w:p>
-        </w:tc>
-        <w:tc>
-          <w:tcPr>
-            <w:tcW w:type="dxa" w:w="3600"/>
-          </w:tcPr>
-          <w:p>
-            <w:r/>
-            <w:r>
-              <w:rPr>
-                <w:rFonts w:ascii="Times New Roman" w:hAnsi="Times New Roman" w:eastAsia="MS Mincho"/>
-                <w:b w:val="0"/>
-                <w:i w:val="0"/>
-                <w:sz w:val="20"/>
-              </w:rPr>
-              <w:t>$TFR^\ast=TFR/(1-r(t))$</w:t>
-            </w:r>
-          </w:p>
-        </w:tc>
-        <w:tc>
-          <w:tcPr>
-            <w:tcW w:type="dxa" w:w="3600"/>
-          </w:tcPr>
-          <w:p>
-            <w:r/>
-            <w:r>
-              <w:rPr>
-                <w:rFonts w:ascii="Times New Roman" w:hAnsi="Times New Roman" w:eastAsia="MS Mincho"/>
-                <w:b w:val="0"/>
-                <w:i w:val="0"/>
-                <w:sz w:val="20"/>
-              </w:rPr>
-              <w:t>$K^\ast(t)$ via $\mu(t)$-weighted PIM</w:t>
-            </w:r>
-          </w:p>
-        </w:tc>
-      </w:tr>
-      <w:tr>
-        <w:tc>
-          <w:tcPr>
-            <w:tcW w:type="dxa" w:w="1872"/>
-          </w:tcPr>
-          <w:p>
-            <w:r/>
-            <w:r>
-              <w:rPr>
-                <w:rFonts w:ascii="Times New Roman" w:hAnsi="Times New Roman" w:eastAsia="MS Mincho"/>
-                <w:b w:val="0"/>
-                <w:i w:val="0"/>
-                <w:sz w:val="20"/>
-              </w:rPr>
-              <w:t>Forgotten parameter</w:t>
-            </w:r>
-          </w:p>
-        </w:tc>
-        <w:tc>
-          <w:tcPr>
-            <w:tcW w:type="dxa" w:w="3600"/>
-          </w:tcPr>
-          <w:p>
-            <w:r/>
-            <w:r>
-              <w:rPr>
-                <w:rFonts w:ascii="Times New Roman" w:hAnsi="Times New Roman" w:eastAsia="MS Mincho"/>
-                <w:b w:val="0"/>
-                <w:i w:val="0"/>
-                <w:sz w:val="20"/>
-              </w:rPr>
-              <w:t>Parity-specific $\sigma$ (Goldstein-Lutz-Scherbov, 2003)</w:t>
-            </w:r>
-          </w:p>
-        </w:tc>
-        <w:tc>
-          <w:tcPr>
-            <w:tcW w:type="dxa" w:w="3600"/>
-          </w:tcPr>
-          <w:p>
-            <w:r/>
-            <w:r>
-              <w:rPr>
-                <w:rFonts w:ascii="Times New Roman" w:hAnsi="Times New Roman" w:eastAsia="MS Mincho"/>
-                <w:b w:val="0"/>
-                <w:i w:val="0"/>
-                <w:sz w:val="20"/>
-              </w:rPr>
-              <w:t>Intangible share $\beta$ (Corrado-Hulten-Sichel, 2009)</w:t>
-            </w:r>
-          </w:p>
-        </w:tc>
-      </w:tr>
-      <w:tr>
-        <w:tc>
-          <w:tcPr>
-            <w:tcW w:type="dxa" w:w="1872"/>
-          </w:tcPr>
-          <w:p>
-            <w:r/>
-            <w:r>
-              <w:rPr>
-                <w:rFonts w:ascii="Times New Roman" w:hAnsi="Times New Roman" w:eastAsia="MS Mincho"/>
-                <w:b w:val="0"/>
-                <w:i w:val="0"/>
-                <w:sz w:val="20"/>
-              </w:rPr>
-              <w:t>Book-keeping identity</w:t>
-            </w:r>
-          </w:p>
-        </w:tc>
-        <w:tc>
-          <w:tcPr>
-            <w:tcW w:type="dxa" w:w="3600"/>
-          </w:tcPr>
-          <w:p>
-            <w:r/>
-            <w:r>
-              <w:rPr>
-                <w:rFonts w:ascii="Times New Roman" w:hAnsi="Times New Roman" w:eastAsia="MS Mincho"/>
-                <w:b w:val="0"/>
-                <w:i w:val="0"/>
-                <w:sz w:val="20"/>
-              </w:rPr>
-              <w:t>$dN/dt = B - d\cdot N$</w:t>
-            </w:r>
-          </w:p>
-        </w:tc>
-        <w:tc>
-          <w:tcPr>
-            <w:tcW w:type="dxa" w:w="3600"/>
-          </w:tcPr>
-          <w:p>
-            <w:r/>
-            <w:r>
-              <w:rPr>
-                <w:rFonts w:ascii="Times New Roman" w:hAnsi="Times New Roman" w:eastAsia="MS Mincho"/>
-                <w:b w:val="0"/>
-                <w:i w:val="0"/>
-                <w:sz w:val="20"/>
-              </w:rPr>
-              <w:t>$dW/dt = I - \delta W$</w:t>
-            </w:r>
-          </w:p>
-        </w:tc>
-      </w:tr>
-      <w:tr>
-        <w:tc>
-          <w:tcPr>
-            <w:tcW w:type="dxa" w:w="1872"/>
-          </w:tcPr>
-          <w:p>
-            <w:r/>
-            <w:r>
-              <w:rPr>
-                <w:rFonts w:ascii="Times New Roman" w:hAnsi="Times New Roman" w:eastAsia="MS Mincho"/>
-                <w:b w:val="0"/>
-                <w:i w:val="0"/>
-                <w:sz w:val="20"/>
-              </w:rPr>
-              <w:t>Joint identification</w:t>
-            </w:r>
-          </w:p>
-        </w:tc>
-        <w:tc>
-          <w:tcPr>
-            <w:tcW w:type="dxa" w:w="3600"/>
-          </w:tcPr>
-          <w:p>
-            <w:r/>
-            <w:r>
-              <w:rPr>
-                <w:rFonts w:ascii="Times New Roman" w:hAnsi="Times New Roman" w:eastAsia="MS Mincho"/>
-                <w:b w:val="0"/>
-                <w:i w:val="0"/>
-                <w:sz w:val="20"/>
-              </w:rPr>
-              <w:t>TFR* vs. life-table consistency</w:t>
-            </w:r>
-          </w:p>
-        </w:tc>
-        <w:tc>
-          <w:tcPr>
-            <w:tcW w:type="dxa" w:w="3600"/>
-          </w:tcPr>
-          <w:p>
-            <w:r/>
-            <w:r>
-              <w:rPr>
-                <w:rFonts w:ascii="Times New Roman" w:hAnsi="Times New Roman" w:eastAsia="MS Mincho"/>
-                <w:b w:val="0"/>
-                <w:i w:val="0"/>
-                <w:sz w:val="20"/>
-              </w:rPr>
-              <w:t>PIM vs. CWON consistency</w:t>
-            </w:r>
-          </w:p>
-        </w:tc>
-      </w:tr>
-    </w:tbl>
-    <w:p>
-      <w:pPr>
-        <w:spacing w:before="240" w:after="120"/>
-      </w:pPr>
-      <w:r>
-        <w:rPr>
-          <w:rFonts w:ascii="Times New Roman" w:hAnsi="Times New Roman" w:eastAsia="MS Mincho"/>
-          <w:b/>
-          <w:i w:val="0"/>
-          <w:sz w:val="26"/>
-        </w:rPr>
         <w:t>References</w:t>
       </w:r>
     </w:p>
     <w:p>
       <w:pPr>
-        <w:spacing w:after="120" w:line="360" w:lineRule="auto"/>
-        <w:ind w:firstLine="240"/>
+        <w:spacing w:after="120" w:before="0" w:line="360" w:lineRule="auto"/>
       </w:pPr>
       <w:r>
         <w:rPr>
@@ -3737,8 +2145,7 @@
     </w:p>
     <w:p>
       <w:pPr>
-        <w:spacing w:after="120" w:line="360" w:lineRule="auto"/>
-        <w:ind w:firstLine="240"/>
+        <w:spacing w:after="120" w:before="0" w:line="360" w:lineRule="auto"/>
       </w:pPr>
       <w:r>
         <w:rPr>
@@ -3752,8 +2159,7 @@
     </w:p>
     <w:p>
       <w:pPr>
-        <w:spacing w:after="120" w:line="360" w:lineRule="auto"/>
-        <w:ind w:firstLine="240"/>
+        <w:spacing w:after="120" w:before="0" w:line="360" w:lineRule="auto"/>
       </w:pPr>
       <w:r>
         <w:rPr>
@@ -3767,8 +2173,7 @@
     </w:p>
     <w:p>
       <w:pPr>
-        <w:spacing w:after="120" w:line="360" w:lineRule="auto"/>
-        <w:ind w:firstLine="240"/>
+        <w:spacing w:after="120" w:before="0" w:line="360" w:lineRule="auto"/>
       </w:pPr>
       <w:r>
         <w:rPr>
@@ -3782,8 +2187,21 @@
     </w:p>
     <w:p>
       <w:pPr>
-        <w:spacing w:after="120" w:line="360" w:lineRule="auto"/>
-        <w:ind w:firstLine="240"/>
+        <w:spacing w:after="120" w:before="0" w:line="360" w:lineRule="auto"/>
+      </w:pPr>
+      <w:r>
+        <w:rPr>
+          <w:rFonts w:ascii="Times New Roman" w:hAnsi="Times New Roman" w:eastAsia="MS Mincho"/>
+          <w:b w:val="0"/>
+          <w:i w:val="0"/>
+          <w:sz w:val="22"/>
+        </w:rPr>
+        <w:t>Christiano, L. J. and R. M. Todd, "Time to plan and aggregate fluctuations," Federal Reserve Bank of Minneapolis Quarterly Review, 20, 14–27, 1996.</w:t>
+      </w:r>
+    </w:p>
+    <w:p>
+      <w:pPr>
+        <w:spacing w:after="120" w:before="0" w:line="360" w:lineRule="auto"/>
       </w:pPr>
       <w:r>
         <w:rPr>
@@ -3797,8 +2215,7 @@
     </w:p>
     <w:p>
       <w:pPr>
-        <w:spacing w:after="120" w:line="360" w:lineRule="auto"/>
-        <w:ind w:firstLine="240"/>
+        <w:spacing w:after="120" w:before="0" w:line="360" w:lineRule="auto"/>
       </w:pPr>
       <w:r>
         <w:rPr>
@@ -3812,8 +2229,7 @@
     </w:p>
     <w:p>
       <w:pPr>
-        <w:spacing w:after="120" w:line="360" w:lineRule="auto"/>
-        <w:ind w:firstLine="240"/>
+        <w:spacing w:after="120" w:before="0" w:line="360" w:lineRule="auto"/>
       </w:pPr>
       <w:r>
         <w:rPr>
@@ -3827,8 +2243,7 @@
     </w:p>
     <w:p>
       <w:pPr>
-        <w:spacing w:after="120" w:line="360" w:lineRule="auto"/>
-        <w:ind w:firstLine="240"/>
+        <w:spacing w:after="120" w:before="0" w:line="360" w:lineRule="auto"/>
       </w:pPr>
       <w:r>
         <w:rPr>
@@ -3842,23 +2257,7 @@
     </w:p>
     <w:p>
       <w:pPr>
-        <w:spacing w:after="120" w:line="360" w:lineRule="auto"/>
-        <w:ind w:firstLine="240"/>
-      </w:pPr>
-      <w:r>
-        <w:rPr>
-          <w:rFonts w:ascii="Times New Roman" w:hAnsi="Times New Roman" w:eastAsia="MS Mincho"/>
-          <w:b w:val="0"/>
-          <w:i w:val="0"/>
-          <w:sz w:val="22"/>
-        </w:rPr>
-        <w:t>Christiano, L. J. and R. M. Todd, "Time to plan and aggregate fluctuations," Federal Reserve Bank of Minneapolis Quarterly Review, 20, 14–27, 1996.</w:t>
-      </w:r>
-    </w:p>
-    <w:p>
-      <w:pPr>
-        <w:spacing w:after="120" w:line="360" w:lineRule="auto"/>
-        <w:ind w:firstLine="240"/>
+        <w:spacing w:after="120" w:before="0" w:line="360" w:lineRule="auto"/>
       </w:pPr>
       <w:r>
         <w:rPr>
@@ -3872,8 +2271,7 @@
     </w:p>
     <w:p>
       <w:pPr>
-        <w:spacing w:after="120" w:line="360" w:lineRule="auto"/>
-        <w:ind w:firstLine="240"/>
+        <w:spacing w:after="120" w:before="0" w:line="360" w:lineRule="auto"/>
       </w:pPr>
       <w:r>
         <w:rPr>
@@ -3887,8 +2285,7 @@
     </w:p>
     <w:p>
       <w:pPr>
-        <w:spacing w:after="120" w:line="360" w:lineRule="auto"/>
-        <w:ind w:firstLine="240"/>
+        <w:spacing w:after="120" w:before="0" w:line="360" w:lineRule="auto"/>
       </w:pPr>
       <w:r>
         <w:rPr>
@@ -3902,8 +2299,7 @@
     </w:p>
     <w:p>
       <w:pPr>
-        <w:spacing w:after="120" w:line="360" w:lineRule="auto"/>
-        <w:ind w:firstLine="240"/>
+        <w:spacing w:after="120" w:before="0" w:line="360" w:lineRule="auto"/>
       </w:pPr>
       <w:r>
         <w:rPr>
@@ -3917,8 +2313,7 @@
     </w:p>
     <w:p>
       <w:pPr>
-        <w:spacing w:after="120" w:line="360" w:lineRule="auto"/>
-        <w:ind w:firstLine="240"/>
+        <w:spacing w:after="120" w:before="0" w:line="360" w:lineRule="auto"/>
       </w:pPr>
       <w:r>
         <w:rPr>
@@ -3932,8 +2327,7 @@
     </w:p>
     <w:p>
       <w:pPr>
-        <w:spacing w:after="120" w:line="360" w:lineRule="auto"/>
-        <w:ind w:firstLine="240"/>
+        <w:spacing w:after="120" w:before="0" w:line="360" w:lineRule="auto"/>
       </w:pPr>
       <w:r>
         <w:rPr>
@@ -3947,8 +2341,7 @@
     </w:p>
     <w:p>
       <w:pPr>
-        <w:spacing w:after="120" w:line="360" w:lineRule="auto"/>
-        <w:ind w:firstLine="240"/>
+        <w:spacing w:after="120" w:before="0" w:line="360" w:lineRule="auto"/>
       </w:pPr>
       <w:r>
         <w:rPr>
@@ -3962,8 +2355,7 @@
     </w:p>
     <w:p>
       <w:pPr>
-        <w:spacing w:after="120" w:line="360" w:lineRule="auto"/>
-        <w:ind w:firstLine="240"/>
+        <w:spacing w:after="120" w:before="0" w:line="360" w:lineRule="auto"/>
       </w:pPr>
       <w:r>
         <w:rPr>
@@ -3977,8 +2369,7 @@
     </w:p>
     <w:p>
       <w:pPr>
-        <w:spacing w:after="120" w:line="360" w:lineRule="auto"/>
-        <w:ind w:firstLine="240"/>
+        <w:spacing w:after="120" w:before="0" w:line="360" w:lineRule="auto"/>
       </w:pPr>
       <w:r>
         <w:rPr>
@@ -3992,8 +2383,7 @@
     </w:p>
     <w:p>
       <w:pPr>
-        <w:spacing w:after="120" w:line="360" w:lineRule="auto"/>
-        <w:ind w:firstLine="240"/>
+        <w:spacing w:after="120" w:before="0" w:line="360" w:lineRule="auto"/>
       </w:pPr>
       <w:r>
         <w:rPr>
@@ -4007,8 +2397,7 @@
     </w:p>
     <w:p>
       <w:pPr>
-        <w:spacing w:after="120" w:line="360" w:lineRule="auto"/>
-        <w:ind w:firstLine="240"/>
+        <w:spacing w:after="120" w:before="0" w:line="360" w:lineRule="auto"/>
       </w:pPr>
       <w:r>
         <w:rPr>
@@ -4022,8 +2411,21 @@
     </w:p>
     <w:p>
       <w:pPr>
-        <w:spacing w:after="120" w:line="360" w:lineRule="auto"/>
-        <w:ind w:firstLine="240"/>
+        <w:spacing w:after="120" w:before="0" w:line="360" w:lineRule="auto"/>
+      </w:pPr>
+      <w:r>
+        <w:rPr>
+          <w:rFonts w:ascii="Times New Roman" w:hAnsi="Times New Roman" w:eastAsia="MS Mincho"/>
+          <w:b w:val="0"/>
+          <w:i w:val="0"/>
+          <w:sz w:val="22"/>
+        </w:rPr>
+        <w:t>Jorgenson, D. W., "The economic theory of replacement and depreciation," in W. Sellekaerts, ed., Econometrics and Economic Theory: Essays in Honour of Jan Tinbergen, Macmillan, London, 189–221, 1973.</w:t>
+      </w:r>
+    </w:p>
+    <w:p>
+      <w:pPr>
+        <w:spacing w:after="120" w:before="0" w:line="360" w:lineRule="auto"/>
       </w:pPr>
       <w:r>
         <w:rPr>
@@ -4037,8 +2439,7 @@
     </w:p>
     <w:p>
       <w:pPr>
-        <w:spacing w:after="120" w:line="360" w:lineRule="auto"/>
-        <w:ind w:firstLine="240"/>
+        <w:spacing w:after="120" w:before="0" w:line="360" w:lineRule="auto"/>
       </w:pPr>
       <w:r>
         <w:rPr>
@@ -4052,8 +2453,7 @@
     </w:p>
     <w:p>
       <w:pPr>
-        <w:spacing w:after="120" w:line="360" w:lineRule="auto"/>
-        <w:ind w:firstLine="240"/>
+        <w:spacing w:after="120" w:before="0" w:line="360" w:lineRule="auto"/>
       </w:pPr>
       <w:r>
         <w:rPr>
@@ -4067,8 +2467,7 @@
     </w:p>
     <w:p>
       <w:pPr>
-        <w:spacing w:after="120" w:line="360" w:lineRule="auto"/>
-        <w:ind w:firstLine="240"/>
+        <w:spacing w:after="120" w:before="0" w:line="360" w:lineRule="auto"/>
       </w:pPr>
       <w:r>
         <w:rPr>
@@ -4082,8 +2481,7 @@
     </w:p>
     <w:p>
       <w:pPr>
-        <w:spacing w:after="120" w:line="360" w:lineRule="auto"/>
-        <w:ind w:firstLine="240"/>
+        <w:spacing w:after="120" w:before="0" w:line="360" w:lineRule="auto"/>
       </w:pPr>
       <w:r>
         <w:rPr>
@@ -4097,8 +2495,7 @@
     </w:p>
     <w:p>
       <w:pPr>
-        <w:spacing w:after="120" w:line="360" w:lineRule="auto"/>
-        <w:ind w:firstLine="240"/>
+        <w:spacing w:after="120" w:before="0" w:line="360" w:lineRule="auto"/>
       </w:pPr>
       <w:r>
         <w:rPr>
@@ -4112,8 +2509,7 @@
     </w:p>
     <w:p>
       <w:pPr>
-        <w:spacing w:after="120" w:line="360" w:lineRule="auto"/>
-        <w:ind w:firstLine="240"/>
+        <w:spacing w:after="120" w:before="0" w:line="360" w:lineRule="auto"/>
       </w:pPr>
       <w:r>
         <w:rPr>
@@ -4127,8 +2523,7 @@
     </w:p>
     <w:p>
       <w:pPr>
-        <w:spacing w:after="120" w:line="360" w:lineRule="auto"/>
-        <w:ind w:firstLine="240"/>
+        <w:spacing w:after="120" w:before="0" w:line="360" w:lineRule="auto"/>
       </w:pPr>
       <w:r>
         <w:rPr>
@@ -4142,8 +2537,7 @@
     </w:p>
     <w:p>
       <w:pPr>
-        <w:spacing w:after="120" w:line="360" w:lineRule="auto"/>
-        <w:ind w:firstLine="240"/>
+        <w:spacing w:after="120" w:before="0" w:line="360" w:lineRule="auto"/>
       </w:pPr>
       <w:r>
         <w:rPr>
@@ -4157,8 +2551,7 @@
     </w:p>
     <w:p>
       <w:pPr>
-        <w:spacing w:after="120" w:line="360" w:lineRule="auto"/>
-        <w:ind w:firstLine="240"/>
+        <w:spacing w:after="120" w:before="0" w:line="360" w:lineRule="auto"/>
       </w:pPr>
       <w:r>
         <w:rPr>
@@ -4172,8 +2565,7 @@
     </w:p>
     <w:p>
       <w:pPr>
-        <w:spacing w:after="120" w:line="360" w:lineRule="auto"/>
-        <w:ind w:firstLine="240"/>
+        <w:spacing w:after="120" w:before="0" w:line="360" w:lineRule="auto"/>
       </w:pPr>
       <w:r>
         <w:rPr>
@@ -4187,8 +2579,21 @@
     </w:p>
     <w:p>
       <w:pPr>
-        <w:spacing w:after="120" w:line="360" w:lineRule="auto"/>
-        <w:ind w:firstLine="240"/>
+        <w:spacing w:after="120" w:before="0" w:line="360" w:lineRule="auto"/>
+      </w:pPr>
+      <w:r>
+        <w:rPr>
+          <w:rFonts w:ascii="Times New Roman" w:hAnsi="Times New Roman" w:eastAsia="MS Mincho"/>
+          <w:b w:val="0"/>
+          <w:i w:val="0"/>
+          <w:sz w:val="22"/>
+        </w:rPr>
+        <w:t>OECD, Measuring Capital: OECD Manual 2009, 2nd ed., OECD Publishing, Paris, 2009.</w:t>
+      </w:r>
+    </w:p>
+    <w:p>
+      <w:pPr>
+        <w:spacing w:after="120" w:before="0" w:line="360" w:lineRule="auto"/>
       </w:pPr>
       <w:r>
         <w:rPr>
@@ -4202,8 +2607,7 @@
     </w:p>
     <w:p>
       <w:pPr>
-        <w:spacing w:after="120" w:line="360" w:lineRule="auto"/>
-        <w:ind w:firstLine="240"/>
+        <w:spacing w:after="120" w:before="0" w:line="360" w:lineRule="auto"/>
       </w:pPr>
       <w:r>
         <w:rPr>
@@ -4217,8 +2621,7 @@
     </w:p>
     <w:p>
       <w:pPr>
-        <w:spacing w:after="120" w:line="360" w:lineRule="auto"/>
-        <w:ind w:firstLine="240"/>
+        <w:spacing w:after="120" w:before="0" w:line="360" w:lineRule="auto"/>
       </w:pPr>
       <w:r>
         <w:rPr>
@@ -4232,8 +2635,7 @@
     </w:p>
     <w:p>
       <w:pPr>
-        <w:spacing w:after="120" w:line="360" w:lineRule="auto"/>
-        <w:ind w:firstLine="240"/>
+        <w:spacing w:after="120" w:before="0" w:line="360" w:lineRule="auto"/>
       </w:pPr>
       <w:r>
         <w:rPr>
@@ -4247,8 +2649,7 @@
     </w:p>
     <w:p>
       <w:pPr>
-        <w:spacing w:after="120" w:line="360" w:lineRule="auto"/>
-        <w:ind w:firstLine="240"/>
+        <w:spacing w:after="120" w:before="0" w:line="360" w:lineRule="auto"/>
       </w:pPr>
       <w:r>
         <w:rPr>
@@ -4262,8 +2663,21 @@
     </w:p>
     <w:p>
       <w:pPr>
-        <w:spacing w:after="120" w:line="360" w:lineRule="auto"/>
-        <w:ind w:firstLine="240"/>
+        <w:spacing w:after="120" w:before="0" w:line="360" w:lineRule="auto"/>
+      </w:pPr>
+      <w:r>
+        <w:rPr>
+          <w:rFonts w:ascii="Times New Roman" w:hAnsi="Times New Roman" w:eastAsia="MS Mincho"/>
+          <w:b w:val="0"/>
+          <w:i w:val="0"/>
+          <w:sz w:val="22"/>
+        </w:rPr>
+        <w:t>Solow, R. M., "Investment and technical progress," in K. J. Arrow, S. Karlin, and P. Suppes, eds., Mathematical Methods in the Social Sciences, Stanford University Press, Stanford, 89–104, 1960.</w:t>
+      </w:r>
+    </w:p>
+    <w:p>
+      <w:pPr>
+        <w:spacing w:after="120" w:before="0" w:line="360" w:lineRule="auto"/>
       </w:pPr>
       <w:r>
         <w:rPr>
@@ -4277,8 +2691,7 @@
     </w:p>
     <w:p>
       <w:pPr>
-        <w:spacing w:after="120" w:line="360" w:lineRule="auto"/>
-        <w:ind w:firstLine="240"/>
+        <w:spacing w:after="120" w:before="0" w:line="360" w:lineRule="auto"/>
       </w:pPr>
       <w:r>
         <w:rPr>

</xml_diff>